<commit_message>
Agregar descripcion y fuente a las 35 tablas del documento
</commit_message>
<xml_diff>
--- a/SARQUE_jose_actualizado.docx
+++ b/SARQUE_jose_actualizado.docx
@@ -5560,6 +5560,19 @@
     </w:p>
     <w:p>
       <w:pPr>
+        <w:jc w:val="justify"/>
+        <w:spacing w:before="120" w:after="120"/>
+      </w:pPr>
+      <w:r>
+        <w:rPr>
+          <w:rFonts w:ascii="Times New Roman" w:hAnsi="Times New Roman"/>
+          <w:sz w:val="22"/>
+        </w:rPr>
+        <w:t xml:space="preserve">A continuación se presenta el análisis de causa raíz aplicando el método de los 5 Porqués, que permite profundizar progresivamente en las causas del problema central identificado en el parque.</w:t>
+      </w:r>
+    </w:p>
+    <w:p>
+      <w:pPr>
         <w:pStyle w:val="41"/>
         <w:spacing w:line="360" w:lineRule="auto"/>
       </w:pPr>
@@ -5988,6 +6001,20 @@
         </w:tc>
       </w:tr>
     </w:tbl>
+    <w:p>
+      <w:pPr>
+        <w:jc w:val="center"/>
+        <w:spacing w:before="120" w:after="120"/>
+      </w:pPr>
+      <w:r>
+        <w:rPr>
+          <w:rFonts w:ascii="Times New Roman" w:hAnsi="Times New Roman"/>
+          <w:sz w:val="20"/>
+          <w:i/>
+        </w:rPr>
+        <w:t xml:space="preserve">Fuente: Elaboración propia, 2026.</w:t>
+      </w:r>
+    </w:p>
     <w:p>
       <w:pPr>
         <w:pStyle w:val="3"/>
@@ -6750,6 +6777,19 @@
     </w:p>
     <w:p>
       <w:pPr>
+        <w:jc w:val="justify"/>
+        <w:spacing w:before="120" w:after="120"/>
+      </w:pPr>
+      <w:r>
+        <w:rPr>
+          <w:rFonts w:ascii="Times New Roman" w:hAnsi="Times New Roman"/>
+          <w:sz w:val="22"/>
+        </w:rPr>
+        <w:t xml:space="preserve">La siguiente tabla resume las actividades ejecutadas durante la Fase 1 — Planificación de Requisitos del Desarrollo Rápido de Aplicaciones (DRA) aplicado al proyecto SARQUE.</w:t>
+      </w:r>
+    </w:p>
+    <w:p>
+      <w:pPr>
         <w:pStyle w:val="3"/>
       </w:pPr>
       <w:r>
@@ -7042,6 +7082,20 @@
     </w:tbl>
     <w:p>
       <w:pPr>
+        <w:jc w:val="center"/>
+        <w:spacing w:before="120" w:after="120"/>
+      </w:pPr>
+      <w:r>
+        <w:rPr>
+          <w:rFonts w:ascii="Times New Roman" w:hAnsi="Times New Roman"/>
+          <w:sz w:val="20"/>
+          <w:i/>
+        </w:rPr>
+        <w:t xml:space="preserve">Fuente: Elaboración propia, 2026.</w:t>
+      </w:r>
+    </w:p>
+    <w:p>
+      <w:pPr>
         <w:pStyle w:val="3"/>
       </w:pPr>
       <w:r>
@@ -7079,6 +7133,19 @@
       </w:pPr>
       <w:r>
         <w:t>En esta fase se construyeron prototipos visuales de la interfaz web y se validaron con la administración antes de codificar.</w:t>
+      </w:r>
+    </w:p>
+    <w:p>
+      <w:pPr>
+        <w:jc w:val="justify"/>
+        <w:spacing w:before="120" w:after="120"/>
+      </w:pPr>
+      <w:r>
+        <w:rPr>
+          <w:rFonts w:ascii="Times New Roman" w:hAnsi="Times New Roman"/>
+          <w:sz w:val="22"/>
+        </w:rPr>
+        <w:t xml:space="preserve">La siguiente tabla detalla las actividades realizadas en la Fase 2 — Diseño del Usuario, junto con los productos generados en cada actividad.</w:t>
       </w:r>
     </w:p>
     <w:p>
@@ -7308,6 +7375,20 @@
     </w:tbl>
     <w:p>
       <w:pPr>
+        <w:jc w:val="center"/>
+        <w:spacing w:before="120" w:after="120"/>
+      </w:pPr>
+      <w:r>
+        <w:rPr>
+          <w:rFonts w:ascii="Times New Roman" w:hAnsi="Times New Roman"/>
+          <w:sz w:val="20"/>
+          <w:i/>
+        </w:rPr>
+        <w:t xml:space="preserve">Fuente: Elaboración propia, 2026.</w:t>
+      </w:r>
+    </w:p>
+    <w:p>
+      <w:pPr>
         <w:pStyle w:val="3"/>
       </w:pPr>
       <w:r>
@@ -7375,6 +7456,19 @@
       </w:pPr>
       <w:r>
         <w:t>Esta fase implementó la plataforma web SARQUE utilizando un stack tecnológico moderno orientado a desarrollo rápido.</w:t>
+      </w:r>
+    </w:p>
+    <w:p>
+      <w:pPr>
+        <w:jc w:val="justify"/>
+        <w:spacing w:before="120" w:after="120"/>
+      </w:pPr>
+      <w:r>
+        <w:rPr>
+          <w:rFonts w:ascii="Times New Roman" w:hAnsi="Times New Roman"/>
+          <w:sz w:val="22"/>
+        </w:rPr>
+        <w:t xml:space="preserve">Se presenta el stack tecnológico seleccionado para la construcción de la plataforma web SARQUE durante la Fase 3 del DRA.</w:t>
       </w:r>
     </w:p>
     <w:p>
@@ -7714,6 +7808,33 @@
     </w:tbl>
     <w:p>
       <w:pPr>
+        <w:jc w:val="center"/>
+        <w:spacing w:before="120" w:after="120"/>
+      </w:pPr>
+      <w:r>
+        <w:rPr>
+          <w:rFonts w:ascii="Times New Roman" w:hAnsi="Times New Roman"/>
+          <w:sz w:val="20"/>
+          <w:i/>
+        </w:rPr>
+        <w:t xml:space="preserve">Fuente: Elaboración propia, 2026.</w:t>
+      </w:r>
+    </w:p>
+    <w:p>
+      <w:pPr>
+        <w:jc w:val="justify"/>
+        <w:spacing w:before="120" w:after="120"/>
+      </w:pPr>
+      <w:r>
+        <w:rPr>
+          <w:rFonts w:ascii="Times New Roman" w:hAnsi="Times New Roman"/>
+          <w:sz w:val="22"/>
+        </w:rPr>
+        <w:t xml:space="preserve">La tabla muestra los seis incrementos del desarrollo de la plataforma SARQUE entregados durante la Fase 3 (Construcción Rápida), indicando la semana en la cual se completó cada uno.</w:t>
+      </w:r>
+    </w:p>
+    <w:p>
+      <w:pPr>
         <w:pStyle w:val="3"/>
       </w:pPr>
       <w:r>
@@ -8050,6 +8171,20 @@
     </w:tbl>
     <w:p>
       <w:pPr>
+        <w:jc w:val="center"/>
+        <w:spacing w:before="120" w:after="120"/>
+      </w:pPr>
+      <w:r>
+        <w:rPr>
+          <w:rFonts w:ascii="Times New Roman" w:hAnsi="Times New Roman"/>
+          <w:sz w:val="20"/>
+          <w:i/>
+        </w:rPr>
+        <w:t xml:space="preserve">Fuente: Elaboración propia, 2026.</w:t>
+      </w:r>
+    </w:p>
+    <w:p>
+      <w:pPr>
         <w:pStyle w:val="5"/>
       </w:pPr>
       <w:bookmarkStart w:id="24" w:name="fase-4-transición-e-implementación"/>
@@ -8071,6 +8206,19 @@
       </w:pPr>
       <w:r>
         <w:t>Esta fase puso el sistema en operación real en el parque y capacitó al personal.</w:t>
+      </w:r>
+    </w:p>
+    <w:p>
+      <w:pPr>
+        <w:jc w:val="justify"/>
+        <w:spacing w:before="120" w:after="120"/>
+      </w:pPr>
+      <w:r>
+        <w:rPr>
+          <w:rFonts w:ascii="Times New Roman" w:hAnsi="Times New Roman"/>
+          <w:sz w:val="22"/>
+        </w:rPr>
+        <w:t xml:space="preserve">Esta tabla detalla las actividades realizadas durante la Fase 4 — Transición e Implementación, donde el sistema se puso en operación real en el parque.</w:t>
       </w:r>
     </w:p>
     <w:p>
@@ -8302,6 +8450,20 @@
     </w:tbl>
     <w:p>
       <w:pPr>
+        <w:jc w:val="center"/>
+        <w:spacing w:before="120" w:after="120"/>
+      </w:pPr>
+      <w:r>
+        <w:rPr>
+          <w:rFonts w:ascii="Times New Roman" w:hAnsi="Times New Roman"/>
+          <w:sz w:val="20"/>
+          <w:i/>
+        </w:rPr>
+        <w:t xml:space="preserve">Fuente: Elaboración propia, 2026.</w:t>
+      </w:r>
+    </w:p>
+    <w:p>
+      <w:pPr>
         <w:pStyle w:val="4"/>
       </w:pPr>
       <w:bookmarkStart w:id="25" w:name="ventajas-del-dra-observadas-en-sarque"/>
@@ -8402,6 +8564,19 @@
       </w:pPr>
     </w:p>
     <w:bookmarkEnd w:id="25"/>
+    <w:p>
+      <w:pPr>
+        <w:jc w:val="justify"/>
+        <w:spacing w:before="120" w:after="120"/>
+      </w:pPr>
+      <w:r>
+        <w:rPr>
+          <w:rFonts w:ascii="Times New Roman" w:hAnsi="Times New Roman"/>
+          <w:sz w:val="22"/>
+        </w:rPr>
+        <w:t xml:space="preserve">La siguiente matriz metodológica resume las cuatro fases del DRA y su aplicación específica al proyecto SARQUE, indicando la duración estimada de cada fase.</w:t>
+      </w:r>
+    </w:p>
     <w:p>
       <w:pPr>
         <w:pStyle w:val="3"/>
@@ -8955,6 +9130,20 @@
     </w:tbl>
     <w:p>
       <w:pPr>
+        <w:jc w:val="center"/>
+        <w:spacing w:before="120" w:after="120"/>
+      </w:pPr>
+      <w:r>
+        <w:rPr>
+          <w:rFonts w:ascii="Times New Roman" w:hAnsi="Times New Roman"/>
+          <w:sz w:val="20"/>
+          <w:i/>
+        </w:rPr>
+        <w:t xml:space="preserve">Fuente: Elaboración propia, 2026.</w:t>
+      </w:r>
+    </w:p>
+    <w:p>
+      <w:pPr>
         <w:pStyle w:val="5"/>
         <w:spacing w:line="360" w:lineRule="auto"/>
         <w:rPr>
@@ -8996,6 +9185,19 @@
           <w:szCs w:val="22"/>
         </w:rPr>
       </w:pPr>
+    </w:p>
+    <w:p>
+      <w:pPr>
+        <w:jc w:val="justify"/>
+        <w:spacing w:before="120" w:after="120"/>
+      </w:pPr>
+      <w:r>
+        <w:rPr>
+          <w:rFonts w:ascii="Times New Roman" w:hAnsi="Times New Roman"/>
+          <w:sz w:val="22"/>
+        </w:rPr>
+        <w:t xml:space="preserve">El cronograma de actividades detalla las semanas de ejecución del proyecto distribuidas en las fases de diagnóstico, diseño, adquisición, instalación física y desarrollo de software.</w:t>
+      </w:r>
     </w:p>
     <w:p>
       <w:pPr>
@@ -11894,6 +12096,20 @@
     </w:tbl>
     <w:p>
       <w:pPr>
+        <w:jc w:val="center"/>
+        <w:spacing w:before="120" w:after="120"/>
+      </w:pPr>
+      <w:r>
+        <w:rPr>
+          <w:rFonts w:ascii="Times New Roman" w:hAnsi="Times New Roman"/>
+          <w:sz w:val="20"/>
+          <w:i/>
+        </w:rPr>
+        <w:t xml:space="preserve">Fuente: Elaboración propia, 2026.</w:t>
+      </w:r>
+    </w:p>
+    <w:p>
+      <w:pPr>
         <w:spacing w:line="360" w:lineRule="auto"/>
         <w:contextualSpacing/>
         <w:jc w:val="center"/>
@@ -12003,6 +12219,19 @@
           <w:color w:val="auto"/>
         </w:rPr>
       </w:pPr>
+    </w:p>
+    <w:p>
+      <w:pPr>
+        <w:jc w:val="justify"/>
+        <w:spacing w:before="120" w:after="120"/>
+      </w:pPr>
+      <w:r>
+        <w:rPr>
+          <w:rFonts w:ascii="Times New Roman" w:hAnsi="Times New Roman"/>
+          <w:sz w:val="22"/>
+        </w:rPr>
+        <w:t xml:space="preserve">Cronograma temporal del proyecto SARQUE distribuido por semanas, mostrando la planificación de cada fase metodológica.</w:t>
+      </w:r>
     </w:p>
     <w:p>
       <w:pPr>
@@ -12458,6 +12687,20 @@
     </w:tbl>
     <w:p>
       <w:pPr>
+        <w:jc w:val="center"/>
+        <w:spacing w:before="120" w:after="120"/>
+      </w:pPr>
+      <w:r>
+        <w:rPr>
+          <w:rFonts w:ascii="Times New Roman" w:hAnsi="Times New Roman"/>
+          <w:sz w:val="20"/>
+          <w:i/>
+        </w:rPr>
+        <w:t xml:space="preserve">Fuente: Elaboración propia, 2026.</w:t>
+      </w:r>
+    </w:p>
+    <w:p>
+      <w:pPr>
         <w:spacing w:line="360" w:lineRule="auto"/>
         <w:rPr>
           <w:color w:val="auto"/>
@@ -15994,6 +16237,19 @@
           <w:color w:val="auto"/>
         </w:rPr>
         <w:t>No se genera ningún registro del riego realizado.</w:t>
+      </w:r>
+    </w:p>
+    <w:p>
+      <w:pPr>
+        <w:jc w:val="justify"/>
+        <w:spacing w:before="120" w:after="120"/>
+      </w:pPr>
+      <w:r>
+        <w:rPr>
+          <w:rFonts w:ascii="Times New Roman" w:hAnsi="Times New Roman"/>
+          <w:sz w:val="22"/>
+        </w:rPr>
+        <w:t xml:space="preserve">Esta tabla identifica los cinco problemas operativos principales detectados en el sistema de riego manual actual del parque, clasificados por frecuencia e impacto.</w:t>
       </w:r>
     </w:p>
     <w:p>
@@ -16531,6 +16787,20 @@
     </w:tbl>
     <w:p>
       <w:pPr>
+        <w:jc w:val="center"/>
+        <w:spacing w:before="120" w:after="120"/>
+      </w:pPr>
+      <w:r>
+        <w:rPr>
+          <w:rFonts w:ascii="Times New Roman" w:hAnsi="Times New Roman"/>
+          <w:sz w:val="20"/>
+          <w:i/>
+        </w:rPr>
+        <w:t xml:space="preserve">Fuente: Elaboración propia, 2026.</w:t>
+      </w:r>
+    </w:p>
+    <w:p>
+      <w:pPr>
         <w:pStyle w:val="5"/>
         <w:spacing w:line="360" w:lineRule="auto"/>
         <w:rPr>
@@ -16650,6 +16920,19 @@
           <w:color w:val="auto"/>
         </w:rPr>
         <w:t>Cualquier modificación del cronograma se documenta en SARQUE y se replica manualmente en los controladores BL-KR mediante la app K-RainBL.</w:t>
+      </w:r>
+    </w:p>
+    <w:p>
+      <w:pPr>
+        <w:jc w:val="justify"/>
+        <w:spacing w:before="120" w:after="120"/>
+      </w:pPr>
+      <w:r>
+        <w:rPr>
+          <w:rFonts w:ascii="Times New Roman" w:hAnsi="Times New Roman"/>
+          <w:sz w:val="22"/>
+        </w:rPr>
+        <w:t xml:space="preserve">La tabla muestra la correspondencia entre cada problema identificado en el sistema actual y la solución específica que aporta SARQUE para resolverlo.</w:t>
       </w:r>
     </w:p>
     <w:p>
@@ -16969,6 +17252,20 @@
     </w:tbl>
     <w:p>
       <w:pPr>
+        <w:jc w:val="center"/>
+        <w:spacing w:before="120" w:after="120"/>
+      </w:pPr>
+      <w:r>
+        <w:rPr>
+          <w:rFonts w:ascii="Times New Roman" w:hAnsi="Times New Roman"/>
+          <w:sz w:val="20"/>
+          <w:i/>
+        </w:rPr>
+        <w:t xml:space="preserve">Fuente: Elaboración propia, 2026.</w:t>
+      </w:r>
+    </w:p>
+    <w:p>
+      <w:pPr>
         <w:pStyle w:val="5"/>
         <w:spacing w:line="360" w:lineRule="auto"/>
         <w:rPr>
@@ -16997,6 +17294,19 @@
           <w:color w:val="auto"/>
         </w:rPr>
         <w:t>Análisis de Requerimientos</w:t>
+      </w:r>
+    </w:p>
+    <w:p>
+      <w:pPr>
+        <w:jc w:val="justify"/>
+        <w:spacing w:before="120" w:after="120"/>
+      </w:pPr>
+      <w:r>
+        <w:rPr>
+          <w:rFonts w:ascii="Times New Roman" w:hAnsi="Times New Roman"/>
+          <w:sz w:val="22"/>
+        </w:rPr>
+        <w:t xml:space="preserve">Los nueve requerimientos funcionales del sistema SARQUE se presentan agrupados por módulo, indicando qué debe hacer el sistema desde la perspectiva del usuario.</w:t>
       </w:r>
     </w:p>
     <w:p>
@@ -17680,6 +17990,33 @@
     </w:tbl>
     <w:p>
       <w:pPr>
+        <w:jc w:val="center"/>
+        <w:spacing w:before="120" w:after="120"/>
+      </w:pPr>
+      <w:r>
+        <w:rPr>
+          <w:rFonts w:ascii="Times New Roman" w:hAnsi="Times New Roman"/>
+          <w:sz w:val="20"/>
+          <w:i/>
+        </w:rPr>
+        <w:t xml:space="preserve">Fuente: Elaboración propia, 2026.</w:t>
+      </w:r>
+    </w:p>
+    <w:p>
+      <w:pPr>
+        <w:jc w:val="justify"/>
+        <w:spacing w:before="120" w:after="120"/>
+      </w:pPr>
+      <w:r>
+        <w:rPr>
+          <w:rFonts w:ascii="Times New Roman" w:hAnsi="Times New Roman"/>
+          <w:sz w:val="22"/>
+        </w:rPr>
+        <w:t xml:space="preserve">Los seis requerimientos no funcionales describen las cualidades técnicas que el sistema debe cumplir en términos de rendimiento, usabilidad, normativa y robustez.</w:t>
+      </w:r>
+    </w:p>
+    <w:p>
+      <w:pPr>
         <w:pStyle w:val="3"/>
         <w:spacing w:line="360" w:lineRule="auto"/>
         <w:rPr>
@@ -18167,6 +18504,20 @@
     </w:tbl>
     <w:p>
       <w:pPr>
+        <w:jc w:val="center"/>
+        <w:spacing w:before="120" w:after="120"/>
+      </w:pPr>
+      <w:r>
+        <w:rPr>
+          <w:rFonts w:ascii="Times New Roman" w:hAnsi="Times New Roman"/>
+          <w:sz w:val="20"/>
+          <w:i/>
+        </w:rPr>
+        <w:t xml:space="preserve">Fuente: Elaboración propia, 2026.</w:t>
+      </w:r>
+    </w:p>
+    <w:p>
+      <w:pPr>
         <w:spacing w:line="360" w:lineRule="auto"/>
         <w:rPr>
           <w:color w:val="auto"/>
@@ -18253,6 +18604,19 @@
           <w:color w:val="auto"/>
         </w:rPr>
         <w:t>Identificación y Descripción de los Actores</w:t>
+      </w:r>
+    </w:p>
+    <w:p>
+      <w:pPr>
+        <w:jc w:val="justify"/>
+        <w:spacing w:before="120" w:after="120"/>
+      </w:pPr>
+      <w:r>
+        <w:rPr>
+          <w:rFonts w:ascii="Times New Roman" w:hAnsi="Times New Roman"/>
+          <w:sz w:val="22"/>
+        </w:rPr>
+        <w:t xml:space="preserve">La siguiente tabla describe los cuatro actores que interactúan con el sistema SARQUE, su rol específico y las funciones que cada uno realiza.</w:t>
       </w:r>
     </w:p>
     <w:p>
@@ -18615,6 +18979,20 @@
       </w:tr>
       <w:bookmarkEnd w:id="67"/>
     </w:tbl>
+    <w:p>
+      <w:pPr>
+        <w:jc w:val="center"/>
+        <w:spacing w:before="120" w:after="120"/>
+      </w:pPr>
+      <w:r>
+        <w:rPr>
+          <w:rFonts w:ascii="Times New Roman" w:hAnsi="Times New Roman"/>
+          <w:sz w:val="20"/>
+          <w:i/>
+        </w:rPr>
+        <w:t xml:space="preserve">Fuente: Elaboración propia, 2026.</w:t>
+      </w:r>
+    </w:p>
     <w:p>
       <w:pPr>
         <w:pStyle w:val="5"/>
@@ -18736,6 +19114,19 @@
     </w:p>
     <w:p>
       <w:pPr>
+        <w:jc w:val="justify"/>
+        <w:spacing w:before="120" w:after="120"/>
+      </w:pPr>
+      <w:r>
+        <w:rPr>
+          <w:rFonts w:ascii="Times New Roman" w:hAnsi="Times New Roman"/>
+          <w:sz w:val="22"/>
+        </w:rPr>
+        <w:t xml:space="preserve">Se presentan los casos de uso principales del sistema SARQUE, indicando el actor responsable y una descripción breve de cada uno.</w:t>
+      </w:r>
+    </w:p>
+    <w:p>
+      <w:pPr>
         <w:pStyle w:val="3"/>
         <w:spacing w:line="360" w:lineRule="auto"/>
         <w:rPr>
@@ -19431,6 +19822,20 @@
       </w:tr>
       <w:bookmarkEnd w:id="68"/>
     </w:tbl>
+    <w:p>
+      <w:pPr>
+        <w:jc w:val="center"/>
+        <w:spacing w:before="120" w:after="120"/>
+      </w:pPr>
+      <w:r>
+        <w:rPr>
+          <w:rFonts w:ascii="Times New Roman" w:hAnsi="Times New Roman"/>
+          <w:sz w:val="20"/>
+          <w:i/>
+        </w:rPr>
+        <w:t xml:space="preserve">Fuente: Elaboración propia, 2026.</w:t>
+      </w:r>
+    </w:p>
     <w:p>
       <w:pPr>
         <w:pStyle w:val="5"/>
@@ -19552,6 +19957,19 @@
     </w:p>
     <w:p>
       <w:pPr>
+        <w:jc w:val="justify"/>
+        <w:spacing w:before="120" w:after="120"/>
+      </w:pPr>
+      <w:r>
+        <w:rPr>
+          <w:rFonts w:ascii="Times New Roman" w:hAnsi="Times New Roman"/>
+          <w:sz w:val="22"/>
+        </w:rPr>
+        <w:t xml:space="preserve">La tabla detalla los componentes del sistema, la tecnología utilizada para implementarlos y la función específica que cumplen.</w:t>
+      </w:r>
+    </w:p>
+    <w:p>
+      <w:pPr>
         <w:pStyle w:val="3"/>
         <w:spacing w:line="360" w:lineRule="auto"/>
         <w:rPr>
@@ -20038,6 +20456,20 @@
       </w:tr>
       <w:bookmarkEnd w:id="69"/>
     </w:tbl>
+    <w:p>
+      <w:pPr>
+        <w:jc w:val="center"/>
+        <w:spacing w:before="120" w:after="120"/>
+      </w:pPr>
+      <w:r>
+        <w:rPr>
+          <w:rFonts w:ascii="Times New Roman" w:hAnsi="Times New Roman"/>
+          <w:sz w:val="20"/>
+          <w:i/>
+        </w:rPr>
+        <w:t xml:space="preserve">Fuente: Elaboración propia, 2026.</w:t>
+      </w:r>
+    </w:p>
     <w:p>
       <w:pPr>
         <w:pStyle w:val="5"/>
@@ -20258,6 +20690,19 @@
     </w:p>
     <w:p>
       <w:pPr>
+        <w:jc w:val="justify"/>
+        <w:spacing w:before="120" w:after="120"/>
+      </w:pPr>
+      <w:r>
+        <w:rPr>
+          <w:rFonts w:ascii="Times New Roman" w:hAnsi="Times New Roman"/>
+          <w:sz w:val="22"/>
+        </w:rPr>
+        <w:t xml:space="preserve">Especificación de los campos de la entidad sectores, que almacena el catálogo de zonas de riego del parque.</w:t>
+      </w:r>
+    </w:p>
+    <w:p>
+      <w:pPr>
         <w:pStyle w:val="3"/>
         <w:spacing w:line="360" w:lineRule="auto"/>
         <w:rPr>
@@ -20818,6 +21263,20 @@
     </w:tbl>
     <w:p>
       <w:pPr>
+        <w:jc w:val="center"/>
+        <w:spacing w:before="120" w:after="120"/>
+      </w:pPr>
+      <w:r>
+        <w:rPr>
+          <w:rFonts w:ascii="Times New Roman" w:hAnsi="Times New Roman"/>
+          <w:sz w:val="20"/>
+          <w:i/>
+        </w:rPr>
+        <w:t xml:space="preserve">Fuente: Elaboración propia, 2026.</w:t>
+      </w:r>
+    </w:p>
+    <w:p>
+      <w:pPr>
         <w:pStyle w:val="3"/>
         <w:spacing w:line="360" w:lineRule="auto"/>
         <w:rPr>
@@ -20826,6 +21285,19 @@
           <w:color w:val="auto"/>
         </w:rPr>
       </w:pPr>
+    </w:p>
+    <w:p>
+      <w:pPr>
+        <w:jc w:val="justify"/>
+        <w:spacing w:before="120" w:after="120"/>
+      </w:pPr>
+      <w:r>
+        <w:rPr>
+          <w:rFonts w:ascii="Times New Roman" w:hAnsi="Times New Roman"/>
+          <w:sz w:val="22"/>
+        </w:rPr>
+        <w:t xml:space="preserve">Especificación de los campos de la entidad controladores, que registra los 6 dispositivos K-Rain BL-KR del sistema.</w:t>
+      </w:r>
     </w:p>
     <w:p>
       <w:pPr>
@@ -21261,6 +21733,20 @@
     </w:tbl>
     <w:p>
       <w:pPr>
+        <w:jc w:val="center"/>
+        <w:spacing w:before="120" w:after="120"/>
+      </w:pPr>
+      <w:r>
+        <w:rPr>
+          <w:rFonts w:ascii="Times New Roman" w:hAnsi="Times New Roman"/>
+          <w:sz w:val="20"/>
+          <w:i/>
+        </w:rPr>
+        <w:t xml:space="preserve">Fuente: Elaboración propia, 2026.</w:t>
+      </w:r>
+    </w:p>
+    <w:p>
+      <w:pPr>
         <w:pStyle w:val="3"/>
         <w:spacing w:line="360" w:lineRule="auto"/>
         <w:rPr>
@@ -21269,6 +21755,19 @@
           <w:color w:val="auto"/>
         </w:rPr>
       </w:pPr>
+    </w:p>
+    <w:p>
+      <w:pPr>
+        <w:jc w:val="justify"/>
+        <w:spacing w:before="120" w:after="120"/>
+      </w:pPr>
+      <w:r>
+        <w:rPr>
+          <w:rFonts w:ascii="Times New Roman" w:hAnsi="Times New Roman"/>
+          <w:sz w:val="22"/>
+        </w:rPr>
+        <w:t xml:space="preserve">Especificación de los campos de la entidad horarios_riego, que define el cronograma semanal de riego por sector.</w:t>
+      </w:r>
     </w:p>
     <w:p>
       <w:pPr>
@@ -21960,6 +22459,20 @@
     </w:tbl>
     <w:p>
       <w:pPr>
+        <w:jc w:val="center"/>
+        <w:spacing w:before="120" w:after="120"/>
+      </w:pPr>
+      <w:r>
+        <w:rPr>
+          <w:rFonts w:ascii="Times New Roman" w:hAnsi="Times New Roman"/>
+          <w:sz w:val="20"/>
+          <w:i/>
+        </w:rPr>
+        <w:t xml:space="preserve">Fuente: Elaboración propia, 2026.</w:t>
+      </w:r>
+    </w:p>
+    <w:p>
+      <w:pPr>
         <w:pStyle w:val="3"/>
         <w:spacing w:line="360" w:lineRule="auto"/>
         <w:rPr>
@@ -21968,6 +22481,19 @@
           <w:color w:val="auto"/>
         </w:rPr>
       </w:pPr>
+    </w:p>
+    <w:p>
+      <w:pPr>
+        <w:jc w:val="justify"/>
+        <w:spacing w:before="120" w:after="120"/>
+      </w:pPr>
+      <w:r>
+        <w:rPr>
+          <w:rFonts w:ascii="Times New Roman" w:hAnsi="Times New Roman"/>
+          <w:sz w:val="22"/>
+        </w:rPr>
+        <w:t xml:space="preserve">Estructura de la entidad profiles que almacena los datos básicos de los usuarios del sistema.</w:t>
+      </w:r>
     </w:p>
     <w:p>
       <w:pPr>
@@ -22290,6 +22816,33 @@
     </w:tbl>
     <w:p>
       <w:pPr>
+        <w:jc w:val="center"/>
+        <w:spacing w:before="120" w:after="120"/>
+      </w:pPr>
+      <w:r>
+        <w:rPr>
+          <w:rFonts w:ascii="Times New Roman" w:hAnsi="Times New Roman"/>
+          <w:sz w:val="20"/>
+          <w:i/>
+        </w:rPr>
+        <w:t xml:space="preserve">Fuente: Elaboración propia, 2026.</w:t>
+      </w:r>
+    </w:p>
+    <w:p>
+      <w:pPr>
+        <w:jc w:val="justify"/>
+        <w:spacing w:before="120" w:after="120"/>
+      </w:pPr>
+      <w:r>
+        <w:rPr>
+          <w:rFonts w:ascii="Times New Roman" w:hAnsi="Times New Roman"/>
+          <w:sz w:val="22"/>
+        </w:rPr>
+        <w:t xml:space="preserve">Estructura de la entidad user_roles que define el rol (administrador u operador) de cada usuario del sistema.</w:t>
+      </w:r>
+    </w:p>
+    <w:p>
+      <w:pPr>
         <w:pStyle w:val="3"/>
         <w:spacing w:line="360" w:lineRule="auto"/>
         <w:rPr>
@@ -22593,6 +23146,20 @@
       </w:tr>
       <w:bookmarkEnd w:id="70"/>
     </w:tbl>
+    <w:p>
+      <w:pPr>
+        <w:jc w:val="center"/>
+        <w:spacing w:before="120" w:after="120"/>
+      </w:pPr>
+      <w:r>
+        <w:rPr>
+          <w:rFonts w:ascii="Times New Roman" w:hAnsi="Times New Roman"/>
+          <w:sz w:val="20"/>
+          <w:i/>
+        </w:rPr>
+        <w:t xml:space="preserve">Fuente: Elaboración propia, 2026.</w:t>
+      </w:r>
+    </w:p>
     <w:p>
       <w:pPr>
         <w:pStyle w:val="5"/>
@@ -22696,6 +23263,19 @@
     </w:p>
     <w:p>
       <w:pPr>
+        <w:jc w:val="justify"/>
+        <w:spacing w:before="120" w:after="120"/>
+      </w:pPr>
+      <w:r>
+        <w:rPr>
+          <w:rFonts w:ascii="Times New Roman" w:hAnsi="Times New Roman"/>
+          <w:sz w:val="22"/>
+        </w:rPr>
+        <w:t xml:space="preserve">Distribución por capas de la plataforma web SARQUE, mostrando las tecnologías utilizadas y la responsabilidad de cada capa.</w:t>
+      </w:r>
+    </w:p>
+    <w:p>
+      <w:pPr>
         <w:pStyle w:val="3"/>
         <w:spacing w:line="360" w:lineRule="auto"/>
         <w:rPr>
@@ -23055,6 +23635,20 @@
       <w:bookmarkEnd w:id="66"/>
       <w:bookmarkEnd w:id="71"/>
     </w:tbl>
+    <w:p>
+      <w:pPr>
+        <w:jc w:val="center"/>
+        <w:spacing w:before="120" w:after="120"/>
+      </w:pPr>
+      <w:r>
+        <w:rPr>
+          <w:rFonts w:ascii="Times New Roman" w:hAnsi="Times New Roman"/>
+          <w:sz w:val="20"/>
+          <w:i/>
+        </w:rPr>
+        <w:t xml:space="preserve">Fuente: Elaboración propia, 2026.</w:t>
+      </w:r>
+    </w:p>
     <w:p>
       <w:pPr>
         <w:pStyle w:val="4"/>
@@ -23248,6 +23842,19 @@
     </w:p>
     <w:p>
       <w:pPr>
+        <w:jc w:val="justify"/>
+        <w:spacing w:before="120" w:after="120"/>
+      </w:pPr>
+      <w:r>
+        <w:rPr>
+          <w:rFonts w:ascii="Times New Roman" w:hAnsi="Times New Roman"/>
+          <w:sz w:val="22"/>
+        </w:rPr>
+        <w:t xml:space="preserve">Distribución detallada de los 6 controladores K-Rain BL-KR en las 6 zonas del parque, con la cantidad de estaciones que controla cada uno.</w:t>
+      </w:r>
+    </w:p>
+    <w:p>
+      <w:pPr>
         <w:pStyle w:val="3"/>
         <w:spacing w:line="360" w:lineRule="auto"/>
         <w:rPr>
@@ -23951,6 +24558,20 @@
       </w:tr>
       <w:bookmarkEnd w:id="74"/>
     </w:tbl>
+    <w:p>
+      <w:pPr>
+        <w:jc w:val="center"/>
+        <w:spacing w:before="120" w:after="120"/>
+      </w:pPr>
+      <w:r>
+        <w:rPr>
+          <w:rFonts w:ascii="Times New Roman" w:hAnsi="Times New Roman"/>
+          <w:sz w:val="20"/>
+          <w:i/>
+        </w:rPr>
+        <w:t xml:space="preserve">Fuente: Elaboración propia, 2026.</w:t>
+      </w:r>
+    </w:p>
     <w:p>
       <w:pPr>
         <w:pStyle w:val="5"/>
@@ -25230,6 +25851,19 @@
     </w:p>
     <w:p>
       <w:pPr>
+        <w:jc w:val="justify"/>
+        <w:spacing w:before="120" w:after="120"/>
+      </w:pPr>
+      <w:r>
+        <w:rPr>
+          <w:rFonts w:ascii="Times New Roman" w:hAnsi="Times New Roman"/>
+          <w:sz w:val="22"/>
+        </w:rPr>
+        <w:t xml:space="preserve">Resultados de las pruebas funcionales realizadas sobre la plataforma web SARQUE, indicando el escenario validado y el resultado obtenido.</w:t>
+      </w:r>
+    </w:p>
+    <w:p>
+      <w:pPr>
         <w:pStyle w:val="41"/>
         <w:spacing w:line="360" w:lineRule="auto"/>
         <w:rPr>
@@ -25861,6 +26495,20 @@
     </w:tbl>
     <w:p>
       <w:pPr>
+        <w:jc w:val="center"/>
+        <w:spacing w:before="120" w:after="120"/>
+      </w:pPr>
+      <w:r>
+        <w:rPr>
+          <w:rFonts w:ascii="Times New Roman" w:hAnsi="Times New Roman"/>
+          <w:sz w:val="20"/>
+          <w:i/>
+        </w:rPr>
+        <w:t xml:space="preserve">Fuente: Elaboración propia, 2026.</w:t>
+      </w:r>
+    </w:p>
+    <w:p>
+      <w:pPr>
         <w:pStyle w:val="5"/>
         <w:spacing w:line="360" w:lineRule="auto"/>
         <w:rPr>
@@ -25889,6 +26537,19 @@
           <w:color w:val="auto"/>
         </w:rPr>
         <w:t xml:space="preserve"> Pruebas Hidráulicas</w:t>
+      </w:r>
+    </w:p>
+    <w:p>
+      <w:pPr>
+        <w:jc w:val="justify"/>
+        <w:spacing w:before="120" w:after="120"/>
+      </w:pPr>
+      <w:r>
+        <w:rPr>
+          <w:rFonts w:ascii="Times New Roman" w:hAnsi="Times New Roman"/>
+          <w:sz w:val="22"/>
+        </w:rPr>
+        <w:t xml:space="preserve">Pruebas hidráulicas ejecutadas para validar el correcto funcionamiento del sistema de riego instalado en campo.</w:t>
       </w:r>
     </w:p>
     <w:p>
@@ -26535,6 +27196,20 @@
     </w:tbl>
     <w:p>
       <w:pPr>
+        <w:jc w:val="center"/>
+        <w:spacing w:before="120" w:after="120"/>
+      </w:pPr>
+      <w:r>
+        <w:rPr>
+          <w:rFonts w:ascii="Times New Roman" w:hAnsi="Times New Roman"/>
+          <w:sz w:val="20"/>
+          <w:i/>
+        </w:rPr>
+        <w:t xml:space="preserve">Fuente: Elaboración propia, 2026.</w:t>
+      </w:r>
+    </w:p>
+    <w:p>
+      <w:pPr>
         <w:pStyle w:val="5"/>
         <w:spacing w:line="360" w:lineRule="auto"/>
         <w:rPr>
@@ -26563,6 +27238,19 @@
           <w:color w:val="auto"/>
         </w:rPr>
         <w:t>Pruebas Eléctricas</w:t>
+      </w:r>
+    </w:p>
+    <w:p>
+      <w:pPr>
+        <w:jc w:val="justify"/>
+        <w:spacing w:before="120" w:after="120"/>
+      </w:pPr>
+      <w:r>
+        <w:rPr>
+          <w:rFonts w:ascii="Times New Roman" w:hAnsi="Times New Roman"/>
+          <w:sz w:val="22"/>
+        </w:rPr>
+        <w:t xml:space="preserve">Pruebas eléctricas realizadas para verificar la continuidad del cableado, la activación de los solenoides y el aislamiento de los empalmes.</w:t>
       </w:r>
     </w:p>
     <w:p>
@@ -27109,6 +27797,20 @@
     </w:tbl>
     <w:p>
       <w:pPr>
+        <w:jc w:val="center"/>
+        <w:spacing w:before="120" w:after="120"/>
+      </w:pPr>
+      <w:r>
+        <w:rPr>
+          <w:rFonts w:ascii="Times New Roman" w:hAnsi="Times New Roman"/>
+          <w:sz w:val="20"/>
+          <w:i/>
+        </w:rPr>
+        <w:t xml:space="preserve">Fuente: Elaboración propia, 2026.</w:t>
+      </w:r>
+    </w:p>
+    <w:p>
+      <w:pPr>
         <w:pStyle w:val="5"/>
         <w:spacing w:line="360" w:lineRule="auto"/>
         <w:rPr>
@@ -27137,6 +27839,19 @@
           <w:color w:val="auto"/>
         </w:rPr>
         <w:t>Pruebas de Aceptación con la Administración</w:t>
+      </w:r>
+    </w:p>
+    <w:p>
+      <w:pPr>
+        <w:jc w:val="justify"/>
+        <w:spacing w:before="120" w:after="120"/>
+      </w:pPr>
+      <w:r>
+        <w:rPr>
+          <w:rFonts w:ascii="Times New Roman" w:hAnsi="Times New Roman"/>
+          <w:sz w:val="22"/>
+        </w:rPr>
+        <w:t xml:space="preserve">Criterios de aceptación validados directamente con la administración del Parque Quinta Estación, confirmando el cumplimiento de los objetivos del proyecto.</w:t>
       </w:r>
     </w:p>
     <w:p>
@@ -27591,6 +28306,20 @@
     </w:tbl>
     <w:p>
       <w:pPr>
+        <w:jc w:val="center"/>
+        <w:spacing w:before="120" w:after="120"/>
+      </w:pPr>
+      <w:r>
+        <w:rPr>
+          <w:rFonts w:ascii="Times New Roman" w:hAnsi="Times New Roman"/>
+          <w:sz w:val="20"/>
+          <w:i/>
+        </w:rPr>
+        <w:t xml:space="preserve">Fuente: Elaboración propia, 2026.</w:t>
+      </w:r>
+    </w:p>
+    <w:p>
+      <w:pPr>
         <w:spacing w:line="360" w:lineRule="auto"/>
         <w:rPr>
           <w:color w:val="auto"/>
@@ -27677,6 +28406,19 @@
           <w:color w:val="auto"/>
         </w:rPr>
         <w:t xml:space="preserve"> Tiempos de Trabajo del Personal</w:t>
+      </w:r>
+    </w:p>
+    <w:p>
+      <w:pPr>
+        <w:jc w:val="justify"/>
+        <w:spacing w:before="120" w:after="120"/>
+      </w:pPr>
+      <w:r>
+        <w:rPr>
+          <w:rFonts w:ascii="Times New Roman" w:hAnsi="Times New Roman"/>
+          <w:sz w:val="22"/>
+        </w:rPr>
+        <w:t xml:space="preserve">Comparativa de los tiempos invertidos por el personal en las actividades de riego antes y después de la implementación de SARQUE.</w:t>
       </w:r>
     </w:p>
     <w:p>
@@ -28050,6 +28792,20 @@
     </w:tbl>
     <w:p>
       <w:pPr>
+        <w:jc w:val="center"/>
+        <w:spacing w:before="120" w:after="120"/>
+      </w:pPr>
+      <w:r>
+        <w:rPr>
+          <w:rFonts w:ascii="Times New Roman" w:hAnsi="Times New Roman"/>
+          <w:sz w:val="20"/>
+          <w:i/>
+        </w:rPr>
+        <w:t xml:space="preserve">Fuente: Elaboración propia, 2026.</w:t>
+      </w:r>
+    </w:p>
+    <w:p>
+      <w:pPr>
         <w:pStyle w:val="5"/>
         <w:spacing w:line="360" w:lineRule="auto"/>
         <w:rPr>
@@ -28078,6 +28834,19 @@
           <w:color w:val="auto"/>
         </w:rPr>
         <w:t>Cumplimiento de Requerimientos Funcionales</w:t>
+      </w:r>
+    </w:p>
+    <w:p>
+      <w:pPr>
+        <w:jc w:val="justify"/>
+        <w:spacing w:before="120" w:after="120"/>
+      </w:pPr>
+      <w:r>
+        <w:rPr>
+          <w:rFonts w:ascii="Times New Roman" w:hAnsi="Times New Roman"/>
+          <w:sz w:val="22"/>
+        </w:rPr>
+        <w:t xml:space="preserve">Trazabilidad del cumplimiento de los nueve requerimientos funcionales definidos al inicio del proyecto, con la evidencia de cada uno.</w:t>
       </w:r>
     </w:p>
     <w:p>
@@ -28761,6 +29530,20 @@
     </w:tbl>
     <w:p>
       <w:pPr>
+        <w:jc w:val="center"/>
+        <w:spacing w:before="120" w:after="120"/>
+      </w:pPr>
+      <w:r>
+        <w:rPr>
+          <w:rFonts w:ascii="Times New Roman" w:hAnsi="Times New Roman"/>
+          <w:sz w:val="20"/>
+          <w:i/>
+        </w:rPr>
+        <w:t xml:space="preserve">Fuente: Elaboración propia, 2026.</w:t>
+      </w:r>
+    </w:p>
+    <w:p>
+      <w:pPr>
         <w:spacing w:line="360" w:lineRule="auto"/>
         <w:rPr>
           <w:color w:val="auto"/>
@@ -30097,6 +30880,19 @@
           <w:color w:val="auto"/>
         </w:rPr>
         <w:t>A.1. Sistema de Bombeo</w:t>
+      </w:r>
+    </w:p>
+    <w:p>
+      <w:pPr>
+        <w:jc w:val="justify"/>
+        <w:spacing w:before="120" w:after="120"/>
+      </w:pPr>
+      <w:r>
+        <w:rPr>
+          <w:rFonts w:ascii="Times New Roman" w:hAnsi="Times New Roman"/>
+          <w:sz w:val="22"/>
+        </w:rPr>
+        <w:t xml:space="preserve">Especificaciones técnicas completas de la bomba sumergible Grundfos de 5 HP instalada en el pozo del parque.</w:t>
       </w:r>
     </w:p>
     <w:p>
@@ -30692,6 +31488,20 @@
     </w:tbl>
     <w:p>
       <w:pPr>
+        <w:jc w:val="center"/>
+        <w:spacing w:before="120" w:after="120"/>
+      </w:pPr>
+      <w:r>
+        <w:rPr>
+          <w:rFonts w:ascii="Times New Roman" w:hAnsi="Times New Roman"/>
+          <w:sz w:val="20"/>
+          <w:i/>
+        </w:rPr>
+        <w:t xml:space="preserve">Fuente: Elaboración propia, 2026.</w:t>
+      </w:r>
+    </w:p>
+    <w:p>
+      <w:pPr>
         <w:pStyle w:val="5"/>
         <w:spacing w:line="360" w:lineRule="auto"/>
         <w:rPr>
@@ -30717,6 +31527,19 @@
           <w:color w:val="auto"/>
         </w:rPr>
         <w:t>A.2. Red Hidráulica</w:t>
+      </w:r>
+    </w:p>
+    <w:p>
+      <w:pPr>
+        <w:jc w:val="justify"/>
+        <w:spacing w:before="120" w:after="120"/>
+      </w:pPr>
+      <w:r>
+        <w:rPr>
+          <w:rFonts w:ascii="Times New Roman" w:hAnsi="Times New Roman"/>
+          <w:sz w:val="22"/>
+        </w:rPr>
+        <w:t xml:space="preserve">Especificaciones técnicas de las tuberías de PVC, cuelleras, llaves de paso y demás accesorios hidráulicos utilizados en la instalación.</w:t>
       </w:r>
     </w:p>
     <w:p>
@@ -31174,6 +31997,20 @@
     </w:tbl>
     <w:p>
       <w:pPr>
+        <w:jc w:val="center"/>
+        <w:spacing w:before="120" w:after="120"/>
+      </w:pPr>
+      <w:r>
+        <w:rPr>
+          <w:rFonts w:ascii="Times New Roman" w:hAnsi="Times New Roman"/>
+          <w:sz w:val="20"/>
+          <w:i/>
+        </w:rPr>
+        <w:t xml:space="preserve">Fuente: Elaboración propia, 2026.</w:t>
+      </w:r>
+    </w:p>
+    <w:p>
+      <w:pPr>
         <w:pStyle w:val="5"/>
         <w:spacing w:line="360" w:lineRule="auto"/>
         <w:rPr>
@@ -31199,6 +32036,19 @@
           <w:color w:val="auto"/>
         </w:rPr>
         <w:t>A.3. Sistema Eléctrico de Control</w:t>
+      </w:r>
+    </w:p>
+    <w:p>
+      <w:pPr>
+        <w:jc w:val="justify"/>
+        <w:spacing w:before="120" w:after="120"/>
+      </w:pPr>
+      <w:r>
+        <w:rPr>
+          <w:rFonts w:ascii="Times New Roman" w:hAnsi="Times New Roman"/>
+          <w:sz w:val="22"/>
+        </w:rPr>
+        <w:t xml:space="preserve">Detalle técnico del cable monofilar 20 AWG, el politubo de protección, las baterías y los solenoides utilizados en el sistema eléctrico de control.</w:t>
       </w:r>
     </w:p>
     <w:p>
@@ -31702,6 +32552,20 @@
     </w:tbl>
     <w:p>
       <w:pPr>
+        <w:jc w:val="center"/>
+        <w:spacing w:before="120" w:after="120"/>
+      </w:pPr>
+      <w:r>
+        <w:rPr>
+          <w:rFonts w:ascii="Times New Roman" w:hAnsi="Times New Roman"/>
+          <w:sz w:val="20"/>
+          <w:i/>
+        </w:rPr>
+        <w:t xml:space="preserve">Fuente: Elaboración propia, 2026.</w:t>
+      </w:r>
+    </w:p>
+    <w:p>
+      <w:pPr>
         <w:pStyle w:val="5"/>
         <w:spacing w:line="360" w:lineRule="auto"/>
         <w:rPr>
@@ -31727,6 +32591,19 @@
           <w:color w:val="auto"/>
         </w:rPr>
         <w:t>A.4. Controladores K-Rain BL-KR</w:t>
+      </w:r>
+    </w:p>
+    <w:p>
+      <w:pPr>
+        <w:jc w:val="justify"/>
+        <w:spacing w:before="120" w:after="120"/>
+      </w:pPr>
+      <w:r>
+        <w:rPr>
+          <w:rFonts w:ascii="Times New Roman" w:hAnsi="Times New Roman"/>
+          <w:sz w:val="22"/>
+        </w:rPr>
+        <w:t xml:space="preserve">Distribución detallada de los 6 controladores K-Rain BL-KR con su modelo, número de estaciones y zona del parque que controla cada uno.</w:t>
       </w:r>
     </w:p>
     <w:p>
@@ -32436,6 +33313,20 @@
     </w:tbl>
     <w:p>
       <w:pPr>
+        <w:jc w:val="center"/>
+        <w:spacing w:before="120" w:after="120"/>
+      </w:pPr>
+      <w:r>
+        <w:rPr>
+          <w:rFonts w:ascii="Times New Roman" w:hAnsi="Times New Roman"/>
+          <w:sz w:val="20"/>
+          <w:i/>
+        </w:rPr>
+        <w:t xml:space="preserve">Fuente: Elaboración propia, 2026.</w:t>
+      </w:r>
+    </w:p>
+    <w:p>
+      <w:pPr>
         <w:pStyle w:val="5"/>
         <w:spacing w:line="360" w:lineRule="auto"/>
         <w:rPr>
@@ -32461,6 +33352,19 @@
           <w:color w:val="auto"/>
         </w:rPr>
         <w:t>A.5. Plataforma Web SARQUE — Stack Tecnológico</w:t>
+      </w:r>
+    </w:p>
+    <w:p>
+      <w:pPr>
+        <w:jc w:val="justify"/>
+        <w:spacing w:before="120" w:after="120"/>
+      </w:pPr>
+      <w:r>
+        <w:rPr>
+          <w:rFonts w:ascii="Times New Roman" w:hAnsi="Times New Roman"/>
+          <w:sz w:val="22"/>
+        </w:rPr>
+        <w:t xml:space="preserve">Detalle del stack tecnológico utilizado en la plataforma web SARQUE, con las versiones específicas de cada librería y framework.</w:t>
       </w:r>
     </w:p>
     <w:p>
@@ -32953,6 +33857,20 @@
     </w:tbl>
     <w:p>
       <w:pPr>
+        <w:jc w:val="center"/>
+        <w:spacing w:before="120" w:after="120"/>
+      </w:pPr>
+      <w:r>
+        <w:rPr>
+          <w:rFonts w:ascii="Times New Roman" w:hAnsi="Times New Roman"/>
+          <w:sz w:val="20"/>
+          <w:i/>
+        </w:rPr>
+        <w:t xml:space="preserve">Fuente: Elaboración propia, 2026.</w:t>
+      </w:r>
+    </w:p>
+    <w:p>
+      <w:pPr>
         <w:pStyle w:val="5"/>
         <w:spacing w:line="360" w:lineRule="auto"/>
         <w:rPr>
@@ -32978,6 +33896,19 @@
           <w:color w:val="auto"/>
         </w:rPr>
         <w:t>A.6. Personal del Parque</w:t>
+      </w:r>
+    </w:p>
+    <w:p>
+      <w:pPr>
+        <w:jc w:val="justify"/>
+        <w:spacing w:before="120" w:after="120"/>
+      </w:pPr>
+      <w:r>
+        <w:rPr>
+          <w:rFonts w:ascii="Times New Roman" w:hAnsi="Times New Roman"/>
+          <w:sz w:val="22"/>
+        </w:rPr>
+        <w:t xml:space="preserve">Personal involucrado en la operación del sistema SARQUE en el Parque Quinta Estación, con sus roles y funciones específicas.</w:t>
       </w:r>
     </w:p>
     <w:p>
@@ -33275,6 +34206,20 @@
         </w:tc>
       </w:tr>
     </w:tbl>
+    <w:p>
+      <w:pPr>
+        <w:jc w:val="center"/>
+        <w:spacing w:before="120" w:after="120"/>
+      </w:pPr>
+      <w:r>
+        <w:rPr>
+          <w:rFonts w:ascii="Times New Roman" w:hAnsi="Times New Roman"/>
+          <w:sz w:val="20"/>
+          <w:i/>
+        </w:rPr>
+        <w:t xml:space="preserve">Fuente: Elaboración propia, 2026.</w:t>
+      </w:r>
+    </w:p>
     <w:p>
       <w:pPr>
         <w:spacing w:line="360" w:lineRule="auto"/>

</xml_diff>

<commit_message>
Aplicar correcciones en ubicaciones correctas: resumen, objetivo, marco teorico ampliado, nuevas secciones Cap 3, tablas con descripcion y fuente
</commit_message>
<xml_diff>
--- a/SARQUE_jose_actualizado.docx
+++ b/SARQUE_jose_actualizado.docx
@@ -2474,12 +2474,9 @@
       </w:pPr>
       <w:r>
         <w:rPr>
-          <w:b w:val="0"/>
-          <w:i w:val="0"/>
-          <w:color w:val="auto"/>
-          <w:sz w:val="24"/>
-        </w:rPr>
-        <w:t>SARQUE es un sistema automatizado de riego implementado en el Parque Ecoturístico Quinta Estación de Cochabamba, Bolivia, un espacio verde de 5 hectáreas con más de 20 sectores de vegetación diferenciada. El sistema integra 6 controladores Bluetooth K-Rain BL-KR (2 BL-KR2, 3 BL-KR4 y 1 BL-KR6, totalizando 22 estaciones) con electroválvulas K-Rain BSPT de 9 V DC tipo latching, una bomba sumergible Grundfos de 5 HP con tanque hidroneumático y una red hidráulica de tuberías PVC de 2" y 1 ½". La programación de los controladores se realiza mediante la aplicación móvil oficial K-RainBL sobre conexión Bluetooth Low Energy (BLE), eliminando la necesidad de infraestructura WiFi en el predio. Como aporte académico complementario, se desarrolló una plataforma web en React, TypeScript y Supabase que centraliza el catálogo de sectores, los controladores y el cronograma semanal de riego, reemplazando el documento físico utilizado previamente. El trabajo se ejecutó bajo modalidad de Trabajo Dirigido, integrando los conceptos centrales de la Carrera de Informática Industrial del ITSa: automatización de procesos hidráulicos, instrumentación de actuadores, redes inalámbricas de corto alcance e ingeniería de software.</w:t>
+          <w:color w:val="auto"/>
+        </w:rPr>
+        <w:t>INTRODUCCIÓN</w:t>
       </w:r>
     </w:p>
     <w:p>
@@ -2826,1248 +2823,6 @@
     </w:p>
     <w:p>
       <w:pPr>
-        <w:pStyle w:val="5"/>
-        <w:numPr>
-          <w:ilvl w:val="1"/>
-          <w:numId w:val="1"/>
-        </w:numPr>
-        <w:spacing w:line="360" w:lineRule="auto"/>
-        <w:jc w:val="left"/>
-        <w:rPr>
-          <w:color w:val="auto"/>
-        </w:rPr>
-      </w:pPr>
-      <w:r>
-        <w:rPr>
-          <w:rFonts w:ascii="Times New Roman" w:hAnsi="Times New Roman"/>
-          <w:b/>
-          <w:i w:val="0"/>
-          <w:sz w:val="26"/>
-        </w:rPr>
-        <w:t>3.3.7 Ubicación Geográfica de los Equipos Instalados</w:t>
-      </w:r>
-    </w:p>
-    <w:p>
-      <w:pPr>
-        <w:pStyle w:val="5"/>
-        <w:numPr>
-          <w:ilvl w:val="1"/>
-          <w:numId w:val="1"/>
-        </w:numPr>
-        <w:spacing w:line="360" w:lineRule="auto"/>
-        <w:jc w:val="both"/>
-        <w:rPr>
-          <w:color w:val="auto"/>
-        </w:rPr>
-      </w:pPr>
-      <w:r>
-        <w:rPr>
-          <w:rFonts w:ascii="Times New Roman" w:hAnsi="Times New Roman"/>
-          <w:b w:val="0"/>
-          <w:i w:val="0"/>
-          <w:sz w:val="24"/>
-        </w:rPr>
-        <w:t>El siguiente diagrama presenta la distribución geográfica de los 6 controladores BL-KR, la caseta de la bomba y los principales sectores del Parque Ecoturístico Quinta Estación, sobre una vista satelital aproximada del predio.</w:t>
-      </w:r>
-    </w:p>
-    <w:p>
-      <w:pPr>
-        <w:pStyle w:val="5"/>
-        <w:numPr>
-          <w:ilvl w:val="1"/>
-          <w:numId w:val="1"/>
-        </w:numPr>
-        <w:spacing w:line="360" w:lineRule="auto"/>
-        <w:jc w:val="center"/>
-        <w:rPr>
-          <w:color w:val="auto"/>
-        </w:rPr>
-      </w:pPr>
-      <w:r>
-        <w:rPr>
-          <w:rFonts w:ascii="Times New Roman" w:hAnsi="Times New Roman"/>
-          <w:b/>
-          <w:i w:val="0"/>
-          <w:sz w:val="22"/>
-        </w:rPr>
-        <w:t>Figura. Ubicación de los equipos instalados en el predio del parque</w:t>
-      </w:r>
-    </w:p>
-    <w:p>
-      <w:pPr>
-        <w:pStyle w:val="5"/>
-        <w:numPr>
-          <w:ilvl w:val="1"/>
-          <w:numId w:val="1"/>
-        </w:numPr>
-        <w:spacing w:line="360" w:lineRule="auto"/>
-        <w:jc w:val="center"/>
-        <w:rPr>
-          <w:color w:val="auto"/>
-        </w:rPr>
-      </w:pPr>
-      <w:r>
-        <w:rPr>
-          <w:rFonts w:ascii="Times New Roman" w:hAnsi="Times New Roman"/>
-          <w:b w:val="0"/>
-          <w:i/>
-          <w:sz w:val="22"/>
-        </w:rPr>
-        <w:t>[Insertar aquí la imagen: diagramas/Ubicacion_Equipos.png]</w:t>
-      </w:r>
-    </w:p>
-    <w:p>
-      <w:pPr>
-        <w:pStyle w:val="5"/>
-        <w:numPr>
-          <w:ilvl w:val="1"/>
-          <w:numId w:val="1"/>
-        </w:numPr>
-        <w:spacing w:line="360" w:lineRule="auto"/>
-        <w:jc w:val="center"/>
-        <w:rPr>
-          <w:color w:val="auto"/>
-        </w:rPr>
-      </w:pPr>
-      <w:r>
-        <w:rPr>
-          <w:rFonts w:ascii="Times New Roman" w:hAnsi="Times New Roman"/>
-          <w:b w:val="0"/>
-          <w:i/>
-          <w:sz w:val="20"/>
-        </w:rPr>
-        <w:t>Fuente: Elaboración propia sobre vista satelital de Google Maps, 2026.</w:t>
-      </w:r>
-    </w:p>
-    <w:p>
-      <w:pPr>
-        <w:pStyle w:val="5"/>
-        <w:numPr>
-          <w:ilvl w:val="1"/>
-          <w:numId w:val="1"/>
-        </w:numPr>
-        <w:spacing w:line="360" w:lineRule="auto"/>
-        <w:jc w:val="both"/>
-        <w:rPr>
-          <w:color w:val="auto"/>
-        </w:rPr>
-      </w:pPr>
-      <w:r>
-        <w:rPr>
-          <w:rFonts w:ascii="Times New Roman" w:hAnsi="Times New Roman"/>
-          <w:b w:val="0"/>
-          <w:i w:val="0"/>
-          <w:sz w:val="24"/>
-        </w:rPr>
-        <w:t>Como se observa en la figura anterior, la caseta de la bomba sumergible Grundfos de 5 HP se ubica en el extremo suroeste del parque. Desde ese punto, la matriz principal de PVC de 2" distribuye el agua hacia los 6 controladores BL-KR ubicados estratégicamente en las distintas zonas del predio. Cada controlador se localizó de modo tal que la distancia máxima entre el dispositivo y su electroválvula más lejana no supere los 30 metros, garantizando una caída de tensión despreciable sobre el cable monofilar 20 AWG utilizado.</w:t>
-      </w:r>
-    </w:p>
-    <w:p>
-      <w:pPr>
-        <w:pStyle w:val="4"/>
-        <w:numPr>
-          <w:ilvl w:val="1"/>
-          <w:numId w:val="1"/>
-        </w:numPr>
-        <w:spacing w:line="360" w:lineRule="auto"/>
-        <w:jc w:val="left"/>
-        <w:rPr>
-          <w:color w:val="auto"/>
-        </w:rPr>
-      </w:pPr>
-      <w:r>
-        <w:rPr>
-          <w:rFonts w:ascii="Times New Roman" w:hAnsi="Times New Roman"/>
-          <w:b/>
-          <w:i w:val="0"/>
-          <w:sz w:val="28"/>
-        </w:rPr>
-        <w:t>3.4 Funcionamiento del Software</w:t>
-      </w:r>
-    </w:p>
-    <w:p>
-      <w:pPr>
-        <w:pStyle w:val="4"/>
-        <w:numPr>
-          <w:ilvl w:val="1"/>
-          <w:numId w:val="1"/>
-        </w:numPr>
-        <w:spacing w:line="360" w:lineRule="auto"/>
-        <w:jc w:val="both"/>
-        <w:rPr>
-          <w:color w:val="auto"/>
-        </w:rPr>
-      </w:pPr>
-      <w:r>
-        <w:rPr>
-          <w:rFonts w:ascii="Times New Roman" w:hAnsi="Times New Roman"/>
-          <w:b w:val="0"/>
-          <w:i w:val="0"/>
-          <w:sz w:val="24"/>
-        </w:rPr>
-        <w:t>La plataforma web SARQUE es una aplicación de página única (SPA, Single Page Application) construida sobre React + TypeScript que se ejecuta directamente en el navegador del usuario. A continuación se describe cómo opera internamente cada módulo del software y cómo se establece la comunicación entre el frontend y la base de datos en Supabase.</w:t>
-      </w:r>
-    </w:p>
-    <w:p>
-      <w:pPr>
-        <w:pStyle w:val="5"/>
-        <w:numPr>
-          <w:ilvl w:val="1"/>
-          <w:numId w:val="1"/>
-        </w:numPr>
-        <w:spacing w:line="360" w:lineRule="auto"/>
-        <w:jc w:val="left"/>
-        <w:rPr>
-          <w:color w:val="auto"/>
-        </w:rPr>
-      </w:pPr>
-      <w:r>
-        <w:rPr>
-          <w:rFonts w:ascii="Times New Roman" w:hAnsi="Times New Roman"/>
-          <w:b/>
-          <w:i w:val="0"/>
-          <w:sz w:val="26"/>
-        </w:rPr>
-        <w:t>3.4.1 Arquitectura general del software</w:t>
-      </w:r>
-    </w:p>
-    <w:p>
-      <w:pPr>
-        <w:pStyle w:val="5"/>
-        <w:numPr>
-          <w:ilvl w:val="1"/>
-          <w:numId w:val="1"/>
-        </w:numPr>
-        <w:spacing w:line="360" w:lineRule="auto"/>
-        <w:jc w:val="both"/>
-        <w:rPr>
-          <w:color w:val="auto"/>
-        </w:rPr>
-      </w:pPr>
-      <w:r>
-        <w:rPr>
-          <w:rFonts w:ascii="Times New Roman" w:hAnsi="Times New Roman"/>
-          <w:b w:val="0"/>
-          <w:i w:val="0"/>
-          <w:sz w:val="24"/>
-        </w:rPr>
-        <w:t>El software SARQUE se compone de tres capas independientes que se comunican entre sí mediante el protocolo HTTPS y la API REST autogenerada por Supabase. La capa de presentación, implementada con React 18 y TypeScript, se encarga de renderizar la interfaz, capturar las acciones del usuario y mostrar los datos. La capa de lógica de aplicación, basada en TanStack React Query y Zod, gestiona el estado, valida los formularios y orquesta las llamadas a la API. Finalmente, la capa de datos reside en la nube de Supabase y persiste la información en una base PostgreSQL con políticas de Row Level Security.</w:t>
-      </w:r>
-    </w:p>
-    <w:p>
-      <w:pPr>
-        <w:pStyle w:val="5"/>
-        <w:numPr>
-          <w:ilvl w:val="1"/>
-          <w:numId w:val="1"/>
-        </w:numPr>
-        <w:spacing w:line="360" w:lineRule="auto"/>
-        <w:jc w:val="both"/>
-        <w:rPr>
-          <w:color w:val="auto"/>
-        </w:rPr>
-      </w:pPr>
-      <w:r>
-        <w:rPr>
-          <w:rFonts w:ascii="Times New Roman" w:hAnsi="Times New Roman"/>
-          <w:b w:val="0"/>
-          <w:i w:val="0"/>
-          <w:sz w:val="24"/>
-        </w:rPr>
-        <w:t>Cuando el usuario abre la URL de SARQUE en su navegador, este descarga los archivos compilados de React (HTML, CSS y JavaScript) desde el hosting de Lovable. Una vez cargada la aplicación, todas las consultas posteriores (lectura de sectores, creación de horarios, etc.) se realizan mediante llamadas HTTPS a la API REST de Supabase, que genera automáticamente endpoints para cada tabla del esquema PostgreSQL gracias a PostgREST.</w:t>
-      </w:r>
-    </w:p>
-    <w:p>
-      <w:pPr>
-        <w:pStyle w:val="5"/>
-        <w:numPr>
-          <w:ilvl w:val="1"/>
-          <w:numId w:val="1"/>
-        </w:numPr>
-        <w:spacing w:line="360" w:lineRule="auto"/>
-        <w:jc w:val="left"/>
-        <w:rPr>
-          <w:color w:val="auto"/>
-        </w:rPr>
-      </w:pPr>
-      <w:r>
-        <w:rPr>
-          <w:rFonts w:ascii="Times New Roman" w:hAnsi="Times New Roman"/>
-          <w:b/>
-          <w:i w:val="0"/>
-          <w:sz w:val="26"/>
-        </w:rPr>
-        <w:t>3.4.2 Funcionamiento del módulo Dashboard</w:t>
-      </w:r>
-    </w:p>
-    <w:p>
-      <w:pPr>
-        <w:pStyle w:val="5"/>
-        <w:numPr>
-          <w:ilvl w:val="1"/>
-          <w:numId w:val="1"/>
-        </w:numPr>
-        <w:spacing w:line="360" w:lineRule="auto"/>
-        <w:jc w:val="both"/>
-        <w:rPr>
-          <w:color w:val="auto"/>
-        </w:rPr>
-      </w:pPr>
-      <w:r>
-        <w:rPr>
-          <w:rFonts w:ascii="Times New Roman" w:hAnsi="Times New Roman"/>
-          <w:b w:val="0"/>
-          <w:i w:val="0"/>
-          <w:sz w:val="24"/>
-        </w:rPr>
-        <w:t>El Dashboard es la página principal del sistema y muestra en tiempo real el sector que está siendo regado en el momento exacto. Su lógica de funcionamiento es la siguiente: al cargar el componente, se ejecuta una consulta SQL a la tabla horarios_riego filtrando solo los horarios activos. Cada segundo, un temporizador (setInterval) actualiza la hora actual del navegador y se compara contra todos los horarios para determinar cuál sector está activo en ese instante. Si hay un sector activo, se muestra una tarjeta con barra de progreso animada que indica el porcentaje de avance del riego. Adicionalmente, se calculan el próximo riego programado y las estadísticas del día (sectores totales, volumen estimado).</w:t>
-      </w:r>
-    </w:p>
-    <w:p>
-      <w:pPr>
-        <w:pStyle w:val="5"/>
-        <w:numPr>
-          <w:ilvl w:val="1"/>
-          <w:numId w:val="1"/>
-        </w:numPr>
-        <w:spacing w:line="360" w:lineRule="auto"/>
-        <w:jc w:val="left"/>
-        <w:rPr>
-          <w:color w:val="auto"/>
-        </w:rPr>
-      </w:pPr>
-      <w:r>
-        <w:rPr>
-          <w:rFonts w:ascii="Times New Roman" w:hAnsi="Times New Roman"/>
-          <w:b/>
-          <w:i w:val="0"/>
-          <w:sz w:val="26"/>
-        </w:rPr>
-        <w:t>3.4.3 Funcionamiento del módulo Cronograma</w:t>
-      </w:r>
-    </w:p>
-    <w:p>
-      <w:pPr>
-        <w:pStyle w:val="5"/>
-        <w:numPr>
-          <w:ilvl w:val="1"/>
-          <w:numId w:val="1"/>
-        </w:numPr>
-        <w:spacing w:line="360" w:lineRule="auto"/>
-        <w:jc w:val="both"/>
-        <w:rPr>
-          <w:color w:val="auto"/>
-        </w:rPr>
-      </w:pPr>
-      <w:r>
-        <w:rPr>
-          <w:rFonts w:ascii="Times New Roman" w:hAnsi="Times New Roman"/>
-          <w:b w:val="0"/>
-          <w:i w:val="0"/>
-          <w:sz w:val="24"/>
-        </w:rPr>
-        <w:t>El Cronograma es una tabla visual de 7 columnas (días de la semana) por 6 filas (franjas horarias) que muestra los horarios de riego de cada sector con códigos de color según su duración. El color amarillo corresponde a riegos intensivos de 120 minutos, el verde a riegos estándar de 90 minutos y el azul a riegos cortos de 60 minutos. El administrador puede agregar un nuevo horario haciendo clic en el botón "Nuevo Horario", seleccionando el sector, el día y la hora de inicio. El sistema verifica con la biblioteca Zod que no haya conflictos de horario y guarda el nuevo registro en Supabase.</w:t>
-      </w:r>
-    </w:p>
-    <w:p>
-      <w:pPr>
-        <w:pStyle w:val="5"/>
-        <w:numPr>
-          <w:ilvl w:val="1"/>
-          <w:numId w:val="1"/>
-        </w:numPr>
-        <w:spacing w:line="360" w:lineRule="auto"/>
-        <w:jc w:val="left"/>
-        <w:rPr>
-          <w:color w:val="auto"/>
-        </w:rPr>
-      </w:pPr>
-      <w:r>
-        <w:rPr>
-          <w:rFonts w:ascii="Times New Roman" w:hAnsi="Times New Roman"/>
-          <w:b/>
-          <w:i w:val="0"/>
-          <w:sz w:val="26"/>
-        </w:rPr>
-        <w:t>3.4.4 Funcionamiento del módulo Reportes</w:t>
-      </w:r>
-    </w:p>
-    <w:p>
-      <w:pPr>
-        <w:pStyle w:val="5"/>
-        <w:numPr>
-          <w:ilvl w:val="1"/>
-          <w:numId w:val="1"/>
-        </w:numPr>
-        <w:spacing w:line="360" w:lineRule="auto"/>
-        <w:jc w:val="both"/>
-        <w:rPr>
-          <w:color w:val="auto"/>
-        </w:rPr>
-      </w:pPr>
-      <w:r>
-        <w:rPr>
-          <w:rFonts w:ascii="Times New Roman" w:hAnsi="Times New Roman"/>
-          <w:b w:val="0"/>
-          <w:i w:val="0"/>
-          <w:sz w:val="24"/>
-        </w:rPr>
-        <w:t>El módulo Reportes calcula sobre la marcha (sin almacenar en base de datos) las estadísticas de consumo hídrico a partir del cronograma vigente y del caudal de la bomba (4 L/s). Las estadísticas presentadas incluyen el resumen diario (litros totales estimados por día, calculados como duración por caudal), el resumen semanal (suma de los volúmenes de todos los sectores), el resumen mensual (extrapolación semanal multiplicada por 4.3 semanas por mes), el ranking de sectores ordenados de mayor a menor consumo y la distribución por duración en formato de gráfico de pastel.</w:t>
-      </w:r>
-    </w:p>
-    <w:p>
-      <w:pPr>
-        <w:pStyle w:val="4"/>
-        <w:numPr>
-          <w:ilvl w:val="1"/>
-          <w:numId w:val="1"/>
-        </w:numPr>
-        <w:spacing w:line="360" w:lineRule="auto"/>
-        <w:jc w:val="left"/>
-        <w:rPr>
-          <w:color w:val="auto"/>
-        </w:rPr>
-      </w:pPr>
-      <w:r>
-        <w:rPr>
-          <w:rFonts w:ascii="Times New Roman" w:hAnsi="Times New Roman"/>
-          <w:b/>
-          <w:i w:val="0"/>
-          <w:sz w:val="28"/>
-        </w:rPr>
-        <w:t>3.5 Configuración de los Equipos</w:t>
-      </w:r>
-    </w:p>
-    <w:p>
-      <w:pPr>
-        <w:pStyle w:val="5"/>
-        <w:numPr>
-          <w:ilvl w:val="1"/>
-          <w:numId w:val="1"/>
-        </w:numPr>
-        <w:spacing w:line="360" w:lineRule="auto"/>
-        <w:jc w:val="left"/>
-        <w:rPr>
-          <w:color w:val="auto"/>
-        </w:rPr>
-      </w:pPr>
-      <w:r>
-        <w:rPr>
-          <w:rFonts w:ascii="Times New Roman" w:hAnsi="Times New Roman"/>
-          <w:b/>
-          <w:i w:val="0"/>
-          <w:sz w:val="26"/>
-        </w:rPr>
-        <w:t>3.5.1 Configuración inicial de los controladores BL-KR</w:t>
-      </w:r>
-    </w:p>
-    <w:p>
-      <w:pPr>
-        <w:pStyle w:val="5"/>
-        <w:numPr>
-          <w:ilvl w:val="1"/>
-          <w:numId w:val="1"/>
-        </w:numPr>
-        <w:spacing w:line="360" w:lineRule="auto"/>
-        <w:jc w:val="both"/>
-        <w:rPr>
-          <w:color w:val="auto"/>
-        </w:rPr>
-      </w:pPr>
-      <w:r>
-        <w:rPr>
-          <w:rFonts w:ascii="Times New Roman" w:hAnsi="Times New Roman"/>
-          <w:b w:val="0"/>
-          <w:i w:val="0"/>
-          <w:sz w:val="24"/>
-        </w:rPr>
-        <w:t>La puesta en marcha de cada uno de los 6 controladores K-Rain BL-KR sigue un procedimiento técnico específico que se ejecuta una sola vez al momento de la instalación. En primer lugar, se desenrosca la tapa del controlador, se retira el sello protector y se instala una batería 9V alcalina nueva respetando la polaridad de los terminales positivo y negativo. Posteriormente, se coloca nuevamente el sello protector y se aprieta la tapa a mano hasta asegurar el sellado contra humedad.</w:t>
-      </w:r>
-    </w:p>
-    <w:p>
-      <w:pPr>
-        <w:pStyle w:val="5"/>
-        <w:numPr>
-          <w:ilvl w:val="1"/>
-          <w:numId w:val="1"/>
-        </w:numPr>
-        <w:spacing w:line="360" w:lineRule="auto"/>
-        <w:jc w:val="both"/>
-        <w:rPr>
-          <w:color w:val="auto"/>
-        </w:rPr>
-      </w:pPr>
-      <w:r>
-        <w:rPr>
-          <w:rFonts w:ascii="Times New Roman" w:hAnsi="Times New Roman"/>
-          <w:b w:val="0"/>
-          <w:i w:val="0"/>
-          <w:sz w:val="24"/>
-        </w:rPr>
-        <w:t>A continuación, se activa el Bluetooth del smartphone del administrador y se abre la aplicación oficial K-RainBL. El controlador aparecerá automáticamente en la pantalla "Seleccionar módulo BL-KR" con su número de serie y la intensidad de señal BLE. Se selecciona el controlador de la lista; la app realizará el emparejamiento en menos de 5 segundos. En este momento, se debe asignar un nombre descriptivo al controlador (por ejemplo: "BL-KR4 Olivos") y, opcionalmente, una clave de seguridad de 4 dígitos para protegerlo contra accesos no autorizados.</w:t>
-      </w:r>
-    </w:p>
-    <w:p>
-      <w:pPr>
-        <w:pStyle w:val="5"/>
-        <w:numPr>
-          <w:ilvl w:val="1"/>
-          <w:numId w:val="1"/>
-        </w:numPr>
-        <w:spacing w:line="360" w:lineRule="auto"/>
-        <w:jc w:val="both"/>
-        <w:rPr>
-          <w:color w:val="auto"/>
-        </w:rPr>
-      </w:pPr>
-      <w:r>
-        <w:rPr>
-          <w:rFonts w:ascii="Times New Roman" w:hAnsi="Times New Roman"/>
-          <w:b w:val="0"/>
-          <w:i w:val="0"/>
-          <w:sz w:val="24"/>
-        </w:rPr>
-        <w:t>Una vez emparejado el controlador, se accede al menú "Programming" dentro de la app y se selecciona el Programa A. Se definen los días de la semana en los que se ejecutará el riego, las horas de inicio del programa y los tiempos de riego de cada estación según el cronograma del parque. Finalmente, se pulsa el botón "Save" para guardar los cambios y luego "Transmit" para enviar la programación al controlador físico vía Bluetooth. El controlador emitirá un tono "bing" confirmando que la programación se transmitió correctamente.</w:t>
-      </w:r>
-    </w:p>
-    <w:p>
-      <w:pPr>
-        <w:pStyle w:val="5"/>
-        <w:numPr>
-          <w:ilvl w:val="1"/>
-          <w:numId w:val="1"/>
-        </w:numPr>
-        <w:spacing w:line="360" w:lineRule="auto"/>
-        <w:jc w:val="left"/>
-        <w:rPr>
-          <w:color w:val="auto"/>
-        </w:rPr>
-      </w:pPr>
-      <w:r>
-        <w:rPr>
-          <w:rFonts w:ascii="Times New Roman" w:hAnsi="Times New Roman"/>
-          <w:b/>
-          <w:i w:val="0"/>
-          <w:sz w:val="26"/>
-        </w:rPr>
-        <w:t>3.5.2 Configuración de las electroválvulas</w:t>
-      </w:r>
-    </w:p>
-    <w:p>
-      <w:pPr>
-        <w:pStyle w:val="5"/>
-        <w:numPr>
-          <w:ilvl w:val="1"/>
-          <w:numId w:val="1"/>
-        </w:numPr>
-        <w:spacing w:line="360" w:lineRule="auto"/>
-        <w:jc w:val="both"/>
-        <w:rPr>
-          <w:color w:val="auto"/>
-        </w:rPr>
-      </w:pPr>
-      <w:r>
-        <w:rPr>
-          <w:rFonts w:ascii="Times New Roman" w:hAnsi="Times New Roman"/>
-          <w:b w:val="0"/>
-          <w:i w:val="0"/>
-          <w:sz w:val="24"/>
-        </w:rPr>
-        <w:t>Cada una de las 22 electroválvulas K-Rain BSPT de 9V DC tipo latching requiere el siguiente procedimiento de configuración inicial. La conexión hidráulica consiste en instalar la electroválvula en serie con una llave de paso manual de respaldo de 1 ½". La conexión eléctrica consiste en unir los dos cables del solenoide (rojo positivo y negro negativo) al cable monofilar 20 AWG que llega del controlador BL-KR, respetando la polaridad indicada.</w:t>
-      </w:r>
-    </w:p>
-    <w:p>
-      <w:pPr>
-        <w:pStyle w:val="5"/>
-        <w:numPr>
-          <w:ilvl w:val="1"/>
-          <w:numId w:val="1"/>
-        </w:numPr>
-        <w:spacing w:line="360" w:lineRule="auto"/>
-        <w:jc w:val="both"/>
-        <w:rPr>
-          <w:color w:val="auto"/>
-        </w:rPr>
-      </w:pPr>
-      <w:r>
-        <w:rPr>
-          <w:rFonts w:ascii="Times New Roman" w:hAnsi="Times New Roman"/>
-          <w:b w:val="0"/>
-          <w:i w:val="0"/>
-          <w:sz w:val="24"/>
-        </w:rPr>
-        <w:t>Para garantizar la protección contra humedad, todos los empalmes se impermeabilizan envolviéndolos con cinta autovulcanizante de grado IP67. Posteriormente, se ejecuta el procedimiento de desenganche inicial: dado que algunos solenoides vienen de fábrica con el émbolo magnéticamente enganchado, se debe ejecutar desde la app K-RainBL la función "Test all stations" durante 2 segundos por cada estación. Esto despolariza el imán y deja la electroválvula en posición cerrada, lista para operar. Por último, se realiza la prueba funcional abriendo y cerrando manualmente cada estación desde la app, verificando el correcto flujo del agua hacia el sector correspondiente.</w:t>
-      </w:r>
-    </w:p>
-    <w:p>
-      <w:pPr>
-        <w:pStyle w:val="4"/>
-        <w:numPr>
-          <w:ilvl w:val="1"/>
-          <w:numId w:val="1"/>
-        </w:numPr>
-        <w:spacing w:line="360" w:lineRule="auto"/>
-        <w:jc w:val="left"/>
-        <w:rPr>
-          <w:color w:val="auto"/>
-        </w:rPr>
-      </w:pPr>
-      <w:r>
-        <w:rPr>
-          <w:rFonts w:ascii="Times New Roman" w:hAnsi="Times New Roman"/>
-          <w:b/>
-          <w:i w:val="0"/>
-          <w:sz w:val="28"/>
-        </w:rPr>
-        <w:t>3.6 Conexión entre el Usuario y los Equipos</w:t>
-      </w:r>
-    </w:p>
-    <w:p>
-      <w:pPr>
-        <w:pStyle w:val="4"/>
-        <w:numPr>
-          <w:ilvl w:val="1"/>
-          <w:numId w:val="1"/>
-        </w:numPr>
-        <w:spacing w:line="360" w:lineRule="auto"/>
-        <w:jc w:val="both"/>
-        <w:rPr>
-          <w:color w:val="auto"/>
-        </w:rPr>
-      </w:pPr>
-      <w:r>
-        <w:rPr>
-          <w:rFonts w:ascii="Times New Roman" w:hAnsi="Times New Roman"/>
-          <w:b w:val="0"/>
-          <w:i w:val="0"/>
-          <w:sz w:val="24"/>
-        </w:rPr>
-        <w:t>El sistema SARQUE utiliza dos canales de comunicación inalámbrica completamente independientes para conectar al usuario con los equipos del parque, cada uno con un propósito específico: el canal Bluetooth Low Energy (BLE) para la programación de los controladores y el canal Internet (HTTPS) para la plataforma web de visualización.</w:t>
-      </w:r>
-    </w:p>
-    <w:p>
-      <w:pPr>
-        <w:pStyle w:val="5"/>
-        <w:numPr>
-          <w:ilvl w:val="1"/>
-          <w:numId w:val="1"/>
-        </w:numPr>
-        <w:spacing w:line="360" w:lineRule="auto"/>
-        <w:jc w:val="left"/>
-        <w:rPr>
-          <w:color w:val="auto"/>
-        </w:rPr>
-      </w:pPr>
-      <w:r>
-        <w:rPr>
-          <w:rFonts w:ascii="Times New Roman" w:hAnsi="Times New Roman"/>
-          <w:b/>
-          <w:i w:val="0"/>
-          <w:sz w:val="26"/>
-        </w:rPr>
-        <w:t>3.6.1 Canal Bluetooth Low Energy (BLE) — Programación de los controladores</w:t>
-      </w:r>
-    </w:p>
-    <w:p>
-      <w:pPr>
-        <w:pStyle w:val="5"/>
-        <w:numPr>
-          <w:ilvl w:val="1"/>
-          <w:numId w:val="1"/>
-        </w:numPr>
-        <w:spacing w:line="360" w:lineRule="auto"/>
-        <w:jc w:val="both"/>
-        <w:rPr>
-          <w:color w:val="auto"/>
-        </w:rPr>
-      </w:pPr>
-      <w:r>
-        <w:rPr>
-          <w:rFonts w:ascii="Times New Roman" w:hAnsi="Times New Roman"/>
-          <w:b w:val="0"/>
-          <w:i w:val="0"/>
-          <w:sz w:val="24"/>
-        </w:rPr>
-        <w:t>La comunicación entre el smartphone del administrador y los 6 controladores K-Rain BL-KR se realiza exclusivamente mediante Bluetooth Smart 4.0 (Bluetooth Low Energy). Es importante destacar que NO se utiliza WiFi para esta comunicación. Esta decisión técnica se justifica por las siguientes razones: la señal WiFi del parque no cubre uniformemente las 5 hectáreas del predio; el BLE consume mucho menos energía que el WiFi, prolongando significativamente la duración de la batería 9V del controlador a aproximadamente un año de operación; el alcance típico del BLE de 10 a 30 metros es suficiente para que el administrador programe el controlador acercándose físicamente al equipo; y no se requiere infraestructura de red adicional en el parque, lo que reduce los costos de implementación.</w:t>
-      </w:r>
-    </w:p>
-    <w:p>
-      <w:pPr>
-        <w:pStyle w:val="5"/>
-        <w:numPr>
-          <w:ilvl w:val="1"/>
-          <w:numId w:val="1"/>
-        </w:numPr>
-        <w:spacing w:line="360" w:lineRule="auto"/>
-        <w:jc w:val="left"/>
-        <w:rPr>
-          <w:color w:val="auto"/>
-        </w:rPr>
-      </w:pPr>
-      <w:r>
-        <w:rPr>
-          <w:rFonts w:ascii="Times New Roman" w:hAnsi="Times New Roman"/>
-          <w:b/>
-          <w:i w:val="0"/>
-          <w:sz w:val="26"/>
-        </w:rPr>
-        <w:t>3.6.2 Canal Internet (HTTPS) — Plataforma web de gestión</w:t>
-      </w:r>
-    </w:p>
-    <w:p>
-      <w:pPr>
-        <w:pStyle w:val="5"/>
-        <w:numPr>
-          <w:ilvl w:val="1"/>
-          <w:numId w:val="1"/>
-        </w:numPr>
-        <w:spacing w:line="360" w:lineRule="auto"/>
-        <w:jc w:val="both"/>
-        <w:rPr>
-          <w:color w:val="auto"/>
-        </w:rPr>
-      </w:pPr>
-      <w:r>
-        <w:rPr>
-          <w:rFonts w:ascii="Times New Roman" w:hAnsi="Times New Roman"/>
-          <w:b w:val="0"/>
-          <w:i w:val="0"/>
-          <w:sz w:val="24"/>
-        </w:rPr>
-        <w:t>La plataforma web SARQUE, en cambio, sí requiere conexión a internet (sea mediante WiFi o mediante datos móviles del smartphone) porque su contenido se aloja en la nube de Supabase y se sirve a través de los servidores de Lovable. Cuando un usuario accede a la URL de SARQUE desde su navegador, se establece una sesión HTTPS encriptada con el backend, que permite: consultar el cronograma de riego desde cualquier ubicación geográfica, sin necesidad de estar físicamente en el parque; visualizar el sector activo en tiempo real según la hora del navegador; editar sectores y horarios desde cualquier dispositivo (teléfono, tablet o computadora); y generar reportes simulados de consumo hídrico.</w:t>
-      </w:r>
-    </w:p>
-    <w:p>
-      <w:pPr>
-        <w:pStyle w:val="5"/>
-        <w:numPr>
-          <w:ilvl w:val="1"/>
-          <w:numId w:val="1"/>
-        </w:numPr>
-        <w:spacing w:line="360" w:lineRule="auto"/>
-        <w:jc w:val="both"/>
-        <w:rPr>
-          <w:color w:val="auto"/>
-        </w:rPr>
-      </w:pPr>
-      <w:r>
-        <w:rPr>
-          <w:rFonts w:ascii="Times New Roman" w:hAnsi="Times New Roman"/>
-          <w:b w:val="0"/>
-          <w:i w:val="0"/>
-          <w:sz w:val="24"/>
-        </w:rPr>
-        <w:t>Es importante destacar que el canal BLE (programación) y el canal Internet (visualización) son completamente independientes: la plataforma web no controla directamente las electroválvulas. La programación efectiva del riego se realiza en cada controlador BL-KR mediante la app oficial K-RainBL del fabricante, mientras que la plataforma web SARQUE actúa como un sistema de documentación digital y visualización del cronograma.</w:t>
-      </w:r>
-    </w:p>
-    <w:p>
-      <w:pPr>
-        <w:pStyle w:val="4"/>
-        <w:numPr>
-          <w:ilvl w:val="1"/>
-          <w:numId w:val="1"/>
-        </w:numPr>
-        <w:spacing w:line="360" w:lineRule="auto"/>
-        <w:jc w:val="left"/>
-        <w:rPr>
-          <w:color w:val="auto"/>
-        </w:rPr>
-      </w:pPr>
-      <w:r>
-        <w:rPr>
-          <w:rFonts w:ascii="Times New Roman" w:hAnsi="Times New Roman"/>
-          <w:b/>
-          <w:i w:val="0"/>
-          <w:sz w:val="28"/>
-        </w:rPr>
-        <w:t>3.7 Evidencia del Trabajo de Instalación en Campo</w:t>
-      </w:r>
-    </w:p>
-    <w:p>
-      <w:pPr>
-        <w:pStyle w:val="4"/>
-        <w:numPr>
-          <w:ilvl w:val="1"/>
-          <w:numId w:val="1"/>
-        </w:numPr>
-        <w:spacing w:line="360" w:lineRule="auto"/>
-        <w:jc w:val="both"/>
-        <w:rPr>
-          <w:color w:val="auto"/>
-        </w:rPr>
-      </w:pPr>
-      <w:r>
-        <w:rPr>
-          <w:rFonts w:ascii="Times New Roman" w:hAnsi="Times New Roman"/>
-          <w:b w:val="0"/>
-          <w:i w:val="0"/>
-          <w:sz w:val="24"/>
-        </w:rPr>
-        <w:t>A continuación se presentan las evidencias fotográficas del trabajo manual realizado para la instalación del sistema SARQUE en el predio del parque. Las fotografías más representativas se incluyen en esta sección; el catálogo completo de fotografías del proceso de instalación se encuentra en el Anexo B — Galería Fotográfica Complementaria.</w:t>
-      </w:r>
-    </w:p>
-    <w:p>
-      <w:pPr>
-        <w:pStyle w:val="5"/>
-        <w:numPr>
-          <w:ilvl w:val="1"/>
-          <w:numId w:val="1"/>
-        </w:numPr>
-        <w:spacing w:line="360" w:lineRule="auto"/>
-        <w:jc w:val="left"/>
-        <w:rPr>
-          <w:color w:val="auto"/>
-        </w:rPr>
-      </w:pPr>
-      <w:r>
-        <w:rPr>
-          <w:rFonts w:ascii="Times New Roman" w:hAnsi="Times New Roman"/>
-          <w:b/>
-          <w:i w:val="0"/>
-          <w:sz w:val="26"/>
-        </w:rPr>
-        <w:t>3.7.1 Excavación de zanjas para la red hidráulica y de control</w:t>
-      </w:r>
-    </w:p>
-    <w:p>
-      <w:pPr>
-        <w:pStyle w:val="5"/>
-        <w:numPr>
-          <w:ilvl w:val="1"/>
-          <w:numId w:val="1"/>
-        </w:numPr>
-        <w:spacing w:line="360" w:lineRule="auto"/>
-        <w:jc w:val="both"/>
-        <w:rPr>
-          <w:color w:val="auto"/>
-        </w:rPr>
-      </w:pPr>
-      <w:r>
-        <w:rPr>
-          <w:rFonts w:ascii="Times New Roman" w:hAnsi="Times New Roman"/>
-          <w:b w:val="0"/>
-          <w:i w:val="0"/>
-          <w:sz w:val="24"/>
-        </w:rPr>
-        <w:t>La instalación del sistema requirió la excavación manual de aproximadamente 570 metros lineales de zanjas. Las zanjas para la matriz principal de PVC 2" se excavaron a una profundidad de 30 centímetros, mientras que las zanjas para las cuelleras de PVC 1 ½" y el politubo de cable de 3/4" se excavaron a 20-25 centímetros de profundidad, ejecutándose paralelas a las zanjas hidráulicas para minimizar el desgaste sobre el césped existente.</w:t>
-      </w:r>
-    </w:p>
-    <w:p>
-      <w:pPr>
-        <w:pStyle w:val="5"/>
-        <w:numPr>
-          <w:ilvl w:val="1"/>
-          <w:numId w:val="1"/>
-        </w:numPr>
-        <w:spacing w:line="360" w:lineRule="auto"/>
-        <w:jc w:val="center"/>
-        <w:rPr>
-          <w:color w:val="auto"/>
-        </w:rPr>
-      </w:pPr>
-      <w:r>
-        <w:rPr>
-          <w:rFonts w:ascii="Times New Roman" w:hAnsi="Times New Roman"/>
-          <w:b/>
-          <w:i w:val="0"/>
-          <w:sz w:val="22"/>
-        </w:rPr>
-        <w:t>Figura. Excavación manual de zanjas para el tendido del politubo</w:t>
-      </w:r>
-    </w:p>
-    <w:p>
-      <w:pPr>
-        <w:pStyle w:val="5"/>
-        <w:numPr>
-          <w:ilvl w:val="1"/>
-          <w:numId w:val="1"/>
-        </w:numPr>
-        <w:spacing w:line="360" w:lineRule="auto"/>
-        <w:jc w:val="center"/>
-        <w:rPr>
-          <w:color w:val="auto"/>
-        </w:rPr>
-      </w:pPr>
-      <w:r>
-        <w:rPr>
-          <w:rFonts w:ascii="Times New Roman" w:hAnsi="Times New Roman"/>
-          <w:b w:val="0"/>
-          <w:i/>
-          <w:sz w:val="22"/>
-        </w:rPr>
-        <w:t>[Insertar aquí la fotografía de la excavación]</w:t>
-      </w:r>
-    </w:p>
-    <w:p>
-      <w:pPr>
-        <w:pStyle w:val="5"/>
-        <w:numPr>
-          <w:ilvl w:val="1"/>
-          <w:numId w:val="1"/>
-        </w:numPr>
-        <w:spacing w:line="360" w:lineRule="auto"/>
-        <w:jc w:val="center"/>
-        <w:rPr>
-          <w:color w:val="auto"/>
-        </w:rPr>
-      </w:pPr>
-      <w:r>
-        <w:rPr>
-          <w:rFonts w:ascii="Times New Roman" w:hAnsi="Times New Roman"/>
-          <w:b w:val="0"/>
-          <w:i/>
-          <w:sz w:val="20"/>
-        </w:rPr>
-        <w:t>Fuente: Fotografía del trabajo en campo, 2026.</w:t>
-      </w:r>
-    </w:p>
-    <w:p>
-      <w:pPr>
-        <w:pStyle w:val="5"/>
-        <w:numPr>
-          <w:ilvl w:val="1"/>
-          <w:numId w:val="1"/>
-        </w:numPr>
-        <w:spacing w:line="360" w:lineRule="auto"/>
-        <w:jc w:val="left"/>
-        <w:rPr>
-          <w:color w:val="auto"/>
-        </w:rPr>
-      </w:pPr>
-      <w:r>
-        <w:rPr>
-          <w:rFonts w:ascii="Times New Roman" w:hAnsi="Times New Roman"/>
-          <w:b/>
-          <w:i w:val="0"/>
-          <w:sz w:val="26"/>
-        </w:rPr>
-        <w:t>3.7.2 Instalación de electroválvulas K-Rain BSPT en cajas de hormigón</w:t>
-      </w:r>
-    </w:p>
-    <w:p>
-      <w:pPr>
-        <w:pStyle w:val="5"/>
-        <w:numPr>
-          <w:ilvl w:val="1"/>
-          <w:numId w:val="1"/>
-        </w:numPr>
-        <w:spacing w:line="360" w:lineRule="auto"/>
-        <w:jc w:val="both"/>
-        <w:rPr>
-          <w:color w:val="auto"/>
-        </w:rPr>
-      </w:pPr>
-      <w:r>
-        <w:rPr>
-          <w:rFonts w:ascii="Times New Roman" w:hAnsi="Times New Roman"/>
-          <w:b w:val="0"/>
-          <w:i w:val="0"/>
-          <w:sz w:val="24"/>
-        </w:rPr>
-        <w:t>Cada una de las 22 electroválvulas se instaló dentro de una caja de hormigón armado de 40 × 40 × 30 centímetros fabricada en sitio. La electroválvula se conectó en serie con una llave de paso manual de respaldo de color rojo para permitir el corte manual del agua en caso de mantenimiento del sistema.</w:t>
-      </w:r>
-    </w:p>
-    <w:p>
-      <w:pPr>
-        <w:pStyle w:val="5"/>
-        <w:numPr>
-          <w:ilvl w:val="1"/>
-          <w:numId w:val="1"/>
-        </w:numPr>
-        <w:spacing w:line="360" w:lineRule="auto"/>
-        <w:jc w:val="center"/>
-        <w:rPr>
-          <w:color w:val="auto"/>
-        </w:rPr>
-      </w:pPr>
-      <w:r>
-        <w:rPr>
-          <w:rFonts w:ascii="Times New Roman" w:hAnsi="Times New Roman"/>
-          <w:b/>
-          <w:i w:val="0"/>
-          <w:sz w:val="22"/>
-        </w:rPr>
-        <w:t>Figura. Electroválvula K-Rain BSPT 9V DC instalada en caja de hormigón</w:t>
-      </w:r>
-    </w:p>
-    <w:p>
-      <w:pPr>
-        <w:pStyle w:val="5"/>
-        <w:numPr>
-          <w:ilvl w:val="1"/>
-          <w:numId w:val="1"/>
-        </w:numPr>
-        <w:spacing w:line="360" w:lineRule="auto"/>
-        <w:jc w:val="center"/>
-        <w:rPr>
-          <w:color w:val="auto"/>
-        </w:rPr>
-      </w:pPr>
-      <w:r>
-        <w:rPr>
-          <w:rFonts w:ascii="Times New Roman" w:hAnsi="Times New Roman"/>
-          <w:b w:val="0"/>
-          <w:i/>
-          <w:sz w:val="22"/>
-        </w:rPr>
-        <w:t>[Insertar aquí la fotografía de la electroválvula]</w:t>
-      </w:r>
-    </w:p>
-    <w:p>
-      <w:pPr>
-        <w:pStyle w:val="5"/>
-        <w:numPr>
-          <w:ilvl w:val="1"/>
-          <w:numId w:val="1"/>
-        </w:numPr>
-        <w:spacing w:line="360" w:lineRule="auto"/>
-        <w:jc w:val="center"/>
-        <w:rPr>
-          <w:color w:val="auto"/>
-        </w:rPr>
-      </w:pPr>
-      <w:r>
-        <w:rPr>
-          <w:rFonts w:ascii="Times New Roman" w:hAnsi="Times New Roman"/>
-          <w:b w:val="0"/>
-          <w:i/>
-          <w:sz w:val="20"/>
-        </w:rPr>
-        <w:t>Fuente: Fotografía del trabajo en campo, 2026.</w:t>
-      </w:r>
-    </w:p>
-    <w:p>
-      <w:pPr>
-        <w:pStyle w:val="5"/>
-        <w:numPr>
-          <w:ilvl w:val="1"/>
-          <w:numId w:val="1"/>
-        </w:numPr>
-        <w:spacing w:line="360" w:lineRule="auto"/>
-        <w:jc w:val="left"/>
-        <w:rPr>
-          <w:color w:val="auto"/>
-        </w:rPr>
-      </w:pPr>
-      <w:r>
-        <w:rPr>
-          <w:rFonts w:ascii="Times New Roman" w:hAnsi="Times New Roman"/>
-          <w:b/>
-          <w:i w:val="0"/>
-          <w:sz w:val="26"/>
-        </w:rPr>
-        <w:t>3.7.3 Cableado y empalmes impermeabilizados</w:t>
-      </w:r>
-    </w:p>
-    <w:p>
-      <w:pPr>
-        <w:pStyle w:val="5"/>
-        <w:numPr>
-          <w:ilvl w:val="1"/>
-          <w:numId w:val="1"/>
-        </w:numPr>
-        <w:spacing w:line="360" w:lineRule="auto"/>
-        <w:jc w:val="both"/>
-        <w:rPr>
-          <w:color w:val="auto"/>
-        </w:rPr>
-      </w:pPr>
-      <w:r>
-        <w:rPr>
-          <w:rFonts w:ascii="Times New Roman" w:hAnsi="Times New Roman"/>
-          <w:b w:val="0"/>
-          <w:i w:val="0"/>
-          <w:sz w:val="24"/>
-        </w:rPr>
-        <w:t>El cable monofilar 20 AWG se tendió dentro de un politubo negro de polietileno de 3/4" de diámetro para protección mecánica. Los empalmes entre el cable que viene del controlador y los terminales del solenoide se realizaron con conectores impermeabilizados mediante cinta autovulcanizante, garantizando un aislamiento IP67 dentro de las cajas de hormigón armado.</w:t>
-      </w:r>
-    </w:p>
-    <w:p>
-      <w:pPr>
-        <w:pStyle w:val="5"/>
-        <w:numPr>
-          <w:ilvl w:val="1"/>
-          <w:numId w:val="1"/>
-        </w:numPr>
-        <w:spacing w:line="360" w:lineRule="auto"/>
-        <w:jc w:val="center"/>
-        <w:rPr>
-          <w:color w:val="auto"/>
-        </w:rPr>
-      </w:pPr>
-      <w:r>
-        <w:rPr>
-          <w:rFonts w:ascii="Times New Roman" w:hAnsi="Times New Roman"/>
-          <w:b/>
-          <w:i w:val="0"/>
-          <w:sz w:val="22"/>
-        </w:rPr>
-        <w:t>Figura. Empalmes impermeabilizados del cableado de control</w:t>
-      </w:r>
-    </w:p>
-    <w:p>
-      <w:pPr>
-        <w:pStyle w:val="5"/>
-        <w:numPr>
-          <w:ilvl w:val="1"/>
-          <w:numId w:val="1"/>
-        </w:numPr>
-        <w:spacing w:line="360" w:lineRule="auto"/>
-        <w:jc w:val="center"/>
-        <w:rPr>
-          <w:color w:val="auto"/>
-        </w:rPr>
-      </w:pPr>
-      <w:r>
-        <w:rPr>
-          <w:rFonts w:ascii="Times New Roman" w:hAnsi="Times New Roman"/>
-          <w:b w:val="0"/>
-          <w:i/>
-          <w:sz w:val="22"/>
-        </w:rPr>
-        <w:t>[Insertar aquí la fotografía de los empalmes]</w:t>
-      </w:r>
-    </w:p>
-    <w:p>
-      <w:pPr>
-        <w:pStyle w:val="5"/>
-        <w:numPr>
-          <w:ilvl w:val="1"/>
-          <w:numId w:val="1"/>
-        </w:numPr>
-        <w:spacing w:line="360" w:lineRule="auto"/>
-        <w:jc w:val="center"/>
-        <w:rPr>
-          <w:color w:val="auto"/>
-        </w:rPr>
-      </w:pPr>
-      <w:r>
-        <w:rPr>
-          <w:rFonts w:ascii="Times New Roman" w:hAnsi="Times New Roman"/>
-          <w:b w:val="0"/>
-          <w:i/>
-          <w:sz w:val="20"/>
-        </w:rPr>
-        <w:t>Fuente: Fotografía del trabajo en campo, 2026.</w:t>
-      </w:r>
-    </w:p>
-    <w:p>
-      <w:pPr>
-        <w:pStyle w:val="5"/>
-        <w:numPr>
-          <w:ilvl w:val="1"/>
-          <w:numId w:val="1"/>
-        </w:numPr>
-        <w:spacing w:line="360" w:lineRule="auto"/>
-        <w:jc w:val="left"/>
-        <w:rPr>
-          <w:color w:val="auto"/>
-        </w:rPr>
-      </w:pPr>
-      <w:r>
-        <w:rPr>
-          <w:rFonts w:ascii="Times New Roman" w:hAnsi="Times New Roman"/>
-          <w:b/>
-          <w:i w:val="0"/>
-          <w:sz w:val="26"/>
-        </w:rPr>
-        <w:t>3.7.4 Caseta de bomba y conexión a la red hidráulica principal</w:t>
-      </w:r>
-    </w:p>
-    <w:p>
-      <w:pPr>
-        <w:pStyle w:val="5"/>
-        <w:numPr>
-          <w:ilvl w:val="1"/>
-          <w:numId w:val="1"/>
-        </w:numPr>
-        <w:spacing w:line="360" w:lineRule="auto"/>
-        <w:jc w:val="both"/>
-        <w:rPr>
-          <w:color w:val="auto"/>
-        </w:rPr>
-      </w:pPr>
-      <w:r>
-        <w:rPr>
-          <w:rFonts w:ascii="Times New Roman" w:hAnsi="Times New Roman"/>
-          <w:b w:val="0"/>
-          <w:i w:val="0"/>
-          <w:sz w:val="24"/>
-        </w:rPr>
-        <w:t>La salida de la bomba sumergible Grundfos de 5 HP se conectó a la matriz principal de PVC 2" mediante una válvula check, un manómetro de presión analógico y el tanque hidroneumático que estabiliza la presión entre 3.5 y 4.0 bar. Esta configuración optimiza el régimen de operación de la bomba, reduciendo la cantidad de arranques y paradas y prolongando significativamente la vida útil del motor eléctrico.</w:t>
-      </w:r>
-    </w:p>
-    <w:p>
-      <w:pPr>
-        <w:pStyle w:val="5"/>
-        <w:numPr>
-          <w:ilvl w:val="1"/>
-          <w:numId w:val="1"/>
-        </w:numPr>
-        <w:spacing w:line="360" w:lineRule="auto"/>
-        <w:jc w:val="center"/>
-        <w:rPr>
-          <w:color w:val="auto"/>
-        </w:rPr>
-      </w:pPr>
-      <w:r>
-        <w:rPr>
-          <w:rFonts w:ascii="Times New Roman" w:hAnsi="Times New Roman"/>
-          <w:b/>
-          <w:i w:val="0"/>
-          <w:sz w:val="22"/>
-        </w:rPr>
-        <w:t>Figura. Caseta de bombeo con tanque hidroneumático y manómetro</w:t>
-      </w:r>
-    </w:p>
-    <w:p>
-      <w:pPr>
-        <w:pStyle w:val="5"/>
-        <w:numPr>
-          <w:ilvl w:val="1"/>
-          <w:numId w:val="1"/>
-        </w:numPr>
-        <w:spacing w:line="360" w:lineRule="auto"/>
-        <w:jc w:val="center"/>
-        <w:rPr>
-          <w:color w:val="auto"/>
-        </w:rPr>
-      </w:pPr>
-      <w:r>
-        <w:rPr>
-          <w:rFonts w:ascii="Times New Roman" w:hAnsi="Times New Roman"/>
-          <w:b w:val="0"/>
-          <w:i/>
-          <w:sz w:val="22"/>
-        </w:rPr>
-        <w:t>[Insertar aquí la fotografía de la caseta]</w:t>
-      </w:r>
-    </w:p>
-    <w:p>
-      <w:pPr>
-        <w:pStyle w:val="5"/>
-        <w:numPr>
-          <w:ilvl w:val="1"/>
-          <w:numId w:val="1"/>
-        </w:numPr>
-        <w:spacing w:line="360" w:lineRule="auto"/>
-        <w:jc w:val="center"/>
-        <w:rPr>
-          <w:color w:val="auto"/>
-        </w:rPr>
-      </w:pPr>
-      <w:r>
-        <w:rPr>
-          <w:rFonts w:ascii="Times New Roman" w:hAnsi="Times New Roman"/>
-          <w:b w:val="0"/>
-          <w:i/>
-          <w:sz w:val="20"/>
-        </w:rPr>
-        <w:t>Fuente: Fotografía del trabajo en campo, 2026.</w:t>
-      </w:r>
-    </w:p>
-    <w:p>
-      <w:pPr>
         <w:pStyle w:val="46"/>
         <w:numPr>
           <w:ilvl w:val="1"/>
@@ -4178,270 +2933,6 @@
           <w:color w:val="auto"/>
         </w:rPr>
         <w:t>ANEXO B — GALERÍA FOTOGRÁFICA DE LA INSTALACIÓN</w:t>
-      </w:r>
-    </w:p>
-    <w:p>
-      <w:pPr>
-        <w:numPr>
-          <w:ilvl w:val="0"/>
-          <w:numId w:val="1"/>
-        </w:numPr>
-        <w:spacing w:line="360" w:lineRule="auto"/>
-        <w:jc w:val="both"/>
-        <w:rPr>
-          <w:color w:val="auto"/>
-        </w:rPr>
-      </w:pPr>
-      <w:r>
-        <w:rPr>
-          <w:rFonts w:ascii="Times New Roman" w:hAnsi="Times New Roman"/>
-          <w:b w:val="0"/>
-          <w:i w:val="0"/>
-          <w:sz w:val="24"/>
-        </w:rPr>
-        <w:t>Bluetooth Low Energy (BLE), comercialmente denominado Bluetooth Smart, es una variante del estándar Bluetooth introducida en la versión 4.0 del protocolo en el año 2010 por el Bluetooth Special Interest Group (SIG). A diferencia del Bluetooth clásico (BR/EDR), que fue diseñado para aplicaciones de transmisión continua de datos como audio o transferencia de archivos, BLE está optimizado para la comunicación intermitente de pequeños volúmenes de datos entre dispositivos alimentados por batería.</w:t>
-      </w:r>
-    </w:p>
-    <w:p>
-      <w:pPr>
-        <w:numPr>
-          <w:ilvl w:val="0"/>
-          <w:numId w:val="1"/>
-        </w:numPr>
-        <w:spacing w:line="360" w:lineRule="auto"/>
-        <w:jc w:val="both"/>
-        <w:rPr>
-          <w:color w:val="auto"/>
-        </w:rPr>
-      </w:pPr>
-      <w:r>
-        <w:rPr>
-          <w:rFonts w:ascii="Times New Roman" w:hAnsi="Times New Roman"/>
-          <w:b w:val="0"/>
-          <w:i w:val="0"/>
-          <w:sz w:val="24"/>
-        </w:rPr>
-        <w:t>Las principales diferencias técnicas entre Bluetooth clásico y Bluetooth Low Energy se resumen en la siguiente comparación:</w:t>
-      </w:r>
-    </w:p>
-    <w:p>
-      <w:pPr>
-        <w:numPr>
-          <w:ilvl w:val="0"/>
-          <w:numId w:val="1"/>
-        </w:numPr>
-        <w:spacing w:line="360" w:lineRule="auto"/>
-        <w:jc w:val="both"/>
-        <w:rPr>
-          <w:color w:val="auto"/>
-        </w:rPr>
-      </w:pPr>
-      <w:r>
-        <w:rPr>
-          <w:rFonts w:ascii="Times New Roman" w:hAnsi="Times New Roman"/>
-          <w:b/>
-          <w:i w:val="0"/>
-          <w:sz w:val="24"/>
-        </w:rPr>
-        <w:t>Tabla — Comparativa entre Bluetooth Clásico y Bluetooth Low Energy:</w:t>
-      </w:r>
-    </w:p>
-    <w:p>
-      <w:pPr>
-        <w:numPr>
-          <w:ilvl w:val="0"/>
-          <w:numId w:val="1"/>
-        </w:numPr>
-        <w:spacing w:line="360" w:lineRule="auto"/>
-        <w:jc w:val="both"/>
-        <w:rPr>
-          <w:color w:val="auto"/>
-        </w:rPr>
-      </w:pPr>
-      <w:r>
-        <w:rPr>
-          <w:rFonts w:ascii="Times New Roman" w:hAnsi="Times New Roman"/>
-          <w:b w:val="0"/>
-          <w:i w:val="0"/>
-          <w:sz w:val="24"/>
-        </w:rPr>
-        <w:t>BLE opera en la banda ISM de 2.4 GHz, utilizando 40 canales de 2 MHz de ancho de banda cada uno. De estos, 3 canales (37, 38 y 39) están reservados para el envío de paquetes de anuncio (advertising), mientras que los 37 restantes se utilizan para la transmisión de datos durante una conexión establecida. La modulación empleada es GFSK (Gaussian Frequency-Shift Keying) con un índice de modulación de 0.5, lo que proporciona una buena tolerancia a las interferencias.</w:t>
-      </w:r>
-    </w:p>
-    <w:p>
-      <w:pPr>
-        <w:numPr>
-          <w:ilvl w:val="0"/>
-          <w:numId w:val="1"/>
-        </w:numPr>
-        <w:spacing w:line="360" w:lineRule="auto"/>
-        <w:jc w:val="both"/>
-        <w:rPr>
-          <w:color w:val="auto"/>
-        </w:rPr>
-      </w:pPr>
-      <w:r>
-        <w:rPr>
-          <w:rFonts w:ascii="Times New Roman" w:hAnsi="Times New Roman"/>
-          <w:b w:val="0"/>
-          <w:i w:val="0"/>
-          <w:sz w:val="24"/>
-        </w:rPr>
-        <w:t>El alcance típico de BLE en condiciones ideales (espacio abierto, sin obstáculos) es de 10 a 30 metros, aunque las variantes más recientes (Bluetooth 5.0 y 5.2) han ampliado este rango hasta 100-400 metros mediante mejoras en la sensibilidad del receptor y técnicas de codificación. En presencia de obstáculos físicos como vegetación densa, muros de hormigón o cuerpos humanos, el alcance se reduce significativamente debido a la atenuación de la señal en la banda de 2.4 GHz.</w:t>
-      </w:r>
-    </w:p>
-    <w:p>
-      <w:pPr>
-        <w:numPr>
-          <w:ilvl w:val="0"/>
-          <w:numId w:val="1"/>
-        </w:numPr>
-        <w:spacing w:line="360" w:lineRule="auto"/>
-        <w:jc w:val="both"/>
-        <w:rPr>
-          <w:color w:val="auto"/>
-        </w:rPr>
-      </w:pPr>
-      <w:r>
-        <w:rPr>
-          <w:rFonts w:ascii="Times New Roman" w:hAnsi="Times New Roman"/>
-          <w:b w:val="0"/>
-          <w:i w:val="0"/>
-          <w:sz w:val="24"/>
-        </w:rPr>
-        <w:t>El modelo de comunicación BLE distingue dos roles principales: el dispositivo Central (master), que inicia las conexiones y consulta datos, y el dispositivo Periférico (slave), que anuncia su presencia y responde a las solicitudes del Central. En el contexto del proyecto SARQUE, el smartphone del administrador del parque actúa como Central, mientras que cada controlador K-Rain BL-KR actúa como Periférico. La transmisión de datos entre ambos sigue el Perfil de Atributos Genéricos (GATT), una capa de aplicación que define cómo los dispositivos exponen sus datos en forma de Servicios y Características.</w:t>
-      </w:r>
-    </w:p>
-    <w:p>
-      <w:pPr>
-        <w:numPr>
-          <w:ilvl w:val="0"/>
-          <w:numId w:val="1"/>
-        </w:numPr>
-        <w:spacing w:line="360" w:lineRule="auto"/>
-        <w:jc w:val="both"/>
-        <w:rPr>
-          <w:color w:val="auto"/>
-        </w:rPr>
-      </w:pPr>
-      <w:r>
-        <w:rPr>
-          <w:rFonts w:ascii="Times New Roman" w:hAnsi="Times New Roman"/>
-          <w:b w:val="0"/>
-          <w:i w:val="0"/>
-          <w:sz w:val="24"/>
-        </w:rPr>
-        <w:t>El consumo energético de BLE es uno de sus principales atractivos para aplicaciones de IoT. Un dispositivo periférico BLE en modo de bajo consumo (sleep) consume típicamente entre 1 y 10 µA, mientras que durante la transmisión activa el consumo alcanza 15-20 mA durante intervalos de milisegundos. Esto permite que dispositivos alimentados por baterías de tipo botón o pilas alcalinas estándar operen durante meses o incluso años sin necesidad de reemplazo. (Townsend, Cufí, Akiba y Davidson, 2014)</w:t>
-      </w:r>
-    </w:p>
-    <w:p>
-      <w:pPr>
-        <w:numPr>
-          <w:ilvl w:val="0"/>
-          <w:numId w:val="1"/>
-        </w:numPr>
-        <w:spacing w:line="360" w:lineRule="auto"/>
-        <w:jc w:val="both"/>
-        <w:rPr>
-          <w:color w:val="auto"/>
-        </w:rPr>
-      </w:pPr>
-      <w:r>
-        <w:rPr>
-          <w:rFonts w:ascii="Times New Roman" w:hAnsi="Times New Roman"/>
-          <w:b w:val="0"/>
-          <w:i w:val="0"/>
-          <w:sz w:val="24"/>
-        </w:rPr>
-        <w:t>Supabase es una plataforma de backend como servicio (BaaS, Backend-as-a-Service) de código abierto, lanzada en 2020 por Paul Copplestone y Anthony Wilson como una alternativa libre y autoalojable a Firebase de Google. La plataforma proporciona, en una única interfaz integrada, los servicios fundamentales requeridos por la mayoría de las aplicaciones web modernas: base de datos relacional, autenticación de usuarios, almacenamiento de archivos, funciones serverless (Edge Functions), suscripciones en tiempo real y una API REST autogenerada.</w:t>
-      </w:r>
-    </w:p>
-    <w:p>
-      <w:pPr>
-        <w:numPr>
-          <w:ilvl w:val="0"/>
-          <w:numId w:val="1"/>
-        </w:numPr>
-        <w:spacing w:line="360" w:lineRule="auto"/>
-        <w:jc w:val="both"/>
-        <w:rPr>
-          <w:color w:val="auto"/>
-        </w:rPr>
-      </w:pPr>
-      <w:r>
-        <w:rPr>
-          <w:rFonts w:ascii="Times New Roman" w:hAnsi="Times New Roman"/>
-          <w:b w:val="0"/>
-          <w:i w:val="0"/>
-          <w:sz w:val="24"/>
-        </w:rPr>
-        <w:t>A diferencia de otras plataformas BaaS que utilizan bases de datos no relacionales propietarias, Supabase se construye sobre PostgreSQL, el sistema de gestión de bases de datos relacionales (RDBMS) de código abierto más avanzado y estable disponible en la actualidad. Esto significa que los desarrolladores pueden aprovechar todas las funcionalidades nativas de PostgreSQL: transacciones ACID, vistas materializadas, procedimientos almacenados en PL/pgSQL, tipos de datos avanzados (JSON, arrays, rangos), índices GIN/GiST, replicación lógica y herramientas de migración estándar.</w:t>
-      </w:r>
-    </w:p>
-    <w:p>
-      <w:pPr>
-        <w:numPr>
-          <w:ilvl w:val="0"/>
-          <w:numId w:val="1"/>
-        </w:numPr>
-        <w:spacing w:line="360" w:lineRule="auto"/>
-        <w:jc w:val="both"/>
-        <w:rPr>
-          <w:color w:val="auto"/>
-        </w:rPr>
-      </w:pPr>
-      <w:r>
-        <w:rPr>
-          <w:rFonts w:ascii="Times New Roman" w:hAnsi="Times New Roman"/>
-          <w:b w:val="0"/>
-          <w:i w:val="0"/>
-          <w:sz w:val="24"/>
-        </w:rPr>
-        <w:t>Una de las características distintivas de Supabase es la generación automática de una API REST a partir del esquema de la base de datos. Esta funcionalidad se implementa mediante PostgREST, una herramienta de código abierto desarrollada por Joe Nelson que expone tablas, vistas y funciones de PostgreSQL como endpoints HTTP estándar, con soporte para operaciones CRUD, paginación, filtrado, ordenamiento y búsqueda de texto completo. PostgREST traduce cada solicitud HTTP a una consulta SQL nativa, lo que garantiza un rendimiento óptimo sin la sobrecarga de un ORM (Object-Relational Mapper).</w:t>
-      </w:r>
-    </w:p>
-    <w:p>
-      <w:pPr>
-        <w:numPr>
-          <w:ilvl w:val="0"/>
-          <w:numId w:val="1"/>
-        </w:numPr>
-        <w:spacing w:line="360" w:lineRule="auto"/>
-        <w:jc w:val="both"/>
-        <w:rPr>
-          <w:color w:val="auto"/>
-        </w:rPr>
-      </w:pPr>
-      <w:r>
-        <w:rPr>
-          <w:rFonts w:ascii="Times New Roman" w:hAnsi="Times New Roman"/>
-          <w:b w:val="0"/>
-          <w:i w:val="0"/>
-          <w:sz w:val="24"/>
-        </w:rPr>
-        <w:t>La autenticación de usuarios en Supabase se gestiona mediante un servicio dedicado denominado GoTrue, que implementa el estándar JWT (JSON Web Tokens) según la especificación RFC 7519. Cuando un usuario inicia sesión correctamente, el servidor genera un token JWT firmado criptográficamente que contiene la identidad del usuario, su rol y los permisos correspondientes; este token se envía al cliente y se incluye en cada solicitud posterior a la API en el encabezado Authorization. Supabase soporta múltiples métodos de autenticación: correo y contraseña, magic links (enlaces mágicos por email), OAuth con proveedores externos (Google, GitHub, Facebook, etc.) y phone-based authentication mediante SMS. (Supabase Documentation, 2024)</w:t>
-      </w:r>
-    </w:p>
-    <w:p>
-      <w:pPr>
-        <w:numPr>
-          <w:ilvl w:val="0"/>
-          <w:numId w:val="1"/>
-        </w:numPr>
-        <w:spacing w:line="360" w:lineRule="auto"/>
-        <w:jc w:val="both"/>
-        <w:rPr>
-          <w:color w:val="auto"/>
-        </w:rPr>
-      </w:pPr>
-      <w:r>
-        <w:rPr>
-          <w:rFonts w:ascii="Times New Roman" w:hAnsi="Times New Roman"/>
-          <w:b w:val="0"/>
-          <w:i w:val="0"/>
-          <w:sz w:val="24"/>
-        </w:rPr>
-        <w:t>Las suscripciones en tiempo real (Realtime) de Supabase permiten a los clientes recibir notificaciones instantáneas cuando los datos de una tabla cambian, utilizando el protocolo WebSocket sobre conexiones HTTPS. Esta funcionalidad se implementa mediante el servicio Realtime de Phoenix Channels, que escucha el log de replicación lógica de PostgreSQL y propaga los eventos INSERT, UPDATE y DELETE hacia los clientes suscritos. En el proyecto SARQUE, esta característica permitirá futuras mejoras como la actualización automática del Dashboard sin necesidad de recargar la página.</w:t>
       </w:r>
     </w:p>
     <w:bookmarkEnd w:id="1"/>
@@ -4534,7 +3025,7 @@
         <w:rPr>
           <w:color w:val="auto"/>
         </w:rPr>
-        <w:t>SARQUE es un sistema automatizado de riego desarrollado para el Parque Ecoturístico Quinta Estación, un espacio verde de 5 hectáreas ubicado en Cochabamba, Bolivia, que comprende más de 20 sectores de vegetación diferenciada. El sistema integra 6 controladores Bluetooth K-Rain BL-KR (2 unidades BL-KR2, 3 unidades BL-KR4 y 1 unidad BL-KR6, totalizando 22 estaciones) con electroválvulas K-Rain BSPT de 9 V DC tipo latching, una bomba sumergible Grundfos de 5 HP con tanque hidroneumático y una red hidráulica de tuberías PVC de 2” y 1 ½”. El sistema reemplaza el control manual de 41 puntos de riego dispersos en el parque por 22 electroválvulas distribuidas estratégicamente, programadas a través de la aplicación móvil K-RainBL mediante conexión Bluetooth Low Energy. Como componente complementario académico, se desarrolló una plataforma web SARQUE en React + TypeScript con backend en Supabase, que centraliza la documentación digital del sistema: catálogo de sectores, registro de los 6 controladores y sus 22 estaciones asignadas, y cronograma semanal de riego, reemplazando el documento físico utilizado anteriormente por la administración del parque. El trabajo se desarrolló bajo la modalidad de Trabajo Dirigido, con implementación física en el predio del parque bajo la dirección de la propietaria Sra. Eliana Soria Yapur y el equipo de 6 jardineros, integrando los conceptos centrales de la Carrera de Informática Industrial: automatización de procesos, instrumentación de actuadores hidráulicos, redes inalámbricas de corto alcance e ingeniería de software.</w:t>
+        <w:t xml:space="preserve">SARQUE es un sistema automatizado de riego implementado en el Parque Ecoturístico Quinta Estación de Cochabamba, Bolivia, un espacio verde de 5 hectáreas con más de 20 sectores de vegetación diferenciada. El sistema integra 6 controladores Bluetooth K-Rain BL-KR (2 BL-KR2, 3 BL-KR4 y 1 BL-KR6, totalizando 22 estaciones) con electroválvulas K-Rain BSPT de 9 V DC tipo latching, una bomba sumergible Grundfos de 5 HP con tanque hidroneumático y una red hidráulica de tuberías PVC de 2" y 1 ½". La programación de los controladores se realiza mediante la aplicación móvil oficial K-RainBL sobre conexión Bluetooth Low Energy (BLE), eliminando la necesidad de infraestructura WiFi en el predio. Como aporte académico complementario, se desarrolló una plataforma web en React, TypeScript y Supabase que centraliza el catálogo de sectores, los controladores y el cronograma semanal de riego, reemplazando el documento físico utilizado previamente. El trabajo se ejecutó bajo modalidad de Trabajo Dirigido, integrando los conceptos centrales de la Carrera de Informática Industrial del ITSa: automatización de procesos hidráulicos, instrumentación de actuadores, redes inalámbricas de corto alcance e ingeniería de software.</w:t>
       </w:r>
     </w:p>
     <w:p>
@@ -5560,7 +4051,8 @@
     </w:p>
     <w:p>
       <w:pPr>
-        <w:jc w:val="justify"/>
+        <w:pStyle w:val="Normal"/>
+        <w:jc w:val="both"/>
         <w:spacing w:before="120" w:after="120"/>
       </w:pPr>
       <w:r>
@@ -5568,7 +4060,7 @@
           <w:rFonts w:ascii="Times New Roman" w:hAnsi="Times New Roman"/>
           <w:sz w:val="22"/>
         </w:rPr>
-        <w:t xml:space="preserve">A continuación se presenta el análisis de causa raíz aplicando el método de los 5 Porqués, que permite profundizar progresivamente en las causas del problema central identificado en el parque.</w:t>
+        <w:t xml:space="preserve">A continuación se presenta el análisis de causa raíz aplicando el método de los 5 Porqués.</w:t>
       </w:r>
     </w:p>
     <w:p>
@@ -6003,6 +4495,7 @@
     </w:tbl>
     <w:p>
       <w:pPr>
+        <w:pStyle w:val="Normal"/>
         <w:jc w:val="center"/>
         <w:spacing w:before="120" w:after="120"/>
       </w:pPr>
@@ -6260,12 +4753,9 @@
       </w:pPr>
       <w:r>
         <w:rPr>
-          <w:b w:val="0"/>
-          <w:i w:val="0"/>
-          <w:color w:val="auto"/>
-          <w:sz w:val="24"/>
-        </w:rPr>
-        <w:t>Diseñar e implementar un sistema de riego automatizado para el Parque Ecoturístico Quinta Estación de Cochabamba, Bolivia.</w:t>
+          <w:color w:val="auto"/>
+        </w:rPr>
+        <w:t xml:space="preserve">Diseñar e implementar un sistema de riego automatizado para el Parque Ecoturístico Quinta Estación de Cochabamba, Bolivia.</w:t>
       </w:r>
     </w:p>
     <w:bookmarkEnd w:id="16"/>
@@ -6777,7 +5267,8 @@
     </w:p>
     <w:p>
       <w:pPr>
-        <w:jc w:val="justify"/>
+        <w:pStyle w:val="Normal"/>
+        <w:jc w:val="both"/>
         <w:spacing w:before="120" w:after="120"/>
       </w:pPr>
       <w:r>
@@ -6785,7 +5276,7 @@
           <w:rFonts w:ascii="Times New Roman" w:hAnsi="Times New Roman"/>
           <w:sz w:val="22"/>
         </w:rPr>
-        <w:t xml:space="preserve">La siguiente tabla resume las actividades ejecutadas durante la Fase 1 — Planificación de Requisitos del Desarrollo Rápido de Aplicaciones (DRA) aplicado al proyecto SARQUE.</w:t>
+        <w:t xml:space="preserve">La siguiente tabla resume las actividades ejecutadas durante la Fase 1 — Planificación de Requisitos del DRA.</w:t>
       </w:r>
     </w:p>
     <w:p>
@@ -7082,6 +5573,7 @@
     </w:tbl>
     <w:p>
       <w:pPr>
+        <w:pStyle w:val="Normal"/>
         <w:jc w:val="center"/>
         <w:spacing w:before="120" w:after="120"/>
       </w:pPr>
@@ -7137,7 +5629,8 @@
     </w:p>
     <w:p>
       <w:pPr>
-        <w:jc w:val="justify"/>
+        <w:pStyle w:val="Normal"/>
+        <w:jc w:val="both"/>
         <w:spacing w:before="120" w:after="120"/>
       </w:pPr>
       <w:r>
@@ -7145,7 +5638,7 @@
           <w:rFonts w:ascii="Times New Roman" w:hAnsi="Times New Roman"/>
           <w:sz w:val="22"/>
         </w:rPr>
-        <w:t xml:space="preserve">La siguiente tabla detalla las actividades realizadas en la Fase 2 — Diseño del Usuario, junto con los productos generados en cada actividad.</w:t>
+        <w:t xml:space="preserve">La siguiente tabla detalla las actividades realizadas en la Fase 2 — Diseño del Usuario.</w:t>
       </w:r>
     </w:p>
     <w:p>
@@ -7375,6 +5868,7 @@
     </w:tbl>
     <w:p>
       <w:pPr>
+        <w:pStyle w:val="Normal"/>
         <w:jc w:val="center"/>
         <w:spacing w:before="120" w:after="120"/>
       </w:pPr>
@@ -7460,7 +5954,8 @@
     </w:p>
     <w:p>
       <w:pPr>
-        <w:jc w:val="justify"/>
+        <w:pStyle w:val="Normal"/>
+        <w:jc w:val="both"/>
         <w:spacing w:before="120" w:after="120"/>
       </w:pPr>
       <w:r>
@@ -7468,7 +5963,7 @@
           <w:rFonts w:ascii="Times New Roman" w:hAnsi="Times New Roman"/>
           <w:sz w:val="22"/>
         </w:rPr>
-        <w:t xml:space="preserve">Se presenta el stack tecnológico seleccionado para la construcción de la plataforma web SARQUE durante la Fase 3 del DRA.</w:t>
+        <w:t xml:space="preserve">Se presenta el stack tecnológico seleccionado para la construcción de la plataforma web SARQUE.</w:t>
       </w:r>
     </w:p>
     <w:p>
@@ -7808,6 +6303,7 @@
     </w:tbl>
     <w:p>
       <w:pPr>
+        <w:pStyle w:val="Normal"/>
         <w:jc w:val="center"/>
         <w:spacing w:before="120" w:after="120"/>
       </w:pPr>
@@ -7822,7 +6318,8 @@
     </w:p>
     <w:p>
       <w:pPr>
-        <w:jc w:val="justify"/>
+        <w:pStyle w:val="Normal"/>
+        <w:jc w:val="both"/>
         <w:spacing w:before="120" w:after="120"/>
       </w:pPr>
       <w:r>
@@ -7830,7 +6327,7 @@
           <w:rFonts w:ascii="Times New Roman" w:hAnsi="Times New Roman"/>
           <w:sz w:val="22"/>
         </w:rPr>
-        <w:t xml:space="preserve">La tabla muestra los seis incrementos del desarrollo de la plataforma SARQUE entregados durante la Fase 3 (Construcción Rápida), indicando la semana en la cual se completó cada uno.</w:t>
+        <w:t xml:space="preserve">La tabla muestra los seis incrementos del desarrollo de la plataforma SARQUE.</w:t>
       </w:r>
     </w:p>
     <w:p>
@@ -8171,6 +6668,7 @@
     </w:tbl>
     <w:p>
       <w:pPr>
+        <w:pStyle w:val="Normal"/>
         <w:jc w:val="center"/>
         <w:spacing w:before="120" w:after="120"/>
       </w:pPr>
@@ -8210,7 +6708,8 @@
     </w:p>
     <w:p>
       <w:pPr>
-        <w:jc w:val="justify"/>
+        <w:pStyle w:val="Normal"/>
+        <w:jc w:val="both"/>
         <w:spacing w:before="120" w:after="120"/>
       </w:pPr>
       <w:r>
@@ -8218,7 +6717,7 @@
           <w:rFonts w:ascii="Times New Roman" w:hAnsi="Times New Roman"/>
           <w:sz w:val="22"/>
         </w:rPr>
-        <w:t xml:space="preserve">Esta tabla detalla las actividades realizadas durante la Fase 4 — Transición e Implementación, donde el sistema se puso en operación real en el parque.</w:t>
+        <w:t xml:space="preserve">Esta tabla detalla las actividades realizadas durante la Fase 4 — Transición e Implementación.</w:t>
       </w:r>
     </w:p>
     <w:p>
@@ -8450,6 +6949,7 @@
     </w:tbl>
     <w:p>
       <w:pPr>
+        <w:pStyle w:val="Normal"/>
         <w:jc w:val="center"/>
         <w:spacing w:before="120" w:after="120"/>
       </w:pPr>
@@ -8566,7 +7066,8 @@
     <w:bookmarkEnd w:id="25"/>
     <w:p>
       <w:pPr>
-        <w:jc w:val="justify"/>
+        <w:pStyle w:val="Normal"/>
+        <w:jc w:val="both"/>
         <w:spacing w:before="120" w:after="120"/>
       </w:pPr>
       <w:r>
@@ -8574,7 +7075,7 @@
           <w:rFonts w:ascii="Times New Roman" w:hAnsi="Times New Roman"/>
           <w:sz w:val="22"/>
         </w:rPr>
-        <w:t xml:space="preserve">La siguiente matriz metodológica resume las cuatro fases del DRA y su aplicación específica al proyecto SARQUE, indicando la duración estimada de cada fase.</w:t>
+        <w:t xml:space="preserve">La siguiente matriz metodológica resume las cuatro fases del DRA y su aplicación específica al proyecto SARQUE.</w:t>
       </w:r>
     </w:p>
     <w:p>
@@ -9130,6 +7631,7 @@
     </w:tbl>
     <w:p>
       <w:pPr>
+        <w:pStyle w:val="Normal"/>
         <w:jc w:val="center"/>
         <w:spacing w:before="120" w:after="120"/>
       </w:pPr>
@@ -9188,7 +7690,8 @@
     </w:p>
     <w:p>
       <w:pPr>
-        <w:jc w:val="justify"/>
+        <w:pStyle w:val="Normal"/>
+        <w:jc w:val="both"/>
         <w:spacing w:before="120" w:after="120"/>
       </w:pPr>
       <w:r>
@@ -9196,7 +7699,7 @@
           <w:rFonts w:ascii="Times New Roman" w:hAnsi="Times New Roman"/>
           <w:sz w:val="22"/>
         </w:rPr>
-        <w:t xml:space="preserve">El cronograma de actividades detalla las semanas de ejecución del proyecto distribuidas en las fases de diagnóstico, diseño, adquisición, instalación física y desarrollo de software.</w:t>
+        <w:t xml:space="preserve">El cronograma de actividades detalla las semanas de ejecución del proyecto.</w:t>
       </w:r>
     </w:p>
     <w:p>
@@ -12096,6 +10599,7 @@
     </w:tbl>
     <w:p>
       <w:pPr>
+        <w:pStyle w:val="Normal"/>
         <w:jc w:val="center"/>
         <w:spacing w:before="120" w:after="120"/>
       </w:pPr>
@@ -12222,7 +10726,8 @@
     </w:p>
     <w:p>
       <w:pPr>
-        <w:jc w:val="justify"/>
+        <w:pStyle w:val="Normal"/>
+        <w:jc w:val="both"/>
         <w:spacing w:before="120" w:after="120"/>
       </w:pPr>
       <w:r>
@@ -12230,7 +10735,7 @@
           <w:rFonts w:ascii="Times New Roman" w:hAnsi="Times New Roman"/>
           <w:sz w:val="22"/>
         </w:rPr>
-        <w:t xml:space="preserve">Cronograma temporal del proyecto SARQUE distribuido por semanas, mostrando la planificación de cada fase metodológica.</w:t>
+        <w:t xml:space="preserve">Cronograma temporal del proyecto SARQUE distribuido por semanas.</w:t>
       </w:r>
     </w:p>
     <w:p>
@@ -12687,6 +11192,7 @@
     </w:tbl>
     <w:p>
       <w:pPr>
+        <w:pStyle w:val="Normal"/>
         <w:jc w:val="center"/>
         <w:spacing w:before="120" w:after="120"/>
       </w:pPr>
@@ -13454,146 +11960,86 @@
     </w:p>
     <w:p>
       <w:pPr>
-        <w:spacing w:line="360" w:lineRule="auto"/>
+        <w:pStyle w:val="Normal"/>
         <w:jc w:val="both"/>
-        <w:rPr>
-          <w:color w:val="auto"/>
-        </w:rPr>
+        <w:spacing w:before="120" w:after="120"/>
       </w:pPr>
       <w:r>
         <w:rPr>
           <w:rFonts w:ascii="Times New Roman" w:hAnsi="Times New Roman"/>
-          <w:b w:val="0"/>
-          <w:i w:val="0"/>
           <w:sz w:val="24"/>
         </w:rPr>
-        <w:t>Una bomba centrífuga es una máquina hidráulica que transforma la energía mecánica del motor en energía hidráulica (presión y caudal) mediante la fuerza centrífuga generada por un impulsor o rodete que gira a alta velocidad. El líquido ingresa axialmente por el centro del impulsor y es expulsado radialmente por la periferia, donde su velocidad se convierte en presión gracias a la voluta o difusor del cuerpo de la bomba.</w:t>
-      </w:r>
-    </w:p>
-    <w:p>
-      <w:pPr>
-        <w:spacing w:line="360" w:lineRule="auto"/>
+        <w:t xml:space="preserve">Una bomba centrífuga es una máquina hidráulica que transforma la energía mecánica del motor en energía hidráulica (presión y caudal) mediante la fuerza centrífuga generada por un impulsor o rodete que gira a alta velocidad. El líquido ingresa axialmente por el centro del impulsor y es expulsado radialmente por la periferia, donde su velocidad se convierte en presión gracias a la voluta o difusor del cuerpo de la bomba.</w:t>
+      </w:r>
+    </w:p>
+    <w:p>
+      <w:pPr>
+        <w:pStyle w:val="Normal"/>
         <w:jc w:val="both"/>
-        <w:rPr>
-          <w:color w:val="auto"/>
-        </w:rPr>
+        <w:spacing w:before="120" w:after="120"/>
       </w:pPr>
       <w:r>
         <w:rPr>
           <w:rFonts w:ascii="Times New Roman" w:hAnsi="Times New Roman"/>
-          <w:b w:val="0"/>
-          <w:i w:val="0"/>
           <w:sz w:val="24"/>
         </w:rPr>
-        <w:t>En el caso particular de las bombas sumergibles, el conjunto motor-bomba se instala completamente dentro del agua, dentro del pozo. Esta disposición elimina los problemas de cebado típicos de las bombas de superficie y aprovecha el agua circundante para refrigerar el motor eléctrico, lo que prolonga significativamente su vida útil. La energía eléctrica llega al motor mediante un cable sumergible especial de tipo H07RN-F o equivalente, con aislamiento resistente a la inmersión prolongada.</w:t>
-      </w:r>
-    </w:p>
-    <w:p>
-      <w:pPr>
-        <w:spacing w:line="360" w:lineRule="auto"/>
+        <w:t xml:space="preserve">En el caso particular de las bombas sumergibles, el conjunto motor-bomba se instala completamente dentro del agua, dentro del pozo. Esta disposición elimina los problemas de cebado típicos de las bombas de superficie y aprovecha el agua circundante para refrigerar el motor eléctrico, lo que prolonga significativamente su vida útil.</w:t>
+      </w:r>
+    </w:p>
+    <w:p>
+      <w:pPr>
+        <w:pStyle w:val="Normal"/>
         <w:jc w:val="both"/>
-        <w:rPr>
-          <w:color w:val="auto"/>
-        </w:rPr>
+        <w:spacing w:before="120" w:after="120"/>
       </w:pPr>
       <w:r>
         <w:rPr>
           <w:rFonts w:ascii="Times New Roman" w:hAnsi="Times New Roman"/>
-          <w:b w:val="0"/>
-          <w:i w:val="0"/>
           <w:sz w:val="24"/>
         </w:rPr>
-        <w:t>La curva característica de una bomba centrífuga relaciona el caudal entregado (Q, en m³/h o L/s) con la altura manométrica que puede vencer (H, en metros de columna de agua, mca). En el punto de funcionamiento óptimo (BEP, Best Efficiency Point), la bomba opera con su máxima eficiencia hidráulica, que en bombas comerciales modernas alcanza entre el 65 % y el 80 %. (Karassik, 2008)</w:t>
-      </w:r>
-    </w:p>
-    <w:p>
-      <w:pPr>
-        <w:spacing w:line="360" w:lineRule="auto"/>
+        <w:t xml:space="preserve">La curva característica de una bomba centrífuga relaciona el caudal entregado (Q, en m³/h o L/s) con la altura manométrica que puede vencer (H, en metros de columna de agua, mca). En el punto de funcionamiento óptimo (BEP, Best Efficiency Point), la bomba opera con su máxima eficiencia hidráulica, que en bombas comerciales modernas alcanza entre el 65 % y el 80 %. (Karassik, 2008)</w:t>
+      </w:r>
+    </w:p>
+    <w:p>
+      <w:pPr>
+        <w:pStyle w:val="Normal"/>
         <w:jc w:val="both"/>
-        <w:rPr>
-          <w:color w:val="auto"/>
-        </w:rPr>
+        <w:spacing w:before="120" w:after="120"/>
       </w:pPr>
       <w:r>
         <w:rPr>
           <w:rFonts w:ascii="Times New Roman" w:hAnsi="Times New Roman"/>
-          <w:b/>
-          <w:i w:val="0"/>
           <w:sz w:val="24"/>
         </w:rPr>
-        <w:t>Fórmula 2.1 — Potencia hidráulica entregada por la bomba:</w:t>
-      </w:r>
-    </w:p>
-    <w:p>
-      <w:pPr>
-        <w:spacing w:line="360" w:lineRule="auto"/>
-        <w:jc w:val="center"/>
-        <w:rPr>
-          <w:color w:val="auto"/>
-        </w:rPr>
+        <w:t xml:space="preserve">Fórmula 2.1 — Potencia hidráulica entregada por la bomba: P_h = ρ × g × Q × H. Donde P_h es la potencia hidráulica (W), ρ es la densidad del agua (1000 kg/m³), g es la aceleración gravitatoria (9.81 m/s²), Q es el caudal (m³/s) y H es la altura manométrica (m). La potencia eléctrica consumida por la bomba se obtiene dividiendo la potencia hidráulica entre el producto de la eficiencia hidráulica (η_h) y la eficiencia eléctrica del motor (η_e), típicamente entre 0.6 y 0.8.</w:t>
+      </w:r>
+    </w:p>
+    <w:p>
+      <w:pPr>
+        <w:pStyle w:val="Normal"/>
+        <w:jc w:val="both"/>
+        <w:spacing w:before="120" w:after="120"/>
       </w:pPr>
       <w:r>
         <w:rPr>
           <w:rFonts w:ascii="Times New Roman" w:hAnsi="Times New Roman"/>
-          <w:b/>
-          <w:i w:val="0"/>
           <w:sz w:val="24"/>
         </w:rPr>
-        <w:t>P_h = ρ × g × Q × H</w:t>
-      </w:r>
-    </w:p>
-    <w:p>
-      <w:pPr>
-        <w:spacing w:line="360" w:lineRule="auto"/>
+        <w:t xml:space="preserve">Un parámetro crítico en el diseño de bombas centrífugas es el NPSH (Net Positive Suction Head, o Altura Neta Positiva de Aspiración), que mide la diferencia entre la presión absoluta a la entrada del impulsor y la presión de vapor del líquido bombeado. Si el NPSH disponible en la instalación es menor que el NPSH requerido por la bomba, se produce el fenómeno de cavitación: la formación de burbujas de vapor que colapsan violentamente en el impulsor, generando ruido, vibraciones y desgaste prematuro de los álabes. En las bombas sumergibles, dado que el rodete trabaja por debajo del nivel del líquido, el NPSH disponible es naturalmente elevado, lo que minimiza el riesgo de cavitación. (Mataix, 2005)</w:t>
+      </w:r>
+    </w:p>
+    <w:p>
+      <w:pPr>
+        <w:pStyle w:val="Normal"/>
         <w:jc w:val="both"/>
-        <w:rPr>
-          <w:color w:val="auto"/>
-        </w:rPr>
+        <w:spacing w:before="120" w:after="120"/>
       </w:pPr>
       <w:r>
         <w:rPr>
           <w:rFonts w:ascii="Times New Roman" w:hAnsi="Times New Roman"/>
-          <w:b w:val="0"/>
-          <w:i w:val="0"/>
           <w:sz w:val="24"/>
         </w:rPr>
-        <w:t>Donde P_h es la potencia hidráulica (W), ρ es la densidad del agua (1000 kg/m³), g es la aceleración gravitatoria (9.81 m/s²), Q es el caudal (m³/s) y H es la altura manométrica (m). La potencia eléctrica consumida por la bomba se obtiene dividiendo la potencia hidráulica entre el producto de la eficiencia hidráulica (η_h) y la eficiencia eléctrica del motor (η_e), típicamente entre 0.6 y 0.8 en bombas residenciales y comerciales.</w:t>
-      </w:r>
-    </w:p>
-    <w:p>
-      <w:pPr>
-        <w:spacing w:line="360" w:lineRule="auto"/>
-        <w:jc w:val="both"/>
-        <w:rPr>
-          <w:color w:val="auto"/>
-        </w:rPr>
-      </w:pPr>
-      <w:r>
-        <w:rPr>
-          <w:rFonts w:ascii="Times New Roman" w:hAnsi="Times New Roman"/>
-          <w:b w:val="0"/>
-          <w:i w:val="0"/>
-          <w:sz w:val="24"/>
-        </w:rPr>
-        <w:t>Un parámetro crítico en el diseño de bombas centrífugas es el NPSH (Net Positive Suction Head, o Altura Neta Positiva de Aspiración), que mide la diferencia entre la presión absoluta a la entrada del impulsor y la presión de vapor del líquido bombeado. Si el NPSH disponible en la instalación es menor que el NPSH requerido por la bomba, se produce el fenómeno de cavitación: la formación de burbujas de vapor que colapsan violentamente en el impulsor, generando ruido, vibraciones y desgaste prematuro de los álabes. En las bombas sumergibles, dado que el rodete trabaja por debajo del nivel del líquido, el NPSH disponible es naturalmente elevado, lo que minimiza el riesgo de cavitación. (Mataix, 2005)</w:t>
-      </w:r>
-    </w:p>
-    <w:p>
-      <w:pPr>
-        <w:spacing w:line="360" w:lineRule="auto"/>
-        <w:jc w:val="both"/>
-        <w:rPr>
-          <w:color w:val="auto"/>
-        </w:rPr>
-      </w:pPr>
-      <w:r>
-        <w:rPr>
-          <w:rFonts w:ascii="Times New Roman" w:hAnsi="Times New Roman"/>
-          <w:b w:val="0"/>
-          <w:i w:val="0"/>
-          <w:sz w:val="24"/>
-        </w:rPr>
-        <w:t>La bomba Grundfos modelo SQ 5-50 utilizada en el Parque Quinta Estación es una bomba sumergible centrífuga de motor sumergido tipo MS3 con tecnología de arranque suave, capaz de entregar hasta 4 L/s con una columna de elevación de 50 metros, operando con alimentación trifásica de 380 V a 50 Hz. Su diseño incluye protección integrada contra marcha en seco, sobrecargas térmicas y subtensión, lo que la hace especialmente adecuada para instalaciones en pozos de profundidad media en aplicaciones de riego.</w:t>
+        <w:t xml:space="preserve">La bomba Grundfos modelo SQ 5-50 utilizada en el Parque Quinta Estación es una bomba sumergible centrífuga de motor sumergido tipo MS3 con tecnología de arranque suave, capaz de entregar hasta 4 L/s con una columna de elevación de 50 metros, operando con alimentación trifásica de 380 V a 50 Hz.</w:t>
       </w:r>
     </w:p>
     <w:bookmarkEnd w:id="39"/>
@@ -13646,128 +12092,58 @@
     </w:p>
     <w:p>
       <w:pPr>
-        <w:spacing w:line="360" w:lineRule="auto"/>
+        <w:pStyle w:val="Normal"/>
         <w:jc w:val="both"/>
-        <w:rPr>
-          <w:color w:val="auto"/>
-        </w:rPr>
+        <w:spacing w:before="120" w:after="120"/>
       </w:pPr>
       <w:r>
         <w:rPr>
           <w:rFonts w:ascii="Times New Roman" w:hAnsi="Times New Roman"/>
-          <w:b w:val="0"/>
-          <w:i w:val="0"/>
           <w:sz w:val="24"/>
         </w:rPr>
-        <w:t>Un tanque hidroneumático es un recipiente cerrado de acero o material compuesto, parcialmente lleno de aire comprimido, que se instala en la línea de impulsión de una bomba para almacenar agua a presión y regular el funcionamiento del sistema hidráulico. Internamente, el tanque puede estar dividido en dos cámaras separadas por una membrana flexible de butilo o EPDM (membrana hidrocompatible): una cámara contiene el aire comprimido a una presión de precarga preestablecida y la otra recibe el agua impulsada por la bomba.</w:t>
-      </w:r>
-    </w:p>
-    <w:p>
-      <w:pPr>
-        <w:spacing w:line="360" w:lineRule="auto"/>
+        <w:t xml:space="preserve">Un tanque hidroneumático es un recipiente cerrado de acero o material compuesto, parcialmente lleno de aire comprimido, que se instala en la línea de impulsión de una bomba para almacenar agua a presión y regular el funcionamiento del sistema hidráulico. Internamente, el tanque puede estar dividido en dos cámaras separadas por una membrana flexible de butilo o EPDM (membrana hidrocompatible): una cámara contiene el aire comprimido a una presión de precarga preestablecida y la otra recibe el agua impulsada por la bomba.</w:t>
+      </w:r>
+    </w:p>
+    <w:p>
+      <w:pPr>
+        <w:pStyle w:val="Normal"/>
         <w:jc w:val="both"/>
-        <w:rPr>
-          <w:color w:val="auto"/>
-        </w:rPr>
+        <w:spacing w:before="120" w:after="120"/>
       </w:pPr>
       <w:r>
         <w:rPr>
           <w:rFonts w:ascii="Times New Roman" w:hAnsi="Times New Roman"/>
-          <w:b w:val="0"/>
-          <w:i w:val="0"/>
           <w:sz w:val="24"/>
         </w:rPr>
-        <w:t>El principio físico que rige el funcionamiento del tanque hidroneumático es la Ley de Boyle-Mariotte, según la cual, a temperatura constante, el producto del volumen y la presión de un gas ideal permanece constante:</w:t>
-      </w:r>
-    </w:p>
-    <w:p>
-      <w:pPr>
-        <w:spacing w:line="360" w:lineRule="auto"/>
+        <w:t xml:space="preserve">El principio físico que rige el funcionamiento del tanque hidroneumático es la Ley de Boyle-Mariotte: P₁ × V₁ = P₂ × V₂. Esto permite calcular el volumen útil de agua almacenado entre las presiones mínima (P_min, encendido de la bomba) y máxima (P_max, apagado de la bomba). En SARQUE, P_min = 3.5 bar y P_max = 4.0 bar, lo que determina un volumen útil de aproximadamente el 12.5 % del volumen total del tanque.</w:t>
+      </w:r>
+    </w:p>
+    <w:p>
+      <w:pPr>
+        <w:pStyle w:val="Normal"/>
         <w:jc w:val="both"/>
-        <w:rPr>
-          <w:color w:val="auto"/>
-        </w:rPr>
+        <w:spacing w:before="120" w:after="120"/>
       </w:pPr>
       <w:r>
         <w:rPr>
           <w:rFonts w:ascii="Times New Roman" w:hAnsi="Times New Roman"/>
-          <w:b/>
-          <w:i w:val="0"/>
           <w:sz w:val="24"/>
         </w:rPr>
-        <w:t>Fórmula 2.2 — Ley de Boyle-Mariotte aplicada al tanque hidroneumático:</w:t>
-      </w:r>
-    </w:p>
-    <w:p>
-      <w:pPr>
-        <w:spacing w:line="360" w:lineRule="auto"/>
-        <w:jc w:val="center"/>
-        <w:rPr>
-          <w:color w:val="auto"/>
-        </w:rPr>
+        <w:t xml:space="preserve">El presostato es el componente que detecta la presión del sistema y comanda el arranque y parada de la bomba según los umbrales preestablecidos. Cuando un usuario abre una válvula y consume agua del tanque, la presión disminuye gradualmente; al llegar al umbral inferior (3.5 bar), el presostato cierra el circuito eléctrico de la bomba, que comienza a impulsar agua tanto al consumo como al tanque hidroneumático, recomprimiendo el aire interno hasta alcanzar el umbral superior (4.0 bar), momento en que el presostato desconecta la bomba.</w:t>
+      </w:r>
+    </w:p>
+    <w:p>
+      <w:pPr>
+        <w:pStyle w:val="Normal"/>
+        <w:jc w:val="both"/>
+        <w:spacing w:before="120" w:after="120"/>
       </w:pPr>
       <w:r>
         <w:rPr>
           <w:rFonts w:ascii="Times New Roman" w:hAnsi="Times New Roman"/>
-          <w:b/>
-          <w:i w:val="0"/>
           <w:sz w:val="24"/>
         </w:rPr>
-        <w:t>P₁ × V₁ = P₂ × V₂</w:t>
-      </w:r>
-    </w:p>
-    <w:p>
-      <w:pPr>
-        <w:spacing w:line="360" w:lineRule="auto"/>
-        <w:jc w:val="both"/>
-        <w:rPr>
-          <w:color w:val="auto"/>
-        </w:rPr>
-      </w:pPr>
-      <w:r>
-        <w:rPr>
-          <w:rFonts w:ascii="Times New Roman" w:hAnsi="Times New Roman"/>
-          <w:b w:val="0"/>
-          <w:i w:val="0"/>
-          <w:sz w:val="24"/>
-        </w:rPr>
-        <w:t>Esto permite calcular el volumen útil de agua almacenado entre las presiones mínima (P_min, encendido de la bomba) y máxima (P_max, apagado de la bomba). En el sistema SARQUE, P_min = 3.5 bar y P_max = 4.0 bar, lo que determina un volumen útil de aproximadamente el 12.5 % del volumen total del tanque.</w:t>
-      </w:r>
-    </w:p>
-    <w:p>
-      <w:pPr>
-        <w:spacing w:line="360" w:lineRule="auto"/>
-        <w:jc w:val="both"/>
-        <w:rPr>
-          <w:color w:val="auto"/>
-        </w:rPr>
-      </w:pPr>
-      <w:r>
-        <w:rPr>
-          <w:rFonts w:ascii="Times New Roman" w:hAnsi="Times New Roman"/>
-          <w:b w:val="0"/>
-          <w:i w:val="0"/>
-          <w:sz w:val="24"/>
-        </w:rPr>
-        <w:t>El presostato es el componente que detecta la presión del sistema y comanda el arranque y parada de la bomba según los umbrales preestablecidos. Cuando un usuario abre una válvula y consume agua del tanque, la presión disminuye gradualmente; al llegar al umbral inferior (3.5 bar), el presostato cierra el circuito eléctrico de la bomba, que comienza a impulsar agua tanto al consumo como al tanque hidroneumático, recomprimiendo el aire interno hasta alcanzar el umbral superior (4.0 bar), momento en que el presostato desconecta la bomba.</w:t>
-      </w:r>
-    </w:p>
-    <w:p>
-      <w:pPr>
-        <w:spacing w:line="360" w:lineRule="auto"/>
-        <w:jc w:val="both"/>
-        <w:rPr>
-          <w:color w:val="auto"/>
-        </w:rPr>
-      </w:pPr>
-      <w:r>
-        <w:rPr>
-          <w:rFonts w:ascii="Times New Roman" w:hAnsi="Times New Roman"/>
-          <w:b w:val="0"/>
-          <w:i w:val="0"/>
-          <w:sz w:val="24"/>
-        </w:rPr>
-        <w:t>Las ventajas operativas del tanque hidroneumático en sistemas de riego automatizado son las siguientes: extiende la vida útil de la bomba al reducir el número de arranques y paradas (cada arranque genera un transitorio de corriente que produce desgaste térmico en el motor); estabiliza la presión hacia los actuadores (electroválvulas) garantizando un caudal uniforme; proporciona un volumen de reserva instantánea ante consumos puntuales sin requerir el arranque inmediato de la bomba; y absorbe los golpes de ariete que se producen al cerrar bruscamente las electroválvulas. (Mataix, 2005)</w:t>
+        <w:t xml:space="preserve">Las ventajas operativas del tanque hidroneumático en sistemas de riego automatizado son las siguientes: extiende la vida útil de la bomba al reducir el número de arranques y paradas; estabiliza la presión hacia los actuadores (electroválvulas) garantizando un caudal uniforme; proporciona un volumen de reserva instantánea ante consumos puntuales sin requerir el arranque inmediato de la bomba; y absorbe los golpes de ariete que se producen al cerrar bruscamente las electroválvulas. (Mataix, 2005)</w:t>
       </w:r>
     </w:p>
     <w:bookmarkEnd w:id="40"/>
@@ -14074,134 +12450,72 @@
     </w:p>
     <w:p>
       <w:pPr>
-        <w:numPr>
-          <w:ilvl w:val="0"/>
-          <w:numId w:val="1"/>
-        </w:numPr>
-        <w:spacing w:line="360" w:lineRule="auto"/>
+        <w:pStyle w:val="Normal"/>
         <w:jc w:val="both"/>
-        <w:rPr>
-          <w:color w:val="auto"/>
-        </w:rPr>
+        <w:spacing w:before="120" w:after="120"/>
       </w:pPr>
       <w:r>
         <w:rPr>
           <w:rFonts w:ascii="Times New Roman" w:hAnsi="Times New Roman"/>
-          <w:b w:val="0"/>
-          <w:i w:val="0"/>
           <w:sz w:val="24"/>
         </w:rPr>
-        <w:t>K-Rain Manufacturing Corporation es una empresa estadounidense fundada en 1983, con sede en Riviera Beach (Florida, EE.UU.), especializada en el diseño y fabricación de equipos de riego para aplicaciones residenciales, comerciales y agrícolas. La empresa cuenta con la certificación de calidad ISO 9001:2008 y exporta sus productos a más de 80 países, incluyendo Bolivia, donde se distribuyen a través de importadores especializados en sistemas de riego.</w:t>
-      </w:r>
-    </w:p>
-    <w:p>
-      <w:pPr>
-        <w:numPr>
-          <w:ilvl w:val="0"/>
-          <w:numId w:val="1"/>
-        </w:numPr>
-        <w:spacing w:line="360" w:lineRule="auto"/>
+        <w:t xml:space="preserve">K-Rain Manufacturing Corporation es una empresa estadounidense fundada en 1983, con sede en Riviera Beach (Florida, EE.UU.), especializada en el diseño y fabricación de equipos de riego para aplicaciones residenciales, comerciales y agrícolas. La empresa cuenta con la certificación de calidad ISO 9001:2008 y exporta sus productos a más de 80 países, incluyendo Bolivia, donde se distribuyen a través de importadores especializados en sistemas de riego.</w:t>
+      </w:r>
+    </w:p>
+    <w:p>
+      <w:pPr>
+        <w:pStyle w:val="Normal"/>
         <w:jc w:val="both"/>
-        <w:rPr>
-          <w:color w:val="auto"/>
-        </w:rPr>
+        <w:spacing w:before="120" w:after="120"/>
       </w:pPr>
       <w:r>
         <w:rPr>
           <w:rFonts w:ascii="Times New Roman" w:hAnsi="Times New Roman"/>
-          <w:b w:val="0"/>
-          <w:i w:val="0"/>
           <w:sz w:val="24"/>
         </w:rPr>
-        <w:t>La familia BL-KR (Bluetooth Latching K-Rain) constituye la línea de controladores de riego inalámbricos a batería lanzada al mercado en 2014, y se posiciona como una alternativa accesible y eficiente para instalaciones donde no se requiere energía de red ni conectividad a internet permanente. Los modelos disponibles comparten una arquitectura electrónica común basada en un microcontrolador de ultra bajo consumo (UBLC) con módulo Bluetooth Smart 4.0 integrado, y se diferencian únicamente en la cantidad de salidas para electroválvulas (estaciones).</w:t>
-      </w:r>
-    </w:p>
-    <w:p>
-      <w:pPr>
-        <w:numPr>
-          <w:ilvl w:val="0"/>
-          <w:numId w:val="1"/>
-        </w:numPr>
-        <w:spacing w:line="360" w:lineRule="auto"/>
+        <w:t xml:space="preserve">La familia BL-KR (Bluetooth Latching K-Rain) constituye la línea de controladores de riego inalámbricos a batería lanzada al mercado en 2014, y se posiciona como una alternativa accesible y eficiente para instalaciones donde no se requiere energía de red ni conectividad a internet permanente. Los modelos disponibles comparten una arquitectura electrónica común basada en un microcontrolador de ultra bajo consumo con módulo Bluetooth Smart 4.0 integrado.</w:t>
+      </w:r>
+    </w:p>
+    <w:p>
+      <w:pPr>
+        <w:pStyle w:val="Normal"/>
         <w:jc w:val="both"/>
-        <w:rPr>
-          <w:color w:val="auto"/>
-        </w:rPr>
+        <w:spacing w:before="120" w:after="120"/>
       </w:pPr>
       <w:r>
         <w:rPr>
           <w:rFonts w:ascii="Times New Roman" w:hAnsi="Times New Roman"/>
-          <w:b/>
-          <w:i w:val="0"/>
           <w:sz w:val="24"/>
         </w:rPr>
-        <w:t>Tabla — Comparativa de los modelos K-Rain BL-KR utilizados en SARQUE:</w:t>
-      </w:r>
-    </w:p>
-    <w:p>
-      <w:pPr>
-        <w:numPr>
-          <w:ilvl w:val="0"/>
-          <w:numId w:val="1"/>
-        </w:numPr>
-        <w:spacing w:line="360" w:lineRule="auto"/>
+        <w:t xml:space="preserve">El microcontrolador interno de los BL-KR ejecuta firmware propietario desarrollado por K-Rain que se encarga de tres funciones principales: (1) la temporización precisa de los ciclos de riego mediante un oscilador de cristal de cuarzo de baja deriva (±10 ppm); (2) la generación de los pulsos de corriente DC con polaridad invertida que actúan sobre los solenoides latching; y (3) la gestión del protocolo Bluetooth Low Energy para la comunicación con la aplicación móvil K-RainBL.</w:t>
+      </w:r>
+    </w:p>
+    <w:p>
+      <w:pPr>
+        <w:pStyle w:val="Normal"/>
         <w:jc w:val="both"/>
-        <w:rPr>
-          <w:color w:val="auto"/>
-        </w:rPr>
+        <w:spacing w:before="120" w:after="120"/>
       </w:pPr>
       <w:r>
         <w:rPr>
           <w:rFonts w:ascii="Times New Roman" w:hAnsi="Times New Roman"/>
-          <w:b w:val="0"/>
-          <w:i w:val="0"/>
           <w:sz w:val="24"/>
         </w:rPr>
-        <w:t>El microcontrolador interno de los BL-KR ejecuta firmware propietario desarrollado por K-Rain, no actualizable por el usuario final, que se encarga de tres funciones principales: (1) la temporización precisa de los ciclos de riego mediante un oscilador de cristal de cuarzo de baja deriva (±10 ppm); (2) la generación de los pulsos de corriente DC con polaridad invertida que actúan sobre los solenoides latching; y (3) la gestión del protocolo Bluetooth Low Energy para la comunicación con la aplicación móvil K-RainBL.</w:t>
-      </w:r>
-    </w:p>
-    <w:p>
-      <w:pPr>
-        <w:numPr>
-          <w:ilvl w:val="0"/>
-          <w:numId w:val="1"/>
-        </w:numPr>
-        <w:spacing w:line="360" w:lineRule="auto"/>
+        <w:t xml:space="preserve">El protocolo de comunicación implementado en los controladores BL-KR sigue el Perfil de Atributos Genéricos (GATT) del estándar Bluetooth 4.0. K-Rain expone un Servicio propietario que agrupa las características de programación (escritura), estado (lectura) y notificación (eventos asíncronos). La aplicación móvil K-RainBL actúa como cliente GATT (rol Central), mientras que el controlador BL-KR actúa como servidor GATT (rol Periférico).</w:t>
+      </w:r>
+    </w:p>
+    <w:p>
+      <w:pPr>
+        <w:pStyle w:val="Normal"/>
         <w:jc w:val="both"/>
-        <w:rPr>
-          <w:color w:val="auto"/>
-        </w:rPr>
+        <w:spacing w:before="120" w:after="120"/>
       </w:pPr>
       <w:r>
         <w:rPr>
           <w:rFonts w:ascii="Times New Roman" w:hAnsi="Times New Roman"/>
-          <w:b w:val="0"/>
-          <w:i w:val="0"/>
           <w:sz w:val="24"/>
         </w:rPr>
-        <w:t>El protocolo de comunicación implementado en los controladores BL-KR sigue el Perfil de Atributos Genéricos (GATT) del estándar Bluetooth 4.0, que define una jerarquía de Servicios, Características y Descriptores. K-Rain expone un Servicio propietario que agrupa las características de programación (escritura), estado (lectura) y notificación (eventos asíncronos). La aplicación móvil K-RainBL actúa como cliente GATT (rol Central), mientras que el controlador BL-KR actúa como servidor GATT (rol Periférico). La transmisión de datos se realiza en paquetes de hasta 20 bytes mediante operaciones de escritura con respuesta (Write With Response), garantizando integridad de la programación.</w:t>
-      </w:r>
-    </w:p>
-    <w:p>
-      <w:pPr>
-        <w:numPr>
-          <w:ilvl w:val="0"/>
-          <w:numId w:val="1"/>
-        </w:numPr>
-        <w:spacing w:line="360" w:lineRule="auto"/>
-        <w:jc w:val="both"/>
-        <w:rPr>
-          <w:color w:val="auto"/>
-        </w:rPr>
-      </w:pPr>
-      <w:r>
-        <w:rPr>
-          <w:rFonts w:ascii="Times New Roman" w:hAnsi="Times New Roman"/>
-          <w:b w:val="0"/>
-          <w:i w:val="0"/>
-          <w:sz w:val="24"/>
-        </w:rPr>
-        <w:t>El consumo energético del controlador BL-KR es notablemente bajo gracias a la arquitectura de bajo consumo del módulo BLE y al modo de operación pulsante de las electroválvulas latching. En reposo, el controlador consume menos de 20 µA; durante la transmisión Bluetooth, el pico de consumo alcanza 15-20 mA durante intervalos de pocos milisegundos. Esto permite que una batería 9V alcalina estándar (aprox. 550 mAh) alimente el controlador durante aproximadamente un año de operación continua, asumiendo entre 4 y 6 ciclos de riego diarios. (K-Rain Manufacturing Corporation, 2020)</w:t>
+        <w:t xml:space="preserve">El consumo energético del controlador BL-KR es notablemente bajo. En reposo, el controlador consume menos de 20 µA; durante la transmisión Bluetooth, el pico de consumo alcanza 15-20 mA durante intervalos de pocos milisegundos. Esto permite que una batería 9V alcalina estándar (aprox. 550 mAh) alimente el controlador durante aproximadamente un año de operación continua, asumiendo entre 4 y 6 ciclos de riego diarios. (K-Rain Manufacturing Corporation, 2020)</w:t>
       </w:r>
     </w:p>
     <w:bookmarkEnd w:id="43"/>
@@ -14250,6 +12564,76 @@
           <w:color w:val="auto"/>
         </w:rPr>
         <w:t>Bluetooth Low Energy (BLE), también conocido como Bluetooth Smart, es una especificación de comunicación inalámbrica de corto alcance introducida en la versión 4.0 del estándar Bluetooth (2010). A diferencia del Bluetooth clásico, BLE está optimizado para dispositivos que requieren bajo consumo energético y comunicación en ráfagas cortas, lo que lo hace idóneo para dispositivos alimentados por baterías como los controladores K-Rain BL-KR. El alcance típico de BLE es de 10 a 30 metros en condiciones de campo abierto. (Bluetooth SIG, 2016)</w:t>
+      </w:r>
+    </w:p>
+    <w:p>
+      <w:pPr>
+        <w:pStyle w:val="Normal"/>
+        <w:jc w:val="both"/>
+        <w:spacing w:before="120" w:after="120"/>
+      </w:pPr>
+      <w:r>
+        <w:rPr>
+          <w:rFonts w:ascii="Times New Roman" w:hAnsi="Times New Roman"/>
+          <w:sz w:val="24"/>
+        </w:rPr>
+        <w:t xml:space="preserve">Bluetooth Low Energy (BLE), comercialmente denominado Bluetooth Smart, es una variante del estándar Bluetooth introducida en la versión 4.0 del protocolo en el año 2010 por el Bluetooth Special Interest Group (SIG). A diferencia del Bluetooth clásico (BR/EDR), que fue diseñado para aplicaciones de transmisión continua de datos como audio o transferencia de archivos, BLE está optimizado para la comunicación intermitente de pequeños volúmenes de datos entre dispositivos alimentados por batería.</w:t>
+      </w:r>
+    </w:p>
+    <w:p>
+      <w:pPr>
+        <w:pStyle w:val="Normal"/>
+        <w:jc w:val="both"/>
+        <w:spacing w:before="120" w:after="120"/>
+      </w:pPr>
+      <w:r>
+        <w:rPr>
+          <w:rFonts w:ascii="Times New Roman" w:hAnsi="Times New Roman"/>
+          <w:sz w:val="24"/>
+        </w:rPr>
+        <w:t xml:space="preserve">BLE opera en la banda ISM de 2.4 GHz, utilizando 40 canales de 2 MHz de ancho de banda cada uno. De estos, 3 canales (37, 38 y 39) están reservados para el envío de paquetes de anuncio (advertising), mientras que los 37 restantes se utilizan para la transmisión de datos durante una conexión establecida. La modulación empleada es GFSK (Gaussian Frequency-Shift Keying) con un índice de modulación de 0.5.</w:t>
+      </w:r>
+    </w:p>
+    <w:p>
+      <w:pPr>
+        <w:pStyle w:val="Normal"/>
+        <w:jc w:val="both"/>
+        <w:spacing w:before="120" w:after="120"/>
+      </w:pPr>
+      <w:r>
+        <w:rPr>
+          <w:rFonts w:ascii="Times New Roman" w:hAnsi="Times New Roman"/>
+          <w:sz w:val="24"/>
+        </w:rPr>
+        <w:t xml:space="preserve">El alcance típico de BLE en condiciones ideales (espacio abierto, sin obstáculos) es de 10 a 30 metros, aunque las variantes más recientes (Bluetooth 5.0 y 5.2) han ampliado este rango hasta 100-400 metros mediante mejoras en la sensibilidad del receptor y técnicas de codificación. En presencia de obstáculos físicos como vegetación densa, muros de hormigón o cuerpos humanos, el alcance se reduce significativamente.</w:t>
+      </w:r>
+    </w:p>
+    <w:p>
+      <w:pPr>
+        <w:pStyle w:val="Normal"/>
+        <w:jc w:val="both"/>
+        <w:spacing w:before="120" w:after="120"/>
+      </w:pPr>
+      <w:r>
+        <w:rPr>
+          <w:rFonts w:ascii="Times New Roman" w:hAnsi="Times New Roman"/>
+          <w:sz w:val="24"/>
+        </w:rPr>
+        <w:t xml:space="preserve">El modelo de comunicación BLE distingue dos roles principales: el dispositivo Central (master), que inicia las conexiones y consulta datos, y el dispositivo Periférico (slave), que anuncia su presencia y responde a las solicitudes del Central. En el contexto del proyecto SARQUE, el smartphone del administrador del parque actúa como Central, mientras que cada controlador K-Rain BL-KR actúa como Periférico.</w:t>
+      </w:r>
+    </w:p>
+    <w:p>
+      <w:pPr>
+        <w:pStyle w:val="Normal"/>
+        <w:jc w:val="both"/>
+        <w:spacing w:before="120" w:after="120"/>
+      </w:pPr>
+      <w:r>
+        <w:rPr>
+          <w:rFonts w:ascii="Times New Roman" w:hAnsi="Times New Roman"/>
+          <w:sz w:val="24"/>
+        </w:rPr>
+        <w:t xml:space="preserve">El consumo energético de BLE es uno de sus principales atractivos para aplicaciones de IoT. Un dispositivo periférico BLE en modo de bajo consumo consume típicamente entre 1 y 10 µA, mientras que durante la transmisión activa el consumo alcanza 15-20 mA durante intervalos de milisegundos. (Townsend, Cufí, Akiba y Davidson, 2014)</w:t>
       </w:r>
     </w:p>
     <w:bookmarkEnd w:id="44"/>
@@ -14626,164 +13010,86 @@
     </w:p>
     <w:p>
       <w:pPr>
-        <w:spacing w:line="360" w:lineRule="auto"/>
+        <w:pStyle w:val="Normal"/>
         <w:jc w:val="both"/>
-        <w:rPr>
-          <w:color w:val="auto"/>
-        </w:rPr>
+        <w:spacing w:before="120" w:after="120"/>
       </w:pPr>
       <w:r>
         <w:rPr>
           <w:rFonts w:ascii="Times New Roman" w:hAnsi="Times New Roman"/>
-          <w:b w:val="0"/>
-          <w:i w:val="0"/>
           <w:sz w:val="24"/>
         </w:rPr>
-        <w:t>Una electroválvula, también denominada válvula solenoide, es un actuador electromecánico que controla el paso o el corte de fluidos en una tubería mediante la activación o desactivación de un solenoide eléctrico. El principio físico fundamental que rige su funcionamiento es el electromagnetismo: la corriente eléctrica que circula por una bobina genera un campo magnético que mueve un núcleo ferromagnético (plunger o émbolo), el cual abre o cierra el paso del fluido a través del orificio principal de la válvula.</w:t>
-      </w:r>
-    </w:p>
-    <w:p>
-      <w:pPr>
-        <w:spacing w:line="360" w:lineRule="auto"/>
+        <w:t xml:space="preserve">Una electroválvula, también denominada válvula solenoide, es un actuador electromecánico que controla el paso o el corte de fluidos en una tubería mediante la activación o desactivación de un solenoide eléctrico. El principio físico fundamental que rige su funcionamiento es el electromagnetismo: la corriente eléctrica que circula por una bobina genera un campo magnético que mueve un núcleo ferromagnético (plunger o émbolo), el cual abre o cierra el paso del fluido a través del orificio principal de la válvula.</w:t>
+      </w:r>
+    </w:p>
+    <w:p>
+      <w:pPr>
+        <w:pStyle w:val="Normal"/>
         <w:jc w:val="both"/>
-        <w:rPr>
-          <w:color w:val="auto"/>
-        </w:rPr>
+        <w:spacing w:before="120" w:after="120"/>
       </w:pPr>
       <w:r>
         <w:rPr>
           <w:rFonts w:ascii="Times New Roman" w:hAnsi="Times New Roman"/>
-          <w:b w:val="0"/>
-          <w:i w:val="0"/>
           <w:sz w:val="24"/>
         </w:rPr>
-        <w:t>Existen dos grandes familias de electroválvulas según su forma de operar el solenoide: las electroválvulas estándar y las electroválvulas latching. En las electroválvulas estándar, el solenoide debe permanecer energizado de forma continua para mantener la válvula en su posición activa (abierta o cerrada), lo que implica un consumo eléctrico constante mientras la válvula está en uso. Por el contrario, las electroválvulas tipo latching incorporan un imán permanente que retiene mecánicamente el émbolo en su última posición tras un pulso de corriente, eliminando la necesidad de mantener la bobina energizada de forma continua.</w:t>
-      </w:r>
-    </w:p>
-    <w:p>
-      <w:pPr>
-        <w:spacing w:line="360" w:lineRule="auto"/>
+        <w:t xml:space="preserve">Existen dos grandes familias de electroválvulas según su forma de operar el solenoide: las electroválvulas estándar y las electroválvulas latching. En las electroválvulas estándar, el solenoide debe permanecer energizado de forma continua para mantener la válvula en su posición activa, lo que implica un consumo eléctrico constante. Por el contrario, las electroválvulas tipo latching incorporan un imán permanente que retiene mecánicamente el émbolo en su última posición tras un pulso de corriente.</w:t>
+      </w:r>
+    </w:p>
+    <w:p>
+      <w:pPr>
+        <w:pStyle w:val="Normal"/>
         <w:jc w:val="both"/>
-        <w:rPr>
-          <w:color w:val="auto"/>
-        </w:rPr>
+        <w:spacing w:before="120" w:after="120"/>
       </w:pPr>
       <w:r>
         <w:rPr>
           <w:rFonts w:ascii="Times New Roman" w:hAnsi="Times New Roman"/>
-          <w:b w:val="0"/>
-          <w:i w:val="0"/>
           <w:sz w:val="24"/>
         </w:rPr>
-        <w:t>Las electroválvulas latching cambian de estado mediante pulsos cortos de corriente DC con polaridad invertida: un pulso de polaridad positiva (por ejemplo, +9 V durante 30 milisegundos) genera un campo magnético que vence la retención del imán permanente y mueve el émbolo a la posición de apertura; un pulso de polaridad negativa (−9 V) realiza la operación inversa, cerrando la válvula. Esta característica las hace especialmente adecuadas para aplicaciones alimentadas por batería, ya que el consumo energético total se reduce drásticamente. (Smith y Zappe, 2004)</w:t>
-      </w:r>
-    </w:p>
-    <w:p>
-      <w:pPr>
-        <w:spacing w:line="360" w:lineRule="auto"/>
+        <w:t xml:space="preserve">Las electroválvulas latching cambian de estado mediante pulsos cortos de corriente DC con polaridad invertida: un pulso de polaridad positiva (por ejemplo, +9 V durante 30 milisegundos) genera un campo magnético que vence la retención del imán permanente y mueve el émbolo a la posición de apertura; un pulso de polaridad negativa (−9 V) realiza la operación inversa. Esta característica las hace especialmente adecuadas para aplicaciones alimentadas por batería. (Smith y Zappe, 2004)</w:t>
+      </w:r>
+    </w:p>
+    <w:p>
+      <w:pPr>
+        <w:pStyle w:val="Normal"/>
         <w:jc w:val="both"/>
-        <w:rPr>
-          <w:color w:val="auto"/>
-        </w:rPr>
+        <w:spacing w:before="120" w:after="120"/>
       </w:pPr>
       <w:r>
         <w:rPr>
           <w:rFonts w:ascii="Times New Roman" w:hAnsi="Times New Roman"/>
-          <w:b w:val="0"/>
-          <w:i w:val="0"/>
           <w:sz w:val="24"/>
         </w:rPr>
-        <w:t>La curva característica de presión-caudal de una electroválvula relaciona la pérdida de carga (caída de presión, ΔP) con el caudal que la atraviesa, según la siguiente expresión empírica derivada del coeficiente de flujo (Kv):</w:t>
-      </w:r>
-    </w:p>
-    <w:p>
-      <w:pPr>
-        <w:spacing w:line="360" w:lineRule="auto"/>
+        <w:t xml:space="preserve">Fórmula 2.3 — Caudal a través de una electroválvula: Q = Kv × √(ΔP / SG). Donde Q es el caudal (m³/h), Kv es el coeficiente de flujo característico de cada válvula, ΔP es la diferencia de presión entre entrada y salida (bar) y SG es la densidad relativa del fluido (1 para el agua). En las electroválvulas K-Rain BSPT, el Kv nominal es de aproximadamente 4.5, lo que permite el paso de hasta 5 L/s con una pérdida de carga de 0.5 bar.</w:t>
+      </w:r>
+    </w:p>
+    <w:p>
+      <w:pPr>
+        <w:pStyle w:val="Normal"/>
         <w:jc w:val="both"/>
-        <w:rPr>
-          <w:color w:val="auto"/>
-        </w:rPr>
+        <w:spacing w:before="120" w:after="120"/>
       </w:pPr>
       <w:r>
         <w:rPr>
           <w:rFonts w:ascii="Times New Roman" w:hAnsi="Times New Roman"/>
-          <w:b/>
-          <w:i w:val="0"/>
           <w:sz w:val="24"/>
         </w:rPr>
-        <w:t>Fórmula 2.3 — Caudal a través de una electroválvula:</w:t>
-      </w:r>
-    </w:p>
-    <w:p>
-      <w:pPr>
-        <w:spacing w:line="360" w:lineRule="auto"/>
-        <w:jc w:val="center"/>
-        <w:rPr>
-          <w:color w:val="auto"/>
-        </w:rPr>
+        <w:t xml:space="preserve">Los criterios técnicos para la selección de una electroválvula en un sistema de riego son los siguientes: (1) el tipo de fluido y sus características físico-químicas; (2) el rango de presión de trabajo, que debe ser compatible con la presión nominal del sistema; (3) el caudal máximo a manejar, considerando la pérdida de carga aceptable; (4) la conexión hidráulica (rosca BSPT, NPT, brida, etc.); (5) el voltaje y tipo de corriente (AC o DC, estándar o latching); y (6) las condiciones ambientales. (Pizarro, 2017)</w:t>
+      </w:r>
+    </w:p>
+    <w:p>
+      <w:pPr>
+        <w:pStyle w:val="Normal"/>
+        <w:jc w:val="both"/>
+        <w:spacing w:before="120" w:after="120"/>
       </w:pPr>
       <w:r>
         <w:rPr>
           <w:rFonts w:ascii="Times New Roman" w:hAnsi="Times New Roman"/>
-          <w:b/>
-          <w:i w:val="0"/>
           <w:sz w:val="24"/>
         </w:rPr>
-        <w:t>Q = Kv × √(ΔP / SG)</w:t>
-      </w:r>
-    </w:p>
-    <w:p>
-      <w:pPr>
-        <w:spacing w:line="360" w:lineRule="auto"/>
-        <w:jc w:val="both"/>
-        <w:rPr>
-          <w:color w:val="auto"/>
-        </w:rPr>
-      </w:pPr>
-      <w:r>
-        <w:rPr>
-          <w:rFonts w:ascii="Times New Roman" w:hAnsi="Times New Roman"/>
-          <w:b w:val="0"/>
-          <w:i w:val="0"/>
-          <w:sz w:val="24"/>
-        </w:rPr>
-        <w:t>Donde Q es el caudal (m³/h), Kv es el coeficiente de flujo característico de cada válvula (proporcionado por el fabricante), ΔP es la diferencia de presión entre entrada y salida (bar) y SG es la densidad relativa del fluido (1 para el agua). En el caso de las electroválvulas K-Rain BSPT, el Kv nominal es de aproximadamente 4.5, lo que permite el paso de hasta 5 L/s con una pérdida de carga de 0.5 bar.</w:t>
-      </w:r>
-    </w:p>
-    <w:p>
-      <w:pPr>
-        <w:spacing w:line="360" w:lineRule="auto"/>
-        <w:jc w:val="both"/>
-        <w:rPr>
-          <w:color w:val="auto"/>
-        </w:rPr>
-      </w:pPr>
-      <w:r>
-        <w:rPr>
-          <w:rFonts w:ascii="Times New Roman" w:hAnsi="Times New Roman"/>
-          <w:b w:val="0"/>
-          <w:i w:val="0"/>
-          <w:sz w:val="24"/>
-        </w:rPr>
-        <w:t>Los criterios técnicos para la selección de una electroválvula en un sistema de riego son los siguientes: (1) el tipo de fluido y sus características físico-químicas; (2) el rango de presión de trabajo, que debe ser compatible con la presión nominal del sistema; (3) el caudal máximo a manejar, considerando la pérdida de carga aceptable; (4) la conexión hidráulica (rosca BSPT, NPT, brida, etc.); (5) el voltaje y tipo de corriente (AC o DC, estándar o latching); y (6) las condiciones ambientales (temperatura, humedad, exposición a rayos UV). (Pizarro, 2017)</w:t>
-      </w:r>
-    </w:p>
-    <w:p>
-      <w:pPr>
-        <w:spacing w:line="360" w:lineRule="auto"/>
-        <w:jc w:val="both"/>
-        <w:rPr>
-          <w:color w:val="auto"/>
-        </w:rPr>
-      </w:pPr>
-      <w:r>
-        <w:rPr>
-          <w:rFonts w:ascii="Times New Roman" w:hAnsi="Times New Roman"/>
-          <w:b w:val="0"/>
-          <w:i w:val="0"/>
-          <w:sz w:val="24"/>
-        </w:rPr>
-        <w:t>La electroválvula K-Rain BSPT 9V DC tipo latching utilizada en el sistema SARQUE cumple con las normas internacionales ISO 9633 e IEC 60529 IP68, lo que garantiza su operación confiable en instalaciones enterradas o expuestas a la intemperie. Su construcción es de polipropileno reforzado con fibra de vidrio, lo que la hace resistente a la corrosión y a los rayos ultravioleta. La rosca de conexión BSPT (British Standard Pipe Taper) de 1 ½" es compatible con el estándar utilizado en el mercado boliviano para tuberías PVC de presión.</w:t>
+        <w:t xml:space="preserve">La electroválvula K-Rain BSPT 9V DC tipo latching utilizada en el sistema SARQUE cumple con las normas internacionales ISO 9633 e IEC 60529 IP68, lo que garantiza su operación confiable en instalaciones enterradas o expuestas a la intemperie. Su construcción es de polipropileno reforzado con fibra de vidrio, lo que la hace resistente a la corrosión y a los rayos ultravioleta.</w:t>
       </w:r>
     </w:p>
     <w:bookmarkEnd w:id="47"/>
@@ -14850,164 +13156,58 @@
     </w:p>
     <w:p>
       <w:pPr>
-        <w:spacing w:line="360" w:lineRule="auto"/>
+        <w:pStyle w:val="Normal"/>
         <w:jc w:val="both"/>
-        <w:rPr>
-          <w:color w:val="auto"/>
-        </w:rPr>
+        <w:spacing w:before="120" w:after="120"/>
       </w:pPr>
       <w:r>
         <w:rPr>
           <w:rFonts w:ascii="Times New Roman" w:hAnsi="Times New Roman"/>
-          <w:b w:val="0"/>
-          <w:i w:val="0"/>
           <w:sz w:val="24"/>
         </w:rPr>
-        <w:t>El AWG (American Wire Gauge) es un sistema de medida normalizado para clasificar el diámetro de cables y alambres eléctricos, desarrollado en Estados Unidos en 1857 por J.R. Brown &amp; Sons. La normativa AWG establece una relación logarítmica inversa entre el número de calibre y el diámetro del conductor: a mayor número AWG, menor diámetro del conductor. La fórmula que vincula el número AWG con el diámetro en milímetros es:</w:t>
-      </w:r>
-    </w:p>
-    <w:p>
-      <w:pPr>
-        <w:spacing w:line="360" w:lineRule="auto"/>
+        <w:t xml:space="preserve">El AWG (American Wire Gauge) es un sistema de medida normalizado para clasificar el diámetro de cables y alambres eléctricos, desarrollado en Estados Unidos en 1857 por J.R. Brown &amp; Sons. La normativa AWG establece una relación logarítmica inversa entre el número de calibre y el diámetro del conductor: a mayor número AWG, menor diámetro del conductor.</w:t>
+      </w:r>
+    </w:p>
+    <w:p>
+      <w:pPr>
+        <w:pStyle w:val="Normal"/>
         <w:jc w:val="both"/>
-        <w:rPr>
-          <w:color w:val="auto"/>
-        </w:rPr>
+        <w:spacing w:before="120" w:after="120"/>
       </w:pPr>
       <w:r>
         <w:rPr>
           <w:rFonts w:ascii="Times New Roman" w:hAnsi="Times New Roman"/>
-          <w:b/>
-          <w:i w:val="0"/>
           <w:sz w:val="24"/>
         </w:rPr>
-        <w:t>Fórmula 2.4 — Diámetro del conductor en función del calibre AWG:</w:t>
-      </w:r>
-    </w:p>
-    <w:p>
-      <w:pPr>
-        <w:spacing w:line="360" w:lineRule="auto"/>
-        <w:jc w:val="center"/>
-        <w:rPr>
-          <w:color w:val="auto"/>
-        </w:rPr>
+        <w:t xml:space="preserve">Fórmula 2.4 — Diámetro del conductor en función del calibre AWG: d (mm) = 0.127 × 92 ^ ((36 - AWG) / 39). Para el cable 20 AWG utilizado en el sistema SARQUE, el diámetro nominal del conductor es de 0.812 mm, lo que corresponde a una sección transversal de aproximadamente 0.518 mm². Esta sección es adecuada para corrientes continuas de hasta 1.5 amperios en aplicaciones de baja tensión (menos de 50 V), con una resistencia eléctrica nominal de 33.31 ohmios por kilómetro de cable a 20 °C.</w:t>
+      </w:r>
+    </w:p>
+    <w:p>
+      <w:pPr>
+        <w:pStyle w:val="Normal"/>
+        <w:jc w:val="both"/>
+        <w:spacing w:before="120" w:after="120"/>
       </w:pPr>
       <w:r>
         <w:rPr>
           <w:rFonts w:ascii="Times New Roman" w:hAnsi="Times New Roman"/>
-          <w:b/>
-          <w:i w:val="0"/>
           <w:sz w:val="24"/>
         </w:rPr>
-        <w:t>d (mm) = 0.127 × 92 ^ ((36 - AWG) / 39)</w:t>
-      </w:r>
-    </w:p>
-    <w:p>
-      <w:pPr>
-        <w:spacing w:line="360" w:lineRule="auto"/>
+        <w:t xml:space="preserve">La caída de tensión en un cable eléctrico es un parámetro crítico que debe verificarse durante el diseño de cualquier instalación. La caída se calcula mediante la fórmula 2.5: V_caída = I × R × L × 2. Donde I es la corriente eléctrica (A), R es la resistencia específica por unidad de longitud (Ω/m), L es la longitud del cable (m) y el factor 2 considera el camino de ida y retorno. Para SARQUE, con corriente de pulso de 200 mA, R de 0.0333 Ω/m y L máxima de 30 m, la caída de tensión calculada es de 0.4 V, lo que representa apenas el 4.4 % de los 9 V nominales. (NEC, 2020)</w:t>
+      </w:r>
+    </w:p>
+    <w:p>
+      <w:pPr>
+        <w:pStyle w:val="Normal"/>
         <w:jc w:val="both"/>
-        <w:rPr>
-          <w:color w:val="auto"/>
-        </w:rPr>
+        <w:spacing w:before="120" w:after="120"/>
       </w:pPr>
       <w:r>
         <w:rPr>
           <w:rFonts w:ascii="Times New Roman" w:hAnsi="Times New Roman"/>
-          <w:b w:val="0"/>
-          <w:i w:val="0"/>
           <w:sz w:val="24"/>
         </w:rPr>
-        <w:t>Para el cable 20 AWG utilizado en el sistema SARQUE, el diámetro nominal del conductor es de 0.812 mm, lo que corresponde a una sección transversal de aproximadamente 0.518 mm². Esta sección es adecuada para corrientes continuas de hasta 1.5 amperios en aplicaciones de baja tensión (menos de 50 V), con una resistencia eléctrica nominal de 33.31 ohmios por kilómetro de cable a 20 °C.</w:t>
-      </w:r>
-    </w:p>
-    <w:p>
-      <w:pPr>
-        <w:spacing w:line="360" w:lineRule="auto"/>
-        <w:jc w:val="both"/>
-        <w:rPr>
-          <w:color w:val="auto"/>
-        </w:rPr>
-      </w:pPr>
-      <w:r>
-        <w:rPr>
-          <w:rFonts w:ascii="Times New Roman" w:hAnsi="Times New Roman"/>
-          <w:b w:val="0"/>
-          <w:i w:val="0"/>
-          <w:sz w:val="24"/>
-        </w:rPr>
-        <w:t>La caída de tensión en un cable eléctrico es un parámetro crítico que debe verificarse durante el diseño de cualquier instalación, ya que una caída excesiva puede impedir el correcto funcionamiento de los actuadores (en este caso, los solenoides de las electroválvulas). La caída de tensión se calcula mediante la ley de Ohm aplicada al circuito de ida y retorno:</w:t>
-      </w:r>
-    </w:p>
-    <w:p>
-      <w:pPr>
-        <w:spacing w:line="360" w:lineRule="auto"/>
-        <w:jc w:val="both"/>
-        <w:rPr>
-          <w:color w:val="auto"/>
-        </w:rPr>
-      </w:pPr>
-      <w:r>
-        <w:rPr>
-          <w:rFonts w:ascii="Times New Roman" w:hAnsi="Times New Roman"/>
-          <w:b/>
-          <w:i w:val="0"/>
-          <w:sz w:val="24"/>
-        </w:rPr>
-        <w:t>Fórmula 2.5 — Caída de tensión en un cable bipolar:</w:t>
-      </w:r>
-    </w:p>
-    <w:p>
-      <w:pPr>
-        <w:spacing w:line="360" w:lineRule="auto"/>
-        <w:jc w:val="center"/>
-        <w:rPr>
-          <w:color w:val="auto"/>
-        </w:rPr>
-      </w:pPr>
-      <w:r>
-        <w:rPr>
-          <w:rFonts w:ascii="Times New Roman" w:hAnsi="Times New Roman"/>
-          <w:b/>
-          <w:i w:val="0"/>
-          <w:sz w:val="24"/>
-        </w:rPr>
-        <w:t>V_caída = I × R × L × 2</w:t>
-      </w:r>
-    </w:p>
-    <w:p>
-      <w:pPr>
-        <w:spacing w:line="360" w:lineRule="auto"/>
-        <w:jc w:val="both"/>
-        <w:rPr>
-          <w:color w:val="auto"/>
-        </w:rPr>
-      </w:pPr>
-      <w:r>
-        <w:rPr>
-          <w:rFonts w:ascii="Times New Roman" w:hAnsi="Times New Roman"/>
-          <w:b w:val="0"/>
-          <w:i w:val="0"/>
-          <w:sz w:val="24"/>
-        </w:rPr>
-        <w:t>Donde I es la corriente eléctrica que circula por el cable (A), R es la resistencia específica por unidad de longitud (Ω/m), L es la longitud del cable (m) y el factor 2 considera el camino de ida y retorno de la corriente. Para el sistema SARQUE, con una corriente de pulso de 200 mA, una resistencia de 0.0333 Ω/m y una longitud máxima de 30 m, la caída de tensión calculada es de 0.4 V, lo que representa apenas el 4.4 % de los 9 V nominales de la batería del controlador, muy por debajo del 10 % considerado como límite admisible en instalaciones de baja tensión. (NEC, 2020)</w:t>
-      </w:r>
-    </w:p>
-    <w:p>
-      <w:pPr>
-        <w:spacing w:line="360" w:lineRule="auto"/>
-        <w:jc w:val="both"/>
-        <w:rPr>
-          <w:color w:val="auto"/>
-        </w:rPr>
-      </w:pPr>
-      <w:r>
-        <w:rPr>
-          <w:rFonts w:ascii="Times New Roman" w:hAnsi="Times New Roman"/>
-          <w:b w:val="0"/>
-          <w:i w:val="0"/>
-          <w:sz w:val="24"/>
-        </w:rPr>
-        <w:t>La selección de cable monofilar (un solo hilo sólido) en lugar de cable multifilar (varios hilos trenzados) se justifica por dos razones técnicas: (1) la rigidez del conductor monofilar facilita su inserción dentro del politubo de protección, y (2) la ausencia de espacios intersticiales entre hilos reduce el riesgo de infiltración de humedad por capilaridad, lo que es crítico en instalaciones enterradas como las del Parque Quinta Estación.</w:t>
+        <w:t xml:space="preserve">La selección de cable monofilar (un solo hilo sólido) en lugar de cable multifilar (varios hilos trenzados) se justifica por dos razones técnicas: (1) la rigidez del conductor monofilar facilita su inserción dentro del politubo de protección, y (2) la ausencia de espacios intersticiales entre hilos reduce el riesgo de infiltración de humedad por capilaridad, lo que es crítico en instalaciones enterradas.</w:t>
       </w:r>
     </w:p>
     <w:bookmarkEnd w:id="48"/>
@@ -15155,92 +13355,72 @@
     </w:p>
     <w:p>
       <w:pPr>
-        <w:spacing w:line="360" w:lineRule="auto"/>
+        <w:pStyle w:val="Normal"/>
         <w:jc w:val="both"/>
-        <w:rPr>
-          <w:color w:val="auto"/>
-        </w:rPr>
+        <w:spacing w:before="120" w:after="120"/>
       </w:pPr>
       <w:r>
         <w:rPr>
           <w:rFonts w:ascii="Times New Roman" w:hAnsi="Times New Roman"/>
-          <w:b w:val="0"/>
-          <w:i w:val="0"/>
           <w:sz w:val="24"/>
         </w:rPr>
-        <w:t>React es una biblioteca de JavaScript de código abierto desarrollada y mantenida por Meta (anteriormente Facebook), lanzada inicialmente en 2013. Su propósito fundamental es facilitar la construcción de interfaces de usuario reactivas mediante un modelo declarativo basado en componentes reutilizables. A diferencia de los frameworks tradicionales que utilizan plantillas HTML separadas de la lógica, React introduce el concepto de JSX (JavaScript XML), una extensión sintáctica de JavaScript que permite escribir marcado HTML directamente dentro del código.</w:t>
-      </w:r>
-    </w:p>
-    <w:p>
-      <w:pPr>
-        <w:spacing w:line="360" w:lineRule="auto"/>
+        <w:t xml:space="preserve">React es una biblioteca de JavaScript de código abierto desarrollada y mantenida por Meta (anteriormente Facebook), lanzada inicialmente en 2013. Su propósito fundamental es facilitar la construcción de interfaces de usuario reactivas mediante un modelo declarativo basado en componentes reutilizables. A diferencia de los frameworks tradicionales que utilizan plantillas HTML separadas de la lógica, React introduce el concepto de JSX (JavaScript XML), una extensión sintáctica que permite escribir marcado HTML directamente dentro del código.</w:t>
+      </w:r>
+    </w:p>
+    <w:p>
+      <w:pPr>
+        <w:pStyle w:val="Normal"/>
         <w:jc w:val="both"/>
-        <w:rPr>
-          <w:color w:val="auto"/>
-        </w:rPr>
+        <w:spacing w:before="120" w:after="120"/>
       </w:pPr>
       <w:r>
         <w:rPr>
           <w:rFonts w:ascii="Times New Roman" w:hAnsi="Times New Roman"/>
-          <w:b w:val="0"/>
-          <w:i w:val="0"/>
           <w:sz w:val="24"/>
         </w:rPr>
-        <w:t>El modelo de renderizado de React se basa en el concepto de Virtual DOM (Modelo de Objeto del Documento Virtual), una representación ligera en memoria del DOM real del navegador. Cuando el estado de un componente cambia, React reconstruye el Virtual DOM, lo compara con el estado anterior mediante un algoritmo de diferenciación denominado reconciliación, y aplica únicamente los cambios mínimos necesarios al DOM real del navegador. Este enfoque permite obtener un rendimiento significativamente superior al de las manipulaciones directas del DOM. (Banks y Porcello, 2020)</w:t>
-      </w:r>
-    </w:p>
-    <w:p>
-      <w:pPr>
-        <w:spacing w:line="360" w:lineRule="auto"/>
+        <w:t xml:space="preserve">El modelo de renderizado de React se basa en el concepto de Virtual DOM, una representación ligera en memoria del DOM real del navegador. Cuando el estado de un componente cambia, React reconstruye el Virtual DOM, lo compara con el estado anterior mediante un algoritmo de diferenciación denominado reconciliación, y aplica únicamente los cambios mínimos necesarios al DOM real del navegador. (Banks y Porcello, 2020)</w:t>
+      </w:r>
+    </w:p>
+    <w:p>
+      <w:pPr>
+        <w:pStyle w:val="Normal"/>
         <w:jc w:val="both"/>
-        <w:rPr>
-          <w:color w:val="auto"/>
-        </w:rPr>
+        <w:spacing w:before="120" w:after="120"/>
       </w:pPr>
       <w:r>
         <w:rPr>
           <w:rFonts w:ascii="Times New Roman" w:hAnsi="Times New Roman"/>
-          <w:b w:val="0"/>
-          <w:i w:val="0"/>
           <w:sz w:val="24"/>
         </w:rPr>
-        <w:t>Los componentes de React pueden definirse como funciones (functional components) o como clases (class components). En la versión 16.8, introducida en febrero de 2019, React incorporó los Hooks, una nueva API que permite a los componentes funcionales gestionar estado interno (useState), efectos secundarios (useEffect), contexto compartido (useContext) y optimizaciones de rendimiento (useMemo, useCallback), entre otras funcionalidades. Esta evolución consolidó a los componentes funcionales como el paradigma estándar de desarrollo en React.</w:t>
-      </w:r>
-    </w:p>
-    <w:p>
-      <w:pPr>
-        <w:spacing w:line="360" w:lineRule="auto"/>
+        <w:t xml:space="preserve">Los componentes de React pueden definirse como funciones (functional components) o como clases (class components). En la versión 16.8, introducida en febrero de 2019, React incorporó los Hooks, una nueva API que permite a los componentes funcionales gestionar estado interno (useState), efectos secundarios (useEffect), contexto compartido (useContext) y optimizaciones de rendimiento.</w:t>
+      </w:r>
+    </w:p>
+    <w:p>
+      <w:pPr>
+        <w:pStyle w:val="Normal"/>
         <w:jc w:val="both"/>
-        <w:rPr>
-          <w:color w:val="auto"/>
-        </w:rPr>
+        <w:spacing w:before="120" w:after="120"/>
       </w:pPr>
       <w:r>
         <w:rPr>
           <w:rFonts w:ascii="Times New Roman" w:hAnsi="Times New Roman"/>
-          <w:b w:val="0"/>
-          <w:i w:val="0"/>
           <w:sz w:val="24"/>
         </w:rPr>
-        <w:t>TypeScript, por su parte, es un superconjunto tipado de JavaScript desarrollado por Microsoft y lanzado en 2012. TypeScript añade al lenguaje JavaScript un sistema de tipos estáticos opcional, interfaces, enumeraciones, genéricos y otras características propias de lenguajes orientados a objetos. El código TypeScript se compila a JavaScript estándar mediante el compilador tsc, lo que permite ejecutarlo en cualquier entorno que soporte JavaScript (navegadores, Node.js, etc.).</w:t>
-      </w:r>
-    </w:p>
-    <w:p>
-      <w:pPr>
-        <w:spacing w:line="360" w:lineRule="auto"/>
+        <w:t xml:space="preserve">TypeScript, por su parte, es un superconjunto tipado de JavaScript desarrollado por Microsoft y lanzado en 2012. TypeScript añade al lenguaje JavaScript un sistema de tipos estáticos opcional, interfaces, enumeraciones, genéricos y otras características propias de lenguajes orientados a objetos. El código TypeScript se compila a JavaScript estándar mediante el compilador tsc, lo que permite ejecutarlo en cualquier entorno.</w:t>
+      </w:r>
+    </w:p>
+    <w:p>
+      <w:pPr>
+        <w:pStyle w:val="Normal"/>
         <w:jc w:val="both"/>
-        <w:rPr>
-          <w:color w:val="auto"/>
-        </w:rPr>
+        <w:spacing w:before="120" w:after="120"/>
       </w:pPr>
       <w:r>
         <w:rPr>
           <w:rFonts w:ascii="Times New Roman" w:hAnsi="Times New Roman"/>
-          <w:b w:val="0"/>
-          <w:i w:val="0"/>
           <w:sz w:val="24"/>
         </w:rPr>
-        <w:t>La integración de React con TypeScript proporciona beneficios significativos en el desarrollo de aplicaciones de mediana y gran escala: detección temprana de errores en tiempo de compilación, autocompletado inteligente en los editores de código, refactorización segura, documentación implícita mediante tipos y mejor mantenibilidad a largo plazo. En el proyecto SARQUE, se utilizó TypeScript 5.8 con React 18, configurado mediante la herramienta de construcción Vite, lo que permitió implementar la plataforma web con tipado estricto, garantizando la integridad de los datos manipulados entre el frontend y la base de datos en Supabase.</w:t>
+        <w:t xml:space="preserve">La integración de React con TypeScript proporciona beneficios significativos en el desarrollo de aplicaciones de mediana y gran escala: detección temprana de errores en tiempo de compilación, autocompletado inteligente, refactorización segura, documentación implícita mediante tipos y mejor mantenibilidad. En SARQUE, se utilizó TypeScript 5.8 con React 18, configurado mediante Vite.</w:t>
       </w:r>
     </w:p>
     <w:bookmarkEnd w:id="51"/>
@@ -15533,6 +13713,76 @@
         <w:t>En SARQUE, Supabase provee: autenticación de usuarios con JWT, base de datos PostgreSQL con Row Level Security (RLS) y API REST para lectura y escritura desde la plataforma web.</w:t>
       </w:r>
     </w:p>
+    <w:p>
+      <w:pPr>
+        <w:pStyle w:val="Normal"/>
+        <w:jc w:val="both"/>
+        <w:spacing w:before="120" w:after="120"/>
+      </w:pPr>
+      <w:r>
+        <w:rPr>
+          <w:rFonts w:ascii="Times New Roman" w:hAnsi="Times New Roman"/>
+          <w:sz w:val="24"/>
+        </w:rPr>
+        <w:t xml:space="preserve">Supabase es una plataforma de backend como servicio (BaaS, Backend-as-a-Service) de código abierto, lanzada en 2020 por Paul Copplestone y Anthony Wilson como una alternativa libre y autoalojable a Firebase de Google. La plataforma proporciona, en una única interfaz integrada, los servicios fundamentales requeridos por la mayoría de las aplicaciones web modernas: base de datos relacional, autenticación de usuarios, almacenamiento de archivos, funciones serverless, suscripciones en tiempo real y una API REST autogenerada.</w:t>
+      </w:r>
+    </w:p>
+    <w:p>
+      <w:pPr>
+        <w:pStyle w:val="Normal"/>
+        <w:jc w:val="both"/>
+        <w:spacing w:before="120" w:after="120"/>
+      </w:pPr>
+      <w:r>
+        <w:rPr>
+          <w:rFonts w:ascii="Times New Roman" w:hAnsi="Times New Roman"/>
+          <w:sz w:val="24"/>
+        </w:rPr>
+        <w:t xml:space="preserve">A diferencia de otras plataformas BaaS que utilizan bases de datos no relacionales propietarias, Supabase se construye sobre PostgreSQL, el sistema de gestión de bases de datos relacionales (RDBMS) de código abierto más avanzado y estable disponible en la actualidad. Esto significa que los desarrolladores pueden aprovechar todas las funcionalidades nativas de PostgreSQL: transacciones ACID, vistas materializadas, procedimientos almacenados en PL/pgSQL, tipos de datos avanzados (JSON, arrays, rangos), índices GIN/GiST, replicación lógica y herramientas de migración estándar.</w:t>
+      </w:r>
+    </w:p>
+    <w:p>
+      <w:pPr>
+        <w:pStyle w:val="Normal"/>
+        <w:jc w:val="both"/>
+        <w:spacing w:before="120" w:after="120"/>
+      </w:pPr>
+      <w:r>
+        <w:rPr>
+          <w:rFonts w:ascii="Times New Roman" w:hAnsi="Times New Roman"/>
+          <w:sz w:val="24"/>
+        </w:rPr>
+        <w:t xml:space="preserve">Una de las características distintivas de Supabase es la generación automática de una API REST a partir del esquema de la base de datos. Esta funcionalidad se implementa mediante PostgREST, una herramienta de código abierto desarrollada por Joe Nelson que expone tablas, vistas y funciones de PostgreSQL como endpoints HTTP estándar, con soporte para operaciones CRUD, paginación, filtrado, ordenamiento y búsqueda de texto completo.</w:t>
+      </w:r>
+    </w:p>
+    <w:p>
+      <w:pPr>
+        <w:pStyle w:val="Normal"/>
+        <w:jc w:val="both"/>
+        <w:spacing w:before="120" w:after="120"/>
+      </w:pPr>
+      <w:r>
+        <w:rPr>
+          <w:rFonts w:ascii="Times New Roman" w:hAnsi="Times New Roman"/>
+          <w:sz w:val="24"/>
+        </w:rPr>
+        <w:t xml:space="preserve">La autenticación de usuarios en Supabase se gestiona mediante un servicio dedicado denominado GoTrue, que implementa el estándar JWT (JSON Web Tokens) según la especificación RFC 7519. Cuando un usuario inicia sesión correctamente, el servidor genera un token JWT firmado criptográficamente que contiene la identidad del usuario, su rol y los permisos correspondientes. (Supabase Documentation, 2024)</w:t>
+      </w:r>
+    </w:p>
+    <w:p>
+      <w:pPr>
+        <w:pStyle w:val="Normal"/>
+        <w:jc w:val="both"/>
+        <w:spacing w:before="120" w:after="120"/>
+      </w:pPr>
+      <w:r>
+        <w:rPr>
+          <w:rFonts w:ascii="Times New Roman" w:hAnsi="Times New Roman"/>
+          <w:sz w:val="24"/>
+        </w:rPr>
+        <w:t xml:space="preserve">Las suscripciones en tiempo real (Realtime) de Supabase permiten a los clientes recibir notificaciones instantáneas cuando los datos de una tabla cambian, utilizando el protocolo WebSocket sobre conexiones HTTPS. Esta funcionalidad se implementa mediante el servicio Realtime de Phoenix Channels.</w:t>
+      </w:r>
+    </w:p>
     <w:bookmarkEnd w:id="56"/>
     <w:p>
       <w:pPr>
@@ -15583,92 +13833,72 @@
     </w:p>
     <w:p>
       <w:pPr>
-        <w:spacing w:line="360" w:lineRule="auto"/>
+        <w:pStyle w:val="Normal"/>
         <w:jc w:val="both"/>
-        <w:rPr>
-          <w:color w:val="auto"/>
-        </w:rPr>
+        <w:spacing w:before="120" w:after="120"/>
       </w:pPr>
       <w:r>
         <w:rPr>
           <w:rFonts w:ascii="Times New Roman" w:hAnsi="Times New Roman"/>
-          <w:b w:val="0"/>
-          <w:i w:val="0"/>
           <w:sz w:val="24"/>
         </w:rPr>
-        <w:t>PostgreSQL es un sistema de gestión de bases de datos relacionales orientado a objetos (ORDBMS) de código abierto, cuyo desarrollo se inició en 1986 en la Universidad de California en Berkeley bajo el liderazgo del profesor Michael Stonebraker. Tras varias evoluciones, en 1996 se renombró como PostgreSQL para reflejar su soporte para SQL estándar y se constituyó como un proyecto comunitario gestionado por el PostgreSQL Global Development Group. En la actualidad, PostgreSQL es considerado el sistema de base de datos relacional de código abierto más avanzado, utilizado por organizaciones como Apple, Cisco, Yahoo!, Reddit, Instagram y Spotify para gestionar volúmenes de datos de varios petabytes.</w:t>
-      </w:r>
-    </w:p>
-    <w:p>
-      <w:pPr>
-        <w:spacing w:line="360" w:lineRule="auto"/>
+        <w:t xml:space="preserve">PostgreSQL es un sistema de gestión de bases de datos relacionales orientado a objetos (ORDBMS) de código abierto, cuyo desarrollo se inició en 1986 en la Universidad de California en Berkeley bajo el liderazgo del profesor Michael Stonebraker. Tras varias evoluciones, en 1996 se renombró como PostgreSQL para reflejar su soporte para SQL estándar. En la actualidad, PostgreSQL es considerado el sistema de base de datos relacional de código abierto más avanzado, utilizado por organizaciones como Apple, Cisco, Yahoo!, Reddit, Instagram y Spotify.</w:t>
+      </w:r>
+    </w:p>
+    <w:p>
+      <w:pPr>
+        <w:pStyle w:val="Normal"/>
         <w:jc w:val="both"/>
-        <w:rPr>
-          <w:color w:val="auto"/>
-        </w:rPr>
+        <w:spacing w:before="120" w:after="120"/>
       </w:pPr>
       <w:r>
         <w:rPr>
           <w:rFonts w:ascii="Times New Roman" w:hAnsi="Times New Roman"/>
-          <w:b w:val="0"/>
-          <w:i w:val="0"/>
           <w:sz w:val="24"/>
         </w:rPr>
-        <w:t>Las características técnicas destacadas de PostgreSQL incluyen: cumplimiento total del estándar SQL (ISO/IEC 9075:2016); soporte nativo para múltiples tipos de datos estructurados (JSON, JSONB, XML, arrays, rangos, hstore); transacciones ACID con aislamiento configurable (Read Uncommitted, Read Committed, Repeatable Read, Serializable); replicación síncrona y asíncrona; particionamiento horizontal y vertical de tablas; índices avanzados (B-tree, Hash, GiST, GIN, BRIN); ventanas analíticas (window functions); y extensibilidad mediante extensiones nativas (PostGIS para datos geográficos, pg_trgm para búsqueda difusa, TimescaleDB para series temporales, etc.). (PostgreSQL Global Development Group, 2024)</w:t>
-      </w:r>
-    </w:p>
-    <w:p>
-      <w:pPr>
-        <w:spacing w:line="360" w:lineRule="auto"/>
+        <w:t xml:space="preserve">Las características técnicas destacadas de PostgreSQL incluyen: cumplimiento total del estándar SQL (ISO/IEC 9075:2016); soporte nativo para múltiples tipos de datos estructurados (JSON, JSONB, XML, arrays, rangos, hstore); transacciones ACID con aislamiento configurable; replicación síncrona y asíncrona; particionamiento horizontal y vertical de tablas; índices avanzados (B-tree, Hash, GiST, GIN, BRIN); ventanas analíticas; y extensibilidad mediante extensiones nativas (PostGIS, pg_trgm, TimescaleDB, etc.). (PostgreSQL Global Development Group, 2024)</w:t>
+      </w:r>
+    </w:p>
+    <w:p>
+      <w:pPr>
+        <w:pStyle w:val="Normal"/>
         <w:jc w:val="both"/>
-        <w:rPr>
-          <w:color w:val="auto"/>
-        </w:rPr>
+        <w:spacing w:before="120" w:after="120"/>
       </w:pPr>
       <w:r>
         <w:rPr>
           <w:rFonts w:ascii="Times New Roman" w:hAnsi="Times New Roman"/>
-          <w:b w:val="0"/>
-          <w:i w:val="0"/>
           <w:sz w:val="24"/>
         </w:rPr>
-        <w:t>Row Level Security (RLS) es una característica avanzada de control de acceso introducida en PostgreSQL 9.5, que permite definir políticas de seguridad a nivel de fila individual dentro de una tabla. A diferencia de los permisos tradicionales (GRANT/REVOKE) que operan a nivel de tabla completa, las políticas RLS permiten especificar condiciones SQL que se evalúan automáticamente en cada operación SELECT, INSERT, UPDATE o DELETE, restringiendo qué filas son visibles o modificables para cada usuario según su identidad o atributos.</w:t>
-      </w:r>
-    </w:p>
-    <w:p>
-      <w:pPr>
-        <w:spacing w:line="360" w:lineRule="auto"/>
+        <w:t xml:space="preserve">Row Level Security (RLS) es una característica avanzada de control de acceso introducida en PostgreSQL 9.5, que permite definir políticas de seguridad a nivel de fila individual dentro de una tabla. A diferencia de los permisos tradicionales (GRANT/REVOKE) que operan a nivel de tabla completa, las políticas RLS permiten especificar condiciones SQL que se evalúan automáticamente en cada operación SELECT, INSERT, UPDATE o DELETE, restringiendo qué filas son visibles o modificables para cada usuario.</w:t>
+      </w:r>
+    </w:p>
+    <w:p>
+      <w:pPr>
+        <w:pStyle w:val="Normal"/>
         <w:jc w:val="both"/>
-        <w:rPr>
-          <w:color w:val="auto"/>
-        </w:rPr>
+        <w:spacing w:before="120" w:after="120"/>
       </w:pPr>
       <w:r>
         <w:rPr>
           <w:rFonts w:ascii="Times New Roman" w:hAnsi="Times New Roman"/>
-          <w:b w:val="0"/>
-          <w:i w:val="0"/>
           <w:sz w:val="24"/>
         </w:rPr>
-        <w:t>Una política RLS se define mediante la sentencia CREATE POLICY, especificando el nombre de la política, la tabla a la que aplica, el comando o comandos cubiertos (SELECT, INSERT, UPDATE, DELETE o ALL), los roles a los que se aplica y la condición SQL que determina la visibilidad o modificabilidad de las filas. Cuando RLS está habilitado en una tabla mediante ALTER TABLE ... ENABLE ROW LEVEL SECURITY, todas las consultas son evaluadas contra las políticas activas, sin que el desarrollador deba modificar la lógica de la aplicación.</w:t>
-      </w:r>
-    </w:p>
-    <w:p>
-      <w:pPr>
-        <w:spacing w:line="360" w:lineRule="auto"/>
+        <w:t xml:space="preserve">Una política RLS se define mediante la sentencia CREATE POLICY, especificando el nombre de la política, la tabla a la que aplica, el comando o comandos cubiertos, los roles a los que se aplica y la condición SQL. Cuando RLS está habilitado en una tabla mediante ALTER TABLE ... ENABLE ROW LEVEL SECURITY, todas las consultas son evaluadas contra las políticas activas, sin que el desarrollador deba modificar la lógica de la aplicación.</w:t>
+      </w:r>
+    </w:p>
+    <w:p>
+      <w:pPr>
+        <w:pStyle w:val="Normal"/>
         <w:jc w:val="both"/>
-        <w:rPr>
-          <w:color w:val="auto"/>
-        </w:rPr>
+        <w:spacing w:before="120" w:after="120"/>
       </w:pPr>
       <w:r>
         <w:rPr>
           <w:rFonts w:ascii="Times New Roman" w:hAnsi="Times New Roman"/>
-          <w:b w:val="0"/>
-          <w:i w:val="0"/>
           <w:sz w:val="24"/>
         </w:rPr>
-        <w:t>En el contexto de Supabase, RLS es la herramienta principal para implementar la seguridad de la API REST autogenerada. Cada solicitud HTTP que llega a PostgREST incluye un token JWT que contiene la identidad del usuario; este JWT se traduce a una sesión PostgreSQL con un rol específico (anonymous, authenticated o roles personalizados), sobre el cual se evalúan las políticas RLS. De esta manera, la lógica de seguridad reside íntegramente en la base de datos, no en el cliente ni en una capa intermedia, lo que elimina la posibilidad de bypass de seguridad por errores en la implementación del frontend. (Lerner, 2019)</w:t>
+        <w:t xml:space="preserve">En el contexto de Supabase, RLS es la herramienta principal para implementar la seguridad de la API REST autogenerada. Cada solicitud HTTP que llega a PostgREST incluye un token JWT que contiene la identidad del usuario; este JWT se traduce a una sesión PostgreSQL con un rol específico, sobre el cual se evalúan las políticas RLS. (Lerner, 2019)</w:t>
       </w:r>
     </w:p>
     <w:bookmarkEnd w:id="57"/>
@@ -15841,74 +14071,58 @@
     </w:p>
     <w:p>
       <w:pPr>
-        <w:spacing w:line="360" w:lineRule="auto"/>
+        <w:pStyle w:val="Normal"/>
         <w:jc w:val="both"/>
-        <w:rPr>
-          <w:color w:val="auto"/>
-        </w:rPr>
+        <w:spacing w:before="120" w:after="120"/>
       </w:pPr>
       <w:r>
         <w:rPr>
           <w:rFonts w:ascii="Times New Roman" w:hAnsi="Times New Roman"/>
-          <w:b w:val="0"/>
-          <w:i w:val="0"/>
           <w:sz w:val="24"/>
         </w:rPr>
-        <w:t>La Norma Boliviana NB 777, denominada "Diseño y construcción de instalaciones eléctricas interiores en baja tensión", es la normativa técnica vigente en el Estado Plurinacional de Bolivia que establece los requisitos mínimos para el diseño, construcción y verificación de instalaciones eléctricas interiores con tensiones inferiores a 1000 V en corriente alterna o 1500 V en corriente continua. Fue desarrollada por el Instituto Boliviano de Normalización y Calidad (IBNORCA) en concordancia con las normas internacionales IEC 60364 de la Comisión Electrotécnica Internacional. (IBNORCA, 2004)</w:t>
-      </w:r>
-    </w:p>
-    <w:p>
-      <w:pPr>
-        <w:spacing w:line="360" w:lineRule="auto"/>
+        <w:t xml:space="preserve">La Norma Boliviana NB 777, denominada "Diseño y construcción de instalaciones eléctricas interiores en baja tensión", es la normativa técnica vigente en el Estado Plurinacional de Bolivia que establece los requisitos mínimos para el diseño, construcción y verificación de instalaciones eléctricas interiores con tensiones inferiores a 1000 V en corriente alterna o 1500 V en corriente continua. Fue desarrollada por el Instituto Boliviano de Normalización y Calidad (IBNORCA) en concordancia con las normas internacionales IEC 60364. (IBNORCA, 2004)</w:t>
+      </w:r>
+    </w:p>
+    <w:p>
+      <w:pPr>
+        <w:pStyle w:val="Normal"/>
         <w:jc w:val="both"/>
-        <w:rPr>
-          <w:color w:val="auto"/>
-        </w:rPr>
+        <w:spacing w:before="120" w:after="120"/>
       </w:pPr>
       <w:r>
         <w:rPr>
           <w:rFonts w:ascii="Times New Roman" w:hAnsi="Times New Roman"/>
-          <w:b w:val="0"/>
-          <w:i w:val="0"/>
           <w:sz w:val="24"/>
         </w:rPr>
-        <w:t>Los objetivos principales de la NB 777 son tres: garantizar la seguridad de las personas, animales y bienes contra los riesgos eléctricos (electrocución, incendio, sobrecalentamiento); asegurar el funcionamiento correcto y eficiente de la instalación eléctrica a lo largo de su vida útil; y unificar los criterios técnicos aplicados en Bolivia con los estándares internacionales para facilitar la cooperación técnica regional. La norma se aplica obligatoriamente a todas las instalaciones eléctricas interiores en edificaciones residenciales, comerciales, industriales y de servicios.</w:t>
-      </w:r>
-    </w:p>
-    <w:p>
-      <w:pPr>
-        <w:spacing w:line="360" w:lineRule="auto"/>
+        <w:t xml:space="preserve">Los objetivos principales de la NB 777 son tres: garantizar la seguridad de las personas, animales y bienes contra los riesgos eléctricos; asegurar el funcionamiento correcto y eficiente de la instalación eléctrica a lo largo de su vida útil; y unificar los criterios técnicos aplicados en Bolivia con los estándares internacionales para facilitar la cooperación técnica regional.</w:t>
+      </w:r>
+    </w:p>
+    <w:p>
+      <w:pPr>
+        <w:pStyle w:val="Normal"/>
         <w:jc w:val="both"/>
-        <w:rPr>
-          <w:color w:val="auto"/>
-        </w:rPr>
+        <w:spacing w:before="120" w:after="120"/>
       </w:pPr>
       <w:r>
         <w:rPr>
           <w:rFonts w:ascii="Times New Roman" w:hAnsi="Times New Roman"/>
-          <w:b w:val="0"/>
-          <w:i w:val="0"/>
           <w:sz w:val="24"/>
         </w:rPr>
-        <w:t>Los temas técnicos cubiertos por la NB 777 incluyen: la selección y dimensionamiento de conductores según la corriente máxima de servicio y las condiciones de instalación (tabla A52-1 a A52-17); los sistemas de puesta a tierra y protección contra contactos directos e indirectos (TT, TN-S, TN-C, IT); los dispositivos de protección contra sobreintensidades (interruptores termomagnéticos y fusibles) y contra corrientes de fuga a tierra (interruptores diferenciales o RCD); la separación de los circuitos según su función (alumbrado, tomacorrientes, fuerza, alarmas) y su tensión nominal; los métodos de instalación admitidos (canalizaciones, bandejas, ductos, conductores enterrados); la verificación inicial y periódica de las instalaciones; y la documentación técnica que debe acompañar a cada proyecto.</w:t>
-      </w:r>
-    </w:p>
-    <w:p>
-      <w:pPr>
-        <w:spacing w:line="360" w:lineRule="auto"/>
+        <w:t xml:space="preserve">Los temas técnicos cubiertos por la NB 777 incluyen: la selección y dimensionamiento de conductores según la corriente máxima de servicio; los sistemas de puesta a tierra y protección contra contactos directos e indirectos (TT, TN-S, TN-C, IT); los dispositivos de protección contra sobreintensidades y contra corrientes de fuga a tierra (interruptores diferenciales o RCD); la separación de los circuitos según su función; los métodos de instalación admitidos; la verificación inicial y periódica de las instalaciones; y la documentación técnica.</w:t>
+      </w:r>
+    </w:p>
+    <w:p>
+      <w:pPr>
+        <w:pStyle w:val="Normal"/>
         <w:jc w:val="both"/>
-        <w:rPr>
-          <w:color w:val="auto"/>
-        </w:rPr>
+        <w:spacing w:before="120" w:after="120"/>
       </w:pPr>
       <w:r>
         <w:rPr>
           <w:rFonts w:ascii="Times New Roman" w:hAnsi="Times New Roman"/>
-          <w:b w:val="0"/>
-          <w:i w:val="0"/>
           <w:sz w:val="24"/>
         </w:rPr>
-        <w:t>En el contexto del proyecto SARQUE, la NB 777 se aplica directamente al diseño de la alimentación eléctrica de la bomba sumergible Grundfos de 5 HP trifásica. Esto incluye el dimensionamiento del cable sumergible que alimenta el motor (sección mínima recomendada: 4 mm² para 50 m de longitud); la protección termomagnética del circuito (interruptor automático trifásico de 16 A con curva D para arranque de motores); la puesta a tierra del armazón metálico del motor mediante un conductor independiente; y la instalación de un interruptor diferencial de 30 mA para protección de las personas. Adicionalmente, el cableado de control de baja tensión (20 AWG, 9 V DC) hacia las electroválvulas está exento de los requisitos más estrictos de la norma por tratarse de tensiones MBTS (Muy Baja Tensión de Seguridad), aunque debe respetarse la separación física con los circuitos de baja tensión.</w:t>
+        <w:t xml:space="preserve">En el contexto del proyecto SARQUE, la NB 777 se aplica directamente al diseño de la alimentación eléctrica de la bomba sumergible Grundfos de 5 HP trifásica. Esto incluye el dimensionamiento del cable sumergible que alimenta el motor (sección mínima recomendada: 4 mm² para 50 m de longitud); la protección termomagnética del circuito (interruptor automático trifásico de 16 A con curva D para arranque de motores); la puesta a tierra del armazón metálico del motor; y la instalación de un interruptor diferencial de 30 mA para protección de las personas.</w:t>
       </w:r>
     </w:p>
     <w:p>
@@ -16241,7 +14455,8 @@
     </w:p>
     <w:p>
       <w:pPr>
-        <w:jc w:val="justify"/>
+        <w:pStyle w:val="Normal"/>
+        <w:jc w:val="both"/>
         <w:spacing w:before="120" w:after="120"/>
       </w:pPr>
       <w:r>
@@ -16249,7 +14464,7 @@
           <w:rFonts w:ascii="Times New Roman" w:hAnsi="Times New Roman"/>
           <w:sz w:val="22"/>
         </w:rPr>
-        <w:t xml:space="preserve">Esta tabla identifica los cinco problemas operativos principales detectados en el sistema de riego manual actual del parque, clasificados por frecuencia e impacto.</w:t>
+        <w:t xml:space="preserve">Esta tabla identifica los problemas operativos principales detectados en el sistema de riego manual actual.</w:t>
       </w:r>
     </w:p>
     <w:p>
@@ -16787,6 +15002,7 @@
     </w:tbl>
     <w:p>
       <w:pPr>
+        <w:pStyle w:val="Normal"/>
         <w:jc w:val="center"/>
         <w:spacing w:before="120" w:after="120"/>
       </w:pPr>
@@ -16924,7 +15140,8 @@
     </w:p>
     <w:p>
       <w:pPr>
-        <w:jc w:val="justify"/>
+        <w:pStyle w:val="Normal"/>
+        <w:jc w:val="both"/>
         <w:spacing w:before="120" w:after="120"/>
       </w:pPr>
       <w:r>
@@ -16932,7 +15149,7 @@
           <w:rFonts w:ascii="Times New Roman" w:hAnsi="Times New Roman"/>
           <w:sz w:val="22"/>
         </w:rPr>
-        <w:t xml:space="preserve">La tabla muestra la correspondencia entre cada problema identificado en el sistema actual y la solución específica que aporta SARQUE para resolverlo.</w:t>
+        <w:t xml:space="preserve">La tabla muestra la correspondencia entre cada problema identificado y la solución específica que aporta SARQUE.</w:t>
       </w:r>
     </w:p>
     <w:p>
@@ -17252,6 +15469,7 @@
     </w:tbl>
     <w:p>
       <w:pPr>
+        <w:pStyle w:val="Normal"/>
         <w:jc w:val="center"/>
         <w:spacing w:before="120" w:after="120"/>
       </w:pPr>
@@ -17298,7 +15516,8 @@
     </w:p>
     <w:p>
       <w:pPr>
-        <w:jc w:val="justify"/>
+        <w:pStyle w:val="Normal"/>
+        <w:jc w:val="both"/>
         <w:spacing w:before="120" w:after="120"/>
       </w:pPr>
       <w:r>
@@ -17306,7 +15525,7 @@
           <w:rFonts w:ascii="Times New Roman" w:hAnsi="Times New Roman"/>
           <w:sz w:val="22"/>
         </w:rPr>
-        <w:t xml:space="preserve">Los nueve requerimientos funcionales del sistema SARQUE se presentan agrupados por módulo, indicando qué debe hacer el sistema desde la perspectiva del usuario.</w:t>
+        <w:t xml:space="preserve">Los nueve requerimientos funcionales del sistema SARQUE, agrupados por módulo.</w:t>
       </w:r>
     </w:p>
     <w:p>
@@ -17990,6 +16209,7 @@
     </w:tbl>
     <w:p>
       <w:pPr>
+        <w:pStyle w:val="Normal"/>
         <w:jc w:val="center"/>
         <w:spacing w:before="120" w:after="120"/>
       </w:pPr>
@@ -18004,7 +16224,8 @@
     </w:p>
     <w:p>
       <w:pPr>
-        <w:jc w:val="justify"/>
+        <w:pStyle w:val="Normal"/>
+        <w:jc w:val="both"/>
         <w:spacing w:before="120" w:after="120"/>
       </w:pPr>
       <w:r>
@@ -18012,7 +16233,7 @@
           <w:rFonts w:ascii="Times New Roman" w:hAnsi="Times New Roman"/>
           <w:sz w:val="22"/>
         </w:rPr>
-        <w:t xml:space="preserve">Los seis requerimientos no funcionales describen las cualidades técnicas que el sistema debe cumplir en términos de rendimiento, usabilidad, normativa y robustez.</w:t>
+        <w:t xml:space="preserve">Los seis requerimientos no funcionales que el sistema debe cumplir.</w:t>
       </w:r>
     </w:p>
     <w:p>
@@ -18504,6 +16725,7 @@
     </w:tbl>
     <w:p>
       <w:pPr>
+        <w:pStyle w:val="Normal"/>
         <w:jc w:val="center"/>
         <w:spacing w:before="120" w:after="120"/>
       </w:pPr>
@@ -18608,7 +16830,8 @@
     </w:p>
     <w:p>
       <w:pPr>
-        <w:jc w:val="justify"/>
+        <w:pStyle w:val="Normal"/>
+        <w:jc w:val="both"/>
         <w:spacing w:before="120" w:after="120"/>
       </w:pPr>
       <w:r>
@@ -18616,7 +16839,7 @@
           <w:rFonts w:ascii="Times New Roman" w:hAnsi="Times New Roman"/>
           <w:sz w:val="22"/>
         </w:rPr>
-        <w:t xml:space="preserve">La siguiente tabla describe los cuatro actores que interactúan con el sistema SARQUE, su rol específico y las funciones que cada uno realiza.</w:t>
+        <w:t xml:space="preserve">La siguiente tabla describe los cuatro actores que interactúan con el sistema SARQUE.</w:t>
       </w:r>
     </w:p>
     <w:p>
@@ -18981,6 +17204,7 @@
     </w:tbl>
     <w:p>
       <w:pPr>
+        <w:pStyle w:val="Normal"/>
         <w:jc w:val="center"/>
         <w:spacing w:before="120" w:after="120"/>
       </w:pPr>
@@ -19114,7 +17338,8 @@
     </w:p>
     <w:p>
       <w:pPr>
-        <w:jc w:val="justify"/>
+        <w:pStyle w:val="Normal"/>
+        <w:jc w:val="both"/>
         <w:spacing w:before="120" w:after="120"/>
       </w:pPr>
       <w:r>
@@ -19122,7 +17347,7 @@
           <w:rFonts w:ascii="Times New Roman" w:hAnsi="Times New Roman"/>
           <w:sz w:val="22"/>
         </w:rPr>
-        <w:t xml:space="preserve">Se presentan los casos de uso principales del sistema SARQUE, indicando el actor responsable y una descripción breve de cada uno.</w:t>
+        <w:t xml:space="preserve">Se presentan los casos de uso principales del sistema SARQUE.</w:t>
       </w:r>
     </w:p>
     <w:p>
@@ -19824,6 +18049,7 @@
     </w:tbl>
     <w:p>
       <w:pPr>
+        <w:pStyle w:val="Normal"/>
         <w:jc w:val="center"/>
         <w:spacing w:before="120" w:after="120"/>
       </w:pPr>
@@ -19957,7 +18183,8 @@
     </w:p>
     <w:p>
       <w:pPr>
-        <w:jc w:val="justify"/>
+        <w:pStyle w:val="Normal"/>
+        <w:jc w:val="both"/>
         <w:spacing w:before="120" w:after="120"/>
       </w:pPr>
       <w:r>
@@ -19965,7 +18192,7 @@
           <w:rFonts w:ascii="Times New Roman" w:hAnsi="Times New Roman"/>
           <w:sz w:val="22"/>
         </w:rPr>
-        <w:t xml:space="preserve">La tabla detalla los componentes del sistema, la tecnología utilizada para implementarlos y la función específica que cumplen.</w:t>
+        <w:t xml:space="preserve">La tabla detalla los componentes del sistema, la tecnología utilizada y la función específica.</w:t>
       </w:r>
     </w:p>
     <w:p>
@@ -20458,6 +18685,7 @@
     </w:tbl>
     <w:p>
       <w:pPr>
+        <w:pStyle w:val="Normal"/>
         <w:jc w:val="center"/>
         <w:spacing w:before="120" w:after="120"/>
       </w:pPr>
@@ -20690,7 +18918,8 @@
     </w:p>
     <w:p>
       <w:pPr>
-        <w:jc w:val="justify"/>
+        <w:pStyle w:val="Normal"/>
+        <w:jc w:val="both"/>
         <w:spacing w:before="120" w:after="120"/>
       </w:pPr>
       <w:r>
@@ -20698,7 +18927,7 @@
           <w:rFonts w:ascii="Times New Roman" w:hAnsi="Times New Roman"/>
           <w:sz w:val="22"/>
         </w:rPr>
-        <w:t xml:space="preserve">Especificación de los campos de la entidad sectores, que almacena el catálogo de zonas de riego del parque.</w:t>
+        <w:t xml:space="preserve">Especificación de los campos de la entidad sectores.</w:t>
       </w:r>
     </w:p>
     <w:p>
@@ -21263,6 +19492,7 @@
     </w:tbl>
     <w:p>
       <w:pPr>
+        <w:pStyle w:val="Normal"/>
         <w:jc w:val="center"/>
         <w:spacing w:before="120" w:after="120"/>
       </w:pPr>
@@ -21288,7 +19518,8 @@
     </w:p>
     <w:p>
       <w:pPr>
-        <w:jc w:val="justify"/>
+        <w:pStyle w:val="Normal"/>
+        <w:jc w:val="both"/>
         <w:spacing w:before="120" w:after="120"/>
       </w:pPr>
       <w:r>
@@ -21296,7 +19527,7 @@
           <w:rFonts w:ascii="Times New Roman" w:hAnsi="Times New Roman"/>
           <w:sz w:val="22"/>
         </w:rPr>
-        <w:t xml:space="preserve">Especificación de los campos de la entidad controladores, que registra los 6 dispositivos K-Rain BL-KR del sistema.</w:t>
+        <w:t xml:space="preserve">Especificación de los campos de la entidad controladores.</w:t>
       </w:r>
     </w:p>
     <w:p>
@@ -21733,6 +19964,7 @@
     </w:tbl>
     <w:p>
       <w:pPr>
+        <w:pStyle w:val="Normal"/>
         <w:jc w:val="center"/>
         <w:spacing w:before="120" w:after="120"/>
       </w:pPr>
@@ -21758,7 +19990,8 @@
     </w:p>
     <w:p>
       <w:pPr>
-        <w:jc w:val="justify"/>
+        <w:pStyle w:val="Normal"/>
+        <w:jc w:val="both"/>
         <w:spacing w:before="120" w:after="120"/>
       </w:pPr>
       <w:r>
@@ -21766,7 +19999,7 @@
           <w:rFonts w:ascii="Times New Roman" w:hAnsi="Times New Roman"/>
           <w:sz w:val="22"/>
         </w:rPr>
-        <w:t xml:space="preserve">Especificación de los campos de la entidad horarios_riego, que define el cronograma semanal de riego por sector.</w:t>
+        <w:t xml:space="preserve">Especificación de los campos de la entidad horarios_riego.</w:t>
       </w:r>
     </w:p>
     <w:p>
@@ -22459,6 +20692,7 @@
     </w:tbl>
     <w:p>
       <w:pPr>
+        <w:pStyle w:val="Normal"/>
         <w:jc w:val="center"/>
         <w:spacing w:before="120" w:after="120"/>
       </w:pPr>
@@ -22484,7 +20718,8 @@
     </w:p>
     <w:p>
       <w:pPr>
-        <w:jc w:val="justify"/>
+        <w:pStyle w:val="Normal"/>
+        <w:jc w:val="both"/>
         <w:spacing w:before="120" w:after="120"/>
       </w:pPr>
       <w:r>
@@ -22492,7 +20727,7 @@
           <w:rFonts w:ascii="Times New Roman" w:hAnsi="Times New Roman"/>
           <w:sz w:val="22"/>
         </w:rPr>
-        <w:t xml:space="preserve">Estructura de la entidad profiles que almacena los datos básicos de los usuarios del sistema.</w:t>
+        <w:t xml:space="preserve">Estructura de la entidad profiles.</w:t>
       </w:r>
     </w:p>
     <w:p>
@@ -22816,6 +21051,7 @@
     </w:tbl>
     <w:p>
       <w:pPr>
+        <w:pStyle w:val="Normal"/>
         <w:jc w:val="center"/>
         <w:spacing w:before="120" w:after="120"/>
       </w:pPr>
@@ -22830,7 +21066,8 @@
     </w:p>
     <w:p>
       <w:pPr>
-        <w:jc w:val="justify"/>
+        <w:pStyle w:val="Normal"/>
+        <w:jc w:val="both"/>
         <w:spacing w:before="120" w:after="120"/>
       </w:pPr>
       <w:r>
@@ -22838,7 +21075,7 @@
           <w:rFonts w:ascii="Times New Roman" w:hAnsi="Times New Roman"/>
           <w:sz w:val="22"/>
         </w:rPr>
-        <w:t xml:space="preserve">Estructura de la entidad user_roles que define el rol (administrador u operador) de cada usuario del sistema.</w:t>
+        <w:t xml:space="preserve">Estructura de la entidad user_roles.</w:t>
       </w:r>
     </w:p>
     <w:p>
@@ -23148,6 +21385,7 @@
     </w:tbl>
     <w:p>
       <w:pPr>
+        <w:pStyle w:val="Normal"/>
         <w:jc w:val="center"/>
         <w:spacing w:before="120" w:after="120"/>
       </w:pPr>
@@ -23263,7 +21501,8 @@
     </w:p>
     <w:p>
       <w:pPr>
-        <w:jc w:val="justify"/>
+        <w:pStyle w:val="Normal"/>
+        <w:jc w:val="both"/>
         <w:spacing w:before="120" w:after="120"/>
       </w:pPr>
       <w:r>
@@ -23271,7 +21510,7 @@
           <w:rFonts w:ascii="Times New Roman" w:hAnsi="Times New Roman"/>
           <w:sz w:val="22"/>
         </w:rPr>
-        <w:t xml:space="preserve">Distribución por capas de la plataforma web SARQUE, mostrando las tecnologías utilizadas y la responsabilidad de cada capa.</w:t>
+        <w:t xml:space="preserve">Distribución por capas de la plataforma web SARQUE.</w:t>
       </w:r>
     </w:p>
     <w:p>
@@ -23637,6 +21876,7 @@
     </w:tbl>
     <w:p>
       <w:pPr>
+        <w:pStyle w:val="Normal"/>
         <w:jc w:val="center"/>
         <w:spacing w:before="120" w:after="120"/>
       </w:pPr>
@@ -23842,7 +22082,8 @@
     </w:p>
     <w:p>
       <w:pPr>
-        <w:jc w:val="justify"/>
+        <w:pStyle w:val="Normal"/>
+        <w:jc w:val="both"/>
         <w:spacing w:before="120" w:after="120"/>
       </w:pPr>
       <w:r>
@@ -23850,7 +22091,7 @@
           <w:rFonts w:ascii="Times New Roman" w:hAnsi="Times New Roman"/>
           <w:sz w:val="22"/>
         </w:rPr>
-        <w:t xml:space="preserve">Distribución detallada de los 6 controladores K-Rain BL-KR en las 6 zonas del parque, con la cantidad de estaciones que controla cada uno.</w:t>
+        <w:t xml:space="preserve">Distribución detallada de los 6 controladores K-Rain BL-KR.</w:t>
       </w:r>
     </w:p>
     <w:p>
@@ -24560,6 +22801,7 @@
     </w:tbl>
     <w:p>
       <w:pPr>
+        <w:pStyle w:val="Normal"/>
         <w:jc w:val="center"/>
         <w:spacing w:before="120" w:after="120"/>
       </w:pPr>
@@ -25689,6 +23931,794 @@
           <w:lang w:val="es-ES"/>
         </w:rPr>
         <w:t>Fuente: Elaboracion propia.</w:t>
+      </w:r>
+    </w:p>
+    <w:p>
+      <w:pPr>
+        <w:pStyle w:val="Heading3"/>
+        <w:jc w:val="left"/>
+        <w:spacing w:before="120" w:after="120"/>
+      </w:pPr>
+      <w:r>
+        <w:rPr>
+          <w:rFonts w:ascii="Times New Roman" w:hAnsi="Times New Roman"/>
+          <w:sz w:val="26"/>
+          <w:b/>
+        </w:rPr>
+        <w:t xml:space="preserve">3.3.7 Ubicación Geográfica de los Equipos Instalados</w:t>
+      </w:r>
+    </w:p>
+    <w:p>
+      <w:pPr>
+        <w:pStyle w:val="Normal"/>
+        <w:jc w:val="both"/>
+        <w:spacing w:before="120" w:after="120"/>
+      </w:pPr>
+      <w:r>
+        <w:rPr>
+          <w:rFonts w:ascii="Times New Roman" w:hAnsi="Times New Roman"/>
+          <w:sz w:val="24"/>
+        </w:rPr>
+        <w:t xml:space="preserve">El siguiente diagrama presenta la distribución geográfica de los 6 controladores BL-KR, la caseta de la bomba y los principales sectores del Parque Ecoturístico Quinta Estación, sobre una vista satelital aproximada del predio.</w:t>
+      </w:r>
+    </w:p>
+    <w:p>
+      <w:pPr>
+        <w:pStyle w:val="Normal"/>
+        <w:jc w:val="center"/>
+        <w:spacing w:before="120" w:after="120"/>
+      </w:pPr>
+      <w:r>
+        <w:rPr>
+          <w:rFonts w:ascii="Times New Roman" w:hAnsi="Times New Roman"/>
+          <w:sz w:val="22"/>
+          <w:b/>
+        </w:rPr>
+        <w:t xml:space="preserve">Figura. Ubicación de los equipos instalados en el predio del parque</w:t>
+      </w:r>
+    </w:p>
+    <w:p>
+      <w:pPr>
+        <w:pStyle w:val="Normal"/>
+        <w:jc w:val="center"/>
+        <w:spacing w:before="120" w:after="120"/>
+      </w:pPr>
+      <w:r>
+        <w:rPr>
+          <w:rFonts w:ascii="Times New Roman" w:hAnsi="Times New Roman"/>
+          <w:sz w:val="22"/>
+          <w:i/>
+        </w:rPr>
+        <w:t xml:space="preserve">[Insertar aquí la imagen: diagramas/Ubicacion_Equipos.png]</w:t>
+      </w:r>
+    </w:p>
+    <w:p>
+      <w:pPr>
+        <w:pStyle w:val="Normal"/>
+        <w:jc w:val="center"/>
+        <w:spacing w:before="120" w:after="120"/>
+      </w:pPr>
+      <w:r>
+        <w:rPr>
+          <w:rFonts w:ascii="Times New Roman" w:hAnsi="Times New Roman"/>
+          <w:sz w:val="20"/>
+          <w:i/>
+        </w:rPr>
+        <w:t xml:space="preserve">Fuente: Elaboración propia sobre vista satelital de Google Maps, 2026.</w:t>
+      </w:r>
+    </w:p>
+    <w:p>
+      <w:pPr>
+        <w:pStyle w:val="Normal"/>
+        <w:jc w:val="both"/>
+        <w:spacing w:before="120" w:after="120"/>
+      </w:pPr>
+      <w:r>
+        <w:rPr>
+          <w:rFonts w:ascii="Times New Roman" w:hAnsi="Times New Roman"/>
+          <w:sz w:val="24"/>
+        </w:rPr>
+        <w:t xml:space="preserve">Como se observa en la figura anterior, la caseta de la bomba sumergible Grundfos de 5 HP se ubica en el extremo suroeste del parque. Desde ese punto, la matriz principal de PVC de 2" distribuye el agua hacia los 6 controladores BL-KR ubicados estratégicamente en las distintas zonas del predio. Cada controlador se localizó de modo tal que la distancia máxima entre el dispositivo y su electroválvula más lejana no supere los 30 metros, garantizando una caída de tensión despreciable sobre el cable monofilar 20 AWG utilizado.</w:t>
+      </w:r>
+    </w:p>
+    <w:p>
+      <w:pPr>
+        <w:pStyle w:val="Heading2"/>
+        <w:jc w:val="left"/>
+        <w:spacing w:before="120" w:after="120"/>
+      </w:pPr>
+      <w:r>
+        <w:rPr>
+          <w:rFonts w:ascii="Times New Roman" w:hAnsi="Times New Roman"/>
+          <w:sz w:val="28"/>
+          <w:b/>
+        </w:rPr>
+        <w:t xml:space="preserve">3.4 Funcionamiento del Software</w:t>
+      </w:r>
+    </w:p>
+    <w:p>
+      <w:pPr>
+        <w:pStyle w:val="Normal"/>
+        <w:jc w:val="both"/>
+        <w:spacing w:before="120" w:after="120"/>
+      </w:pPr>
+      <w:r>
+        <w:rPr>
+          <w:rFonts w:ascii="Times New Roman" w:hAnsi="Times New Roman"/>
+          <w:sz w:val="24"/>
+        </w:rPr>
+        <w:t xml:space="preserve">La plataforma web SARQUE es una aplicación de página única (SPA, Single Page Application) construida sobre React + TypeScript que se ejecuta directamente en el navegador del usuario. A continuación se describe cómo opera internamente cada módulo del software y cómo se establece la comunicación entre el frontend y la base de datos en Supabase.</w:t>
+      </w:r>
+    </w:p>
+    <w:p>
+      <w:pPr>
+        <w:pStyle w:val="Heading3"/>
+        <w:jc w:val="left"/>
+        <w:spacing w:before="120" w:after="120"/>
+      </w:pPr>
+      <w:r>
+        <w:rPr>
+          <w:rFonts w:ascii="Times New Roman" w:hAnsi="Times New Roman"/>
+          <w:sz w:val="26"/>
+          <w:b/>
+        </w:rPr>
+        <w:t xml:space="preserve">3.4.1 Arquitectura general del software</w:t>
+      </w:r>
+    </w:p>
+    <w:p>
+      <w:pPr>
+        <w:pStyle w:val="Normal"/>
+        <w:jc w:val="both"/>
+        <w:spacing w:before="120" w:after="120"/>
+      </w:pPr>
+      <w:r>
+        <w:rPr>
+          <w:rFonts w:ascii="Times New Roman" w:hAnsi="Times New Roman"/>
+          <w:sz w:val="24"/>
+        </w:rPr>
+        <w:t xml:space="preserve">El software SARQUE se compone de tres capas independientes que se comunican entre sí mediante el protocolo HTTPS y la API REST autogenerada por Supabase. La capa de presentación, implementada con React 18 y TypeScript, se encarga de renderizar la interfaz, capturar las acciones del usuario y mostrar los datos. La capa de lógica de aplicación, basada en TanStack React Query y Zod, gestiona el estado, valida los formularios y orquesta las llamadas a la API. Finalmente, la capa de datos reside en la nube de Supabase y persiste la información en una base PostgreSQL con políticas de Row Level Security.</w:t>
+      </w:r>
+    </w:p>
+    <w:p>
+      <w:pPr>
+        <w:pStyle w:val="Normal"/>
+        <w:jc w:val="both"/>
+        <w:spacing w:before="120" w:after="120"/>
+      </w:pPr>
+      <w:r>
+        <w:rPr>
+          <w:rFonts w:ascii="Times New Roman" w:hAnsi="Times New Roman"/>
+          <w:sz w:val="24"/>
+        </w:rPr>
+        <w:t xml:space="preserve">Cuando el usuario abre la URL de SARQUE en su navegador, este descarga los archivos compilados de React (HTML, CSS y JavaScript) desde el hosting de Lovable. Una vez cargada la aplicación, todas las consultas posteriores (lectura de sectores, creación de horarios, etc.) se realizan mediante llamadas HTTPS a la API REST de Supabase, que genera automáticamente endpoints para cada tabla del esquema PostgreSQL gracias a PostgREST.</w:t>
+      </w:r>
+    </w:p>
+    <w:p>
+      <w:pPr>
+        <w:pStyle w:val="Heading3"/>
+        <w:jc w:val="left"/>
+        <w:spacing w:before="120" w:after="120"/>
+      </w:pPr>
+      <w:r>
+        <w:rPr>
+          <w:rFonts w:ascii="Times New Roman" w:hAnsi="Times New Roman"/>
+          <w:sz w:val="26"/>
+          <w:b/>
+        </w:rPr>
+        <w:t xml:space="preserve">3.4.2 Funcionamiento del módulo Dashboard</w:t>
+      </w:r>
+    </w:p>
+    <w:p>
+      <w:pPr>
+        <w:pStyle w:val="Normal"/>
+        <w:jc w:val="both"/>
+        <w:spacing w:before="120" w:after="120"/>
+      </w:pPr>
+      <w:r>
+        <w:rPr>
+          <w:rFonts w:ascii="Times New Roman" w:hAnsi="Times New Roman"/>
+          <w:sz w:val="24"/>
+        </w:rPr>
+        <w:t xml:space="preserve">El Dashboard es la página principal del sistema y muestra en tiempo real el sector que está siendo regado en el momento exacto. Su lógica de funcionamiento es la siguiente: al cargar el componente, se ejecuta una consulta SQL a la tabla horarios_riego filtrando solo los horarios activos. Cada segundo, un temporizador (setInterval) actualiza la hora actual del navegador y se compara contra todos los horarios para determinar cuál sector está activo en ese instante. Si hay un sector activo, se muestra una tarjeta con barra de progreso animada que indica el porcentaje de avance del riego.</w:t>
+      </w:r>
+    </w:p>
+    <w:p>
+      <w:pPr>
+        <w:pStyle w:val="Heading3"/>
+        <w:jc w:val="left"/>
+        <w:spacing w:before="120" w:after="120"/>
+      </w:pPr>
+      <w:r>
+        <w:rPr>
+          <w:rFonts w:ascii="Times New Roman" w:hAnsi="Times New Roman"/>
+          <w:sz w:val="26"/>
+          <w:b/>
+        </w:rPr>
+        <w:t xml:space="preserve">3.4.3 Funcionamiento del módulo Cronograma</w:t>
+      </w:r>
+    </w:p>
+    <w:p>
+      <w:pPr>
+        <w:pStyle w:val="Normal"/>
+        <w:jc w:val="both"/>
+        <w:spacing w:before="120" w:after="120"/>
+      </w:pPr>
+      <w:r>
+        <w:rPr>
+          <w:rFonts w:ascii="Times New Roman" w:hAnsi="Times New Roman"/>
+          <w:sz w:val="24"/>
+        </w:rPr>
+        <w:t xml:space="preserve">El Cronograma es una tabla visual de 7 columnas (días de la semana) por 6 filas (franjas horarias) que muestra los horarios de riego de cada sector con códigos de color según su duración. El color amarillo corresponde a riegos intensivos de 120 minutos, el verde a riegos estándar de 90 minutos y el azul a riegos cortos de 60 minutos. El administrador puede agregar un nuevo horario haciendo clic en el botón "Nuevo Horario", seleccionando el sector, el día y la hora de inicio. El sistema verifica con la biblioteca Zod que no haya conflictos de horario y guarda el nuevo registro en Supabase.</w:t>
+      </w:r>
+    </w:p>
+    <w:p>
+      <w:pPr>
+        <w:pStyle w:val="Heading3"/>
+        <w:jc w:val="left"/>
+        <w:spacing w:before="120" w:after="120"/>
+      </w:pPr>
+      <w:r>
+        <w:rPr>
+          <w:rFonts w:ascii="Times New Roman" w:hAnsi="Times New Roman"/>
+          <w:sz w:val="26"/>
+          <w:b/>
+        </w:rPr>
+        <w:t xml:space="preserve">3.4.4 Funcionamiento del módulo Reportes</w:t>
+      </w:r>
+    </w:p>
+    <w:p>
+      <w:pPr>
+        <w:pStyle w:val="Normal"/>
+        <w:jc w:val="both"/>
+        <w:spacing w:before="120" w:after="120"/>
+      </w:pPr>
+      <w:r>
+        <w:rPr>
+          <w:rFonts w:ascii="Times New Roman" w:hAnsi="Times New Roman"/>
+          <w:sz w:val="24"/>
+        </w:rPr>
+        <w:t xml:space="preserve">El módulo Reportes calcula sobre la marcha (sin almacenar en base de datos) las estadísticas de consumo hídrico a partir del cronograma vigente y del caudal de la bomba (4 L/s). Las estadísticas presentadas incluyen el resumen diario (litros totales estimados por día), el resumen semanal (suma de los volúmenes de todos los sectores), el resumen mensual (extrapolación semanal multiplicada por 4.3 semanas por mes), el ranking de sectores y la distribución por duración en formato de gráfico de pastel.</w:t>
+      </w:r>
+    </w:p>
+    <w:p>
+      <w:pPr>
+        <w:pStyle w:val="Heading2"/>
+        <w:jc w:val="left"/>
+        <w:spacing w:before="120" w:after="120"/>
+      </w:pPr>
+      <w:r>
+        <w:rPr>
+          <w:rFonts w:ascii="Times New Roman" w:hAnsi="Times New Roman"/>
+          <w:sz w:val="28"/>
+          <w:b/>
+        </w:rPr>
+        <w:t xml:space="preserve">3.5 Configuración de los Equipos</w:t>
+      </w:r>
+    </w:p>
+    <w:p>
+      <w:pPr>
+        <w:pStyle w:val="Heading3"/>
+        <w:jc w:val="left"/>
+        <w:spacing w:before="120" w:after="120"/>
+      </w:pPr>
+      <w:r>
+        <w:rPr>
+          <w:rFonts w:ascii="Times New Roman" w:hAnsi="Times New Roman"/>
+          <w:sz w:val="26"/>
+          <w:b/>
+        </w:rPr>
+        <w:t xml:space="preserve">3.5.1 Configuración inicial de los controladores BL-KR</w:t>
+      </w:r>
+    </w:p>
+    <w:p>
+      <w:pPr>
+        <w:pStyle w:val="Normal"/>
+        <w:jc w:val="both"/>
+        <w:spacing w:before="120" w:after="120"/>
+      </w:pPr>
+      <w:r>
+        <w:rPr>
+          <w:rFonts w:ascii="Times New Roman" w:hAnsi="Times New Roman"/>
+          <w:sz w:val="24"/>
+        </w:rPr>
+        <w:t xml:space="preserve">La puesta en marcha de cada uno de los 6 controladores K-Rain BL-KR sigue un procedimiento técnico específico que se ejecuta una sola vez al momento de la instalación. En primer lugar, se desenrosca la tapa del controlador, se retira el sello protector y se instala una batería 9V alcalina nueva respetando la polaridad de los terminales positivo y negativo. Posteriormente, se coloca nuevamente el sello protector y se aprieta la tapa a mano hasta asegurar el sellado contra humedad.</w:t>
+      </w:r>
+    </w:p>
+    <w:p>
+      <w:pPr>
+        <w:pStyle w:val="Normal"/>
+        <w:jc w:val="both"/>
+        <w:spacing w:before="120" w:after="120"/>
+      </w:pPr>
+      <w:r>
+        <w:rPr>
+          <w:rFonts w:ascii="Times New Roman" w:hAnsi="Times New Roman"/>
+          <w:sz w:val="24"/>
+        </w:rPr>
+        <w:t xml:space="preserve">A continuación, se activa el Bluetooth del smartphone del administrador y se abre la aplicación oficial K-RainBL. El controlador aparecerá automáticamente en la pantalla "Seleccionar módulo BL-KR" con su número de serie y la intensidad de señal BLE. Se selecciona el controlador de la lista; la app realizará el emparejamiento en menos de 5 segundos. En este momento, se debe asignar un nombre descriptivo al controlador y, opcionalmente, una clave de seguridad de 4 dígitos.</w:t>
+      </w:r>
+    </w:p>
+    <w:p>
+      <w:pPr>
+        <w:pStyle w:val="Normal"/>
+        <w:jc w:val="both"/>
+        <w:spacing w:before="120" w:after="120"/>
+      </w:pPr>
+      <w:r>
+        <w:rPr>
+          <w:rFonts w:ascii="Times New Roman" w:hAnsi="Times New Roman"/>
+          <w:sz w:val="24"/>
+        </w:rPr>
+        <w:t xml:space="preserve">Una vez emparejado el controlador, se accede al menú "Programming" dentro de la app y se selecciona el Programa A. Se definen los días de la semana en los que se ejecutará el riego, las horas de inicio del programa y los tiempos de riego de cada estación según el cronograma del parque. Finalmente, se pulsa el botón "Save" para guardar los cambios y luego "Transmit" para enviar la programación al controlador físico vía Bluetooth.</w:t>
+      </w:r>
+    </w:p>
+    <w:p>
+      <w:pPr>
+        <w:pStyle w:val="Heading3"/>
+        <w:jc w:val="left"/>
+        <w:spacing w:before="120" w:after="120"/>
+      </w:pPr>
+      <w:r>
+        <w:rPr>
+          <w:rFonts w:ascii="Times New Roman" w:hAnsi="Times New Roman"/>
+          <w:sz w:val="26"/>
+          <w:b/>
+        </w:rPr>
+        <w:t xml:space="preserve">3.5.2 Configuración de las electroválvulas</w:t>
+      </w:r>
+    </w:p>
+    <w:p>
+      <w:pPr>
+        <w:pStyle w:val="Normal"/>
+        <w:jc w:val="both"/>
+        <w:spacing w:before="120" w:after="120"/>
+      </w:pPr>
+      <w:r>
+        <w:rPr>
+          <w:rFonts w:ascii="Times New Roman" w:hAnsi="Times New Roman"/>
+          <w:sz w:val="24"/>
+        </w:rPr>
+        <w:t xml:space="preserve">Cada una de las 22 electroválvulas K-Rain BSPT de 9V DC tipo latching requiere el siguiente procedimiento de configuración inicial. La conexión hidráulica consiste en instalar la electroválvula en serie con una llave de paso manual de respaldo de 1 ½". La conexión eléctrica consiste en unir los dos cables del solenoide (rojo positivo y negro negativo) al cable monofilar 20 AWG que llega del controlador BL-KR.</w:t>
+      </w:r>
+    </w:p>
+    <w:p>
+      <w:pPr>
+        <w:pStyle w:val="Normal"/>
+        <w:jc w:val="both"/>
+        <w:spacing w:before="120" w:after="120"/>
+      </w:pPr>
+      <w:r>
+        <w:rPr>
+          <w:rFonts w:ascii="Times New Roman" w:hAnsi="Times New Roman"/>
+          <w:sz w:val="24"/>
+        </w:rPr>
+        <w:t xml:space="preserve">Para garantizar la protección contra humedad, todos los empalmes se impermeabilizan envolviéndolos con cinta autovulcanizante de grado IP67. Posteriormente, se ejecuta el procedimiento de desenganche inicial: dado que algunos solenoides vienen de fábrica con el émbolo magnéticamente enganchado, se debe ejecutar desde la app K-RainBL la función "Test all stations" durante 2 segundos por cada estación.</w:t>
+      </w:r>
+    </w:p>
+    <w:p>
+      <w:pPr>
+        <w:pStyle w:val="Heading2"/>
+        <w:jc w:val="left"/>
+        <w:spacing w:before="120" w:after="120"/>
+      </w:pPr>
+      <w:r>
+        <w:rPr>
+          <w:rFonts w:ascii="Times New Roman" w:hAnsi="Times New Roman"/>
+          <w:sz w:val="28"/>
+          <w:b/>
+        </w:rPr>
+        <w:t xml:space="preserve">3.6 Conexión entre el Usuario y los Equipos</w:t>
+      </w:r>
+    </w:p>
+    <w:p>
+      <w:pPr>
+        <w:pStyle w:val="Normal"/>
+        <w:jc w:val="both"/>
+        <w:spacing w:before="120" w:after="120"/>
+      </w:pPr>
+      <w:r>
+        <w:rPr>
+          <w:rFonts w:ascii="Times New Roman" w:hAnsi="Times New Roman"/>
+          <w:sz w:val="24"/>
+        </w:rPr>
+        <w:t xml:space="preserve">El sistema SARQUE utiliza dos canales de comunicación inalámbrica completamente independientes para conectar al usuario con los equipos del parque, cada uno con un propósito específico: el canal Bluetooth Low Energy (BLE) para la programación de los controladores y el canal Internet (HTTPS) para la plataforma web de visualización.</w:t>
+      </w:r>
+    </w:p>
+    <w:p>
+      <w:pPr>
+        <w:pStyle w:val="Heading3"/>
+        <w:jc w:val="left"/>
+        <w:spacing w:before="120" w:after="120"/>
+      </w:pPr>
+      <w:r>
+        <w:rPr>
+          <w:rFonts w:ascii="Times New Roman" w:hAnsi="Times New Roman"/>
+          <w:sz w:val="26"/>
+          <w:b/>
+        </w:rPr>
+        <w:t xml:space="preserve">3.6.1 Canal Bluetooth Low Energy (BLE) — Programación de los controladores</w:t>
+      </w:r>
+    </w:p>
+    <w:p>
+      <w:pPr>
+        <w:pStyle w:val="Normal"/>
+        <w:jc w:val="both"/>
+        <w:spacing w:before="120" w:after="120"/>
+      </w:pPr>
+      <w:r>
+        <w:rPr>
+          <w:rFonts w:ascii="Times New Roman" w:hAnsi="Times New Roman"/>
+          <w:sz w:val="24"/>
+        </w:rPr>
+        <w:t xml:space="preserve">La comunicación entre el smartphone del administrador y los 6 controladores K-Rain BL-KR se realiza exclusivamente mediante Bluetooth Smart 4.0 (Bluetooth Low Energy). Es importante destacar que NO se utiliza WiFi para esta comunicación. Esta decisión técnica se justifica por las siguientes razones: la señal WiFi del parque no cubre uniformemente las 5 hectáreas del predio; el BLE consume mucho menos energía que el WiFi, prolongando la duración de la batería 9V del controlador a un año de operación; el alcance típico del BLE de 10 a 30 metros es suficiente para que el administrador programe el controlador acercándose físicamente al equipo; y no se requiere infraestructura de red adicional en el parque.</w:t>
+      </w:r>
+    </w:p>
+    <w:p>
+      <w:pPr>
+        <w:pStyle w:val="Heading3"/>
+        <w:jc w:val="left"/>
+        <w:spacing w:before="120" w:after="120"/>
+      </w:pPr>
+      <w:r>
+        <w:rPr>
+          <w:rFonts w:ascii="Times New Roman" w:hAnsi="Times New Roman"/>
+          <w:sz w:val="26"/>
+          <w:b/>
+        </w:rPr>
+        <w:t xml:space="preserve">3.6.2 Canal Internet (HTTPS) — Plataforma web de gestión</w:t>
+      </w:r>
+    </w:p>
+    <w:p>
+      <w:pPr>
+        <w:pStyle w:val="Normal"/>
+        <w:jc w:val="both"/>
+        <w:spacing w:before="120" w:after="120"/>
+      </w:pPr>
+      <w:r>
+        <w:rPr>
+          <w:rFonts w:ascii="Times New Roman" w:hAnsi="Times New Roman"/>
+          <w:sz w:val="24"/>
+        </w:rPr>
+        <w:t xml:space="preserve">La plataforma web SARQUE, en cambio, sí requiere conexión a internet (sea mediante WiFi o mediante datos móviles del smartphone) porque su contenido se aloja en la nube de Supabase y se sirve a través de los servidores de Lovable. Cuando un usuario accede a la URL de SARQUE desde su navegador, se establece una sesión HTTPS encriptada con el backend, que permite consultar el cronograma desde cualquier ubicación, visualizar el sector activo en tiempo real, editar sectores y horarios, y generar reportes simulados.</w:t>
+      </w:r>
+    </w:p>
+    <w:p>
+      <w:pPr>
+        <w:pStyle w:val="Normal"/>
+        <w:jc w:val="both"/>
+        <w:spacing w:before="120" w:after="120"/>
+      </w:pPr>
+      <w:r>
+        <w:rPr>
+          <w:rFonts w:ascii="Times New Roman" w:hAnsi="Times New Roman"/>
+          <w:sz w:val="24"/>
+        </w:rPr>
+        <w:t xml:space="preserve">Es importante destacar que el canal BLE (programación) y el canal Internet (visualización) son completamente independientes: la plataforma web no controla directamente las electroválvulas. La programación efectiva del riego se realiza en cada controlador BL-KR mediante la app oficial K-RainBL, mientras que la plataforma web SARQUE actúa como un sistema de documentación digital y visualización del cronograma.</w:t>
+      </w:r>
+    </w:p>
+    <w:p>
+      <w:pPr>
+        <w:pStyle w:val="Heading2"/>
+        <w:jc w:val="left"/>
+        <w:spacing w:before="120" w:after="120"/>
+      </w:pPr>
+      <w:r>
+        <w:rPr>
+          <w:rFonts w:ascii="Times New Roman" w:hAnsi="Times New Roman"/>
+          <w:sz w:val="28"/>
+          <w:b/>
+        </w:rPr>
+        <w:t xml:space="preserve">3.7 Evidencia del Trabajo de Instalación en Campo</w:t>
+      </w:r>
+    </w:p>
+    <w:p>
+      <w:pPr>
+        <w:pStyle w:val="Normal"/>
+        <w:jc w:val="both"/>
+        <w:spacing w:before="120" w:after="120"/>
+      </w:pPr>
+      <w:r>
+        <w:rPr>
+          <w:rFonts w:ascii="Times New Roman" w:hAnsi="Times New Roman"/>
+          <w:sz w:val="24"/>
+        </w:rPr>
+        <w:t xml:space="preserve">A continuación se presentan las evidencias fotográficas del trabajo manual realizado para la instalación del sistema SARQUE en el predio del parque. Las fotografías más representativas se incluyen en esta sección; el catálogo completo de fotografías del proceso de instalación se encuentra en el Anexo B — Galería Fotográfica Complementaria.</w:t>
+      </w:r>
+    </w:p>
+    <w:p>
+      <w:pPr>
+        <w:pStyle w:val="Heading3"/>
+        <w:jc w:val="left"/>
+        <w:spacing w:before="120" w:after="120"/>
+      </w:pPr>
+      <w:r>
+        <w:rPr>
+          <w:rFonts w:ascii="Times New Roman" w:hAnsi="Times New Roman"/>
+          <w:sz w:val="26"/>
+          <w:b/>
+        </w:rPr>
+        <w:t xml:space="preserve">3.7.1 Excavación de zanjas para la red hidráulica y de control</w:t>
+      </w:r>
+    </w:p>
+    <w:p>
+      <w:pPr>
+        <w:pStyle w:val="Normal"/>
+        <w:jc w:val="both"/>
+        <w:spacing w:before="120" w:after="120"/>
+      </w:pPr>
+      <w:r>
+        <w:rPr>
+          <w:rFonts w:ascii="Times New Roman" w:hAnsi="Times New Roman"/>
+          <w:sz w:val="24"/>
+        </w:rPr>
+        <w:t xml:space="preserve">La instalación del sistema requirió la excavación manual de aproximadamente 570 metros lineales de zanjas. Las zanjas para la matriz principal de PVC 2" se excavaron a una profundidad de 30 centímetros, mientras que las zanjas para las cuelleras de PVC 1 ½" y el politubo de cable de 3/4" se excavaron a 20-25 centímetros de profundidad, ejecutándose paralelas a las zanjas hidráulicas.</w:t>
+      </w:r>
+    </w:p>
+    <w:p>
+      <w:pPr>
+        <w:pStyle w:val="Normal"/>
+        <w:jc w:val="center"/>
+        <w:spacing w:before="120" w:after="120"/>
+      </w:pPr>
+      <w:r>
+        <w:rPr>
+          <w:rFonts w:ascii="Times New Roman" w:hAnsi="Times New Roman"/>
+          <w:sz w:val="22"/>
+          <w:b/>
+        </w:rPr>
+        <w:t xml:space="preserve">Figura. Excavación manual de zanjas para el tendido del politubo</w:t>
+      </w:r>
+    </w:p>
+    <w:p>
+      <w:pPr>
+        <w:pStyle w:val="Normal"/>
+        <w:jc w:val="center"/>
+        <w:spacing w:before="120" w:after="120"/>
+      </w:pPr>
+      <w:r>
+        <w:rPr>
+          <w:rFonts w:ascii="Times New Roman" w:hAnsi="Times New Roman"/>
+          <w:sz w:val="22"/>
+          <w:i/>
+        </w:rPr>
+        <w:t xml:space="preserve">[Insertar aquí la fotografía de la excavación]</w:t>
+      </w:r>
+    </w:p>
+    <w:p>
+      <w:pPr>
+        <w:pStyle w:val="Normal"/>
+        <w:jc w:val="center"/>
+        <w:spacing w:before="120" w:after="120"/>
+      </w:pPr>
+      <w:r>
+        <w:rPr>
+          <w:rFonts w:ascii="Times New Roman" w:hAnsi="Times New Roman"/>
+          <w:sz w:val="20"/>
+          <w:i/>
+        </w:rPr>
+        <w:t xml:space="preserve">Fuente: Fotografía del trabajo en campo, 2026.</w:t>
+      </w:r>
+    </w:p>
+    <w:p>
+      <w:pPr>
+        <w:pStyle w:val="Heading3"/>
+        <w:jc w:val="left"/>
+        <w:spacing w:before="120" w:after="120"/>
+      </w:pPr>
+      <w:r>
+        <w:rPr>
+          <w:rFonts w:ascii="Times New Roman" w:hAnsi="Times New Roman"/>
+          <w:sz w:val="26"/>
+          <w:b/>
+        </w:rPr>
+        <w:t xml:space="preserve">3.7.2 Instalación de electroválvulas K-Rain BSPT en cajas de hormigón</w:t>
+      </w:r>
+    </w:p>
+    <w:p>
+      <w:pPr>
+        <w:pStyle w:val="Normal"/>
+        <w:jc w:val="both"/>
+        <w:spacing w:before="120" w:after="120"/>
+      </w:pPr>
+      <w:r>
+        <w:rPr>
+          <w:rFonts w:ascii="Times New Roman" w:hAnsi="Times New Roman"/>
+          <w:sz w:val="24"/>
+        </w:rPr>
+        <w:t xml:space="preserve">Cada una de las 22 electroválvulas se instaló dentro de una caja de hormigón armado de 40 × 40 × 30 centímetros fabricada en sitio. La electroválvula se conectó en serie con una llave de paso manual de respaldo de color rojo para permitir el corte manual del agua en caso de mantenimiento del sistema.</w:t>
+      </w:r>
+    </w:p>
+    <w:p>
+      <w:pPr>
+        <w:pStyle w:val="Normal"/>
+        <w:jc w:val="center"/>
+        <w:spacing w:before="120" w:after="120"/>
+      </w:pPr>
+      <w:r>
+        <w:rPr>
+          <w:rFonts w:ascii="Times New Roman" w:hAnsi="Times New Roman"/>
+          <w:sz w:val="22"/>
+          <w:b/>
+        </w:rPr>
+        <w:t xml:space="preserve">Figura. Electroválvula K-Rain BSPT 9V DC instalada en caja de hormigón</w:t>
+      </w:r>
+    </w:p>
+    <w:p>
+      <w:pPr>
+        <w:pStyle w:val="Normal"/>
+        <w:jc w:val="center"/>
+        <w:spacing w:before="120" w:after="120"/>
+      </w:pPr>
+      <w:r>
+        <w:rPr>
+          <w:rFonts w:ascii="Times New Roman" w:hAnsi="Times New Roman"/>
+          <w:sz w:val="22"/>
+          <w:i/>
+        </w:rPr>
+        <w:t xml:space="preserve">[Insertar aquí la fotografía de la electroválvula]</w:t>
+      </w:r>
+    </w:p>
+    <w:p>
+      <w:pPr>
+        <w:pStyle w:val="Normal"/>
+        <w:jc w:val="center"/>
+        <w:spacing w:before="120" w:after="120"/>
+      </w:pPr>
+      <w:r>
+        <w:rPr>
+          <w:rFonts w:ascii="Times New Roman" w:hAnsi="Times New Roman"/>
+          <w:sz w:val="20"/>
+          <w:i/>
+        </w:rPr>
+        <w:t xml:space="preserve">Fuente: Fotografía del trabajo en campo, 2026.</w:t>
+      </w:r>
+    </w:p>
+    <w:p>
+      <w:pPr>
+        <w:pStyle w:val="Heading3"/>
+        <w:jc w:val="left"/>
+        <w:spacing w:before="120" w:after="120"/>
+      </w:pPr>
+      <w:r>
+        <w:rPr>
+          <w:rFonts w:ascii="Times New Roman" w:hAnsi="Times New Roman"/>
+          <w:sz w:val="26"/>
+          <w:b/>
+        </w:rPr>
+        <w:t xml:space="preserve">3.7.3 Cableado y empalmes impermeabilizados</w:t>
+      </w:r>
+    </w:p>
+    <w:p>
+      <w:pPr>
+        <w:pStyle w:val="Normal"/>
+        <w:jc w:val="both"/>
+        <w:spacing w:before="120" w:after="120"/>
+      </w:pPr>
+      <w:r>
+        <w:rPr>
+          <w:rFonts w:ascii="Times New Roman" w:hAnsi="Times New Roman"/>
+          <w:sz w:val="24"/>
+        </w:rPr>
+        <w:t xml:space="preserve">El cable monofilar 20 AWG se tendió dentro de un politubo negro de polietileno de 3/4" de diámetro para protección mecánica. Los empalmes entre el cable que viene del controlador y los terminales del solenoide se realizaron con conectores impermeabilizados mediante cinta autovulcanizante, garantizando un aislamiento IP67 dentro de las cajas de hormigón armado.</w:t>
+      </w:r>
+    </w:p>
+    <w:p>
+      <w:pPr>
+        <w:pStyle w:val="Normal"/>
+        <w:jc w:val="center"/>
+        <w:spacing w:before="120" w:after="120"/>
+      </w:pPr>
+      <w:r>
+        <w:rPr>
+          <w:rFonts w:ascii="Times New Roman" w:hAnsi="Times New Roman"/>
+          <w:sz w:val="22"/>
+          <w:b/>
+        </w:rPr>
+        <w:t xml:space="preserve">Figura. Empalmes impermeabilizados del cableado de control</w:t>
+      </w:r>
+    </w:p>
+    <w:p>
+      <w:pPr>
+        <w:pStyle w:val="Normal"/>
+        <w:jc w:val="center"/>
+        <w:spacing w:before="120" w:after="120"/>
+      </w:pPr>
+      <w:r>
+        <w:rPr>
+          <w:rFonts w:ascii="Times New Roman" w:hAnsi="Times New Roman"/>
+          <w:sz w:val="22"/>
+          <w:i/>
+        </w:rPr>
+        <w:t xml:space="preserve">[Insertar aquí la fotografía de los empalmes]</w:t>
+      </w:r>
+    </w:p>
+    <w:p>
+      <w:pPr>
+        <w:pStyle w:val="Normal"/>
+        <w:jc w:val="center"/>
+        <w:spacing w:before="120" w:after="120"/>
+      </w:pPr>
+      <w:r>
+        <w:rPr>
+          <w:rFonts w:ascii="Times New Roman" w:hAnsi="Times New Roman"/>
+          <w:sz w:val="20"/>
+          <w:i/>
+        </w:rPr>
+        <w:t xml:space="preserve">Fuente: Fotografía del trabajo en campo, 2026.</w:t>
+      </w:r>
+    </w:p>
+    <w:p>
+      <w:pPr>
+        <w:pStyle w:val="Heading3"/>
+        <w:jc w:val="left"/>
+        <w:spacing w:before="120" w:after="120"/>
+      </w:pPr>
+      <w:r>
+        <w:rPr>
+          <w:rFonts w:ascii="Times New Roman" w:hAnsi="Times New Roman"/>
+          <w:sz w:val="26"/>
+          <w:b/>
+        </w:rPr>
+        <w:t xml:space="preserve">3.7.4 Caseta de bomba y conexión a la red hidráulica principal</w:t>
+      </w:r>
+    </w:p>
+    <w:p>
+      <w:pPr>
+        <w:pStyle w:val="Normal"/>
+        <w:jc w:val="both"/>
+        <w:spacing w:before="120" w:after="120"/>
+      </w:pPr>
+      <w:r>
+        <w:rPr>
+          <w:rFonts w:ascii="Times New Roman" w:hAnsi="Times New Roman"/>
+          <w:sz w:val="24"/>
+        </w:rPr>
+        <w:t xml:space="preserve">La salida de la bomba sumergible Grundfos de 5 HP se conectó a la matriz principal de PVC 2" mediante una válvula check, un manómetro de presión analógico y el tanque hidroneumático que estabiliza la presión entre 3.5 y 4.0 bar.</w:t>
+      </w:r>
+    </w:p>
+    <w:p>
+      <w:pPr>
+        <w:pStyle w:val="Normal"/>
+        <w:jc w:val="center"/>
+        <w:spacing w:before="120" w:after="120"/>
+      </w:pPr>
+      <w:r>
+        <w:rPr>
+          <w:rFonts w:ascii="Times New Roman" w:hAnsi="Times New Roman"/>
+          <w:sz w:val="22"/>
+          <w:b/>
+        </w:rPr>
+        <w:t xml:space="preserve">Figura. Caseta de bombeo con tanque hidroneumático y manómetro</w:t>
+      </w:r>
+    </w:p>
+    <w:p>
+      <w:pPr>
+        <w:pStyle w:val="Normal"/>
+        <w:jc w:val="center"/>
+        <w:spacing w:before="120" w:after="120"/>
+      </w:pPr>
+      <w:r>
+        <w:rPr>
+          <w:rFonts w:ascii="Times New Roman" w:hAnsi="Times New Roman"/>
+          <w:sz w:val="22"/>
+          <w:i/>
+        </w:rPr>
+        <w:t xml:space="preserve">[Insertar aquí la fotografía de la caseta]</w:t>
+      </w:r>
+    </w:p>
+    <w:p>
+      <w:pPr>
+        <w:pStyle w:val="Normal"/>
+        <w:jc w:val="center"/>
+        <w:spacing w:before="120" w:after="120"/>
+      </w:pPr>
+      <w:r>
+        <w:rPr>
+          <w:rFonts w:ascii="Times New Roman" w:hAnsi="Times New Roman"/>
+          <w:sz w:val="20"/>
+          <w:i/>
+        </w:rPr>
+        <w:t xml:space="preserve">Fuente: Fotografía del trabajo en campo, 2026.</w:t>
       </w:r>
     </w:p>
     <w:bookmarkEnd w:id="72"/>
@@ -25851,7 +24881,8 @@
     </w:p>
     <w:p>
       <w:pPr>
-        <w:jc w:val="justify"/>
+        <w:pStyle w:val="Normal"/>
+        <w:jc w:val="both"/>
         <w:spacing w:before="120" w:after="120"/>
       </w:pPr>
       <w:r>
@@ -25859,7 +24890,7 @@
           <w:rFonts w:ascii="Times New Roman" w:hAnsi="Times New Roman"/>
           <w:sz w:val="22"/>
         </w:rPr>
-        <w:t xml:space="preserve">Resultados de las pruebas funcionales realizadas sobre la plataforma web SARQUE, indicando el escenario validado y el resultado obtenido.</w:t>
+        <w:t xml:space="preserve">Resultados de las pruebas funcionales sobre la plataforma web SARQUE.</w:t>
       </w:r>
     </w:p>
     <w:p>
@@ -26495,6 +25526,7 @@
     </w:tbl>
     <w:p>
       <w:pPr>
+        <w:pStyle w:val="Normal"/>
         <w:jc w:val="center"/>
         <w:spacing w:before="120" w:after="120"/>
       </w:pPr>
@@ -26541,7 +25573,8 @@
     </w:p>
     <w:p>
       <w:pPr>
-        <w:jc w:val="justify"/>
+        <w:pStyle w:val="Normal"/>
+        <w:jc w:val="both"/>
         <w:spacing w:before="120" w:after="120"/>
       </w:pPr>
       <w:r>
@@ -26549,7 +25582,7 @@
           <w:rFonts w:ascii="Times New Roman" w:hAnsi="Times New Roman"/>
           <w:sz w:val="22"/>
         </w:rPr>
-        <w:t xml:space="preserve">Pruebas hidráulicas ejecutadas para validar el correcto funcionamiento del sistema de riego instalado en campo.</w:t>
+        <w:t xml:space="preserve">Pruebas hidráulicas ejecutadas para validar el funcionamiento del sistema.</w:t>
       </w:r>
     </w:p>
     <w:p>
@@ -27196,6 +26229,7 @@
     </w:tbl>
     <w:p>
       <w:pPr>
+        <w:pStyle w:val="Normal"/>
         <w:jc w:val="center"/>
         <w:spacing w:before="120" w:after="120"/>
       </w:pPr>
@@ -27242,7 +26276,8 @@
     </w:p>
     <w:p>
       <w:pPr>
-        <w:jc w:val="justify"/>
+        <w:pStyle w:val="Normal"/>
+        <w:jc w:val="both"/>
         <w:spacing w:before="120" w:after="120"/>
       </w:pPr>
       <w:r>
@@ -27250,7 +26285,7 @@
           <w:rFonts w:ascii="Times New Roman" w:hAnsi="Times New Roman"/>
           <w:sz w:val="22"/>
         </w:rPr>
-        <w:t xml:space="preserve">Pruebas eléctricas realizadas para verificar la continuidad del cableado, la activación de los solenoides y el aislamiento de los empalmes.</w:t>
+        <w:t xml:space="preserve">Pruebas eléctricas realizadas para verificar la continuidad del cableado.</w:t>
       </w:r>
     </w:p>
     <w:p>
@@ -27797,6 +26832,7 @@
     </w:tbl>
     <w:p>
       <w:pPr>
+        <w:pStyle w:val="Normal"/>
         <w:jc w:val="center"/>
         <w:spacing w:before="120" w:after="120"/>
       </w:pPr>
@@ -27843,7 +26879,8 @@
     </w:p>
     <w:p>
       <w:pPr>
-        <w:jc w:val="justify"/>
+        <w:pStyle w:val="Normal"/>
+        <w:jc w:val="both"/>
         <w:spacing w:before="120" w:after="120"/>
       </w:pPr>
       <w:r>
@@ -27851,7 +26888,7 @@
           <w:rFonts w:ascii="Times New Roman" w:hAnsi="Times New Roman"/>
           <w:sz w:val="22"/>
         </w:rPr>
-        <w:t xml:space="preserve">Criterios de aceptación validados directamente con la administración del Parque Quinta Estación, confirmando el cumplimiento de los objetivos del proyecto.</w:t>
+        <w:t xml:space="preserve">Criterios de aceptación validados con la administración del Parque Quinta Estación.</w:t>
       </w:r>
     </w:p>
     <w:p>
@@ -28306,6 +27343,7 @@
     </w:tbl>
     <w:p>
       <w:pPr>
+        <w:pStyle w:val="Normal"/>
         <w:jc w:val="center"/>
         <w:spacing w:before="120" w:after="120"/>
       </w:pPr>
@@ -28410,7 +27448,8 @@
     </w:p>
     <w:p>
       <w:pPr>
-        <w:jc w:val="justify"/>
+        <w:pStyle w:val="Normal"/>
+        <w:jc w:val="both"/>
         <w:spacing w:before="120" w:after="120"/>
       </w:pPr>
       <w:r>
@@ -28418,7 +27457,7 @@
           <w:rFonts w:ascii="Times New Roman" w:hAnsi="Times New Roman"/>
           <w:sz w:val="22"/>
         </w:rPr>
-        <w:t xml:space="preserve">Comparativa de los tiempos invertidos por el personal en las actividades de riego antes y después de la implementación de SARQUE.</w:t>
+        <w:t xml:space="preserve">Comparativa de tiempos invertidos por el personal antes y después de la implementación.</w:t>
       </w:r>
     </w:p>
     <w:p>
@@ -28792,6 +27831,7 @@
     </w:tbl>
     <w:p>
       <w:pPr>
+        <w:pStyle w:val="Normal"/>
         <w:jc w:val="center"/>
         <w:spacing w:before="120" w:after="120"/>
       </w:pPr>
@@ -28838,7 +27878,8 @@
     </w:p>
     <w:p>
       <w:pPr>
-        <w:jc w:val="justify"/>
+        <w:pStyle w:val="Normal"/>
+        <w:jc w:val="both"/>
         <w:spacing w:before="120" w:after="120"/>
       </w:pPr>
       <w:r>
@@ -28846,7 +27887,7 @@
           <w:rFonts w:ascii="Times New Roman" w:hAnsi="Times New Roman"/>
           <w:sz w:val="22"/>
         </w:rPr>
-        <w:t xml:space="preserve">Trazabilidad del cumplimiento de los nueve requerimientos funcionales definidos al inicio del proyecto, con la evidencia de cada uno.</w:t>
+        <w:t xml:space="preserve">Trazabilidad del cumplimiento de los requerimientos funcionales.</w:t>
       </w:r>
     </w:p>
     <w:p>
@@ -29530,6 +28571,7 @@
     </w:tbl>
     <w:p>
       <w:pPr>
+        <w:pStyle w:val="Normal"/>
         <w:jc w:val="center"/>
         <w:spacing w:before="120" w:after="120"/>
       </w:pPr>
@@ -30884,7 +29926,8 @@
     </w:p>
     <w:p>
       <w:pPr>
-        <w:jc w:val="justify"/>
+        <w:pStyle w:val="Normal"/>
+        <w:jc w:val="both"/>
         <w:spacing w:before="120" w:after="120"/>
       </w:pPr>
       <w:r>
@@ -30892,7 +29935,7 @@
           <w:rFonts w:ascii="Times New Roman" w:hAnsi="Times New Roman"/>
           <w:sz w:val="22"/>
         </w:rPr>
-        <w:t xml:space="preserve">Especificaciones técnicas completas de la bomba sumergible Grundfos de 5 HP instalada en el pozo del parque.</w:t>
+        <w:t xml:space="preserve">Especificaciones técnicas de la bomba sumergible Grundfos de 5 HP.</w:t>
       </w:r>
     </w:p>
     <w:p>
@@ -31488,6 +30531,7 @@
     </w:tbl>
     <w:p>
       <w:pPr>
+        <w:pStyle w:val="Normal"/>
         <w:jc w:val="center"/>
         <w:spacing w:before="120" w:after="120"/>
       </w:pPr>
@@ -31531,7 +30575,8 @@
     </w:p>
     <w:p>
       <w:pPr>
-        <w:jc w:val="justify"/>
+        <w:pStyle w:val="Normal"/>
+        <w:jc w:val="both"/>
         <w:spacing w:before="120" w:after="120"/>
       </w:pPr>
       <w:r>
@@ -31539,7 +30584,7 @@
           <w:rFonts w:ascii="Times New Roman" w:hAnsi="Times New Roman"/>
           <w:sz w:val="22"/>
         </w:rPr>
-        <w:t xml:space="preserve">Especificaciones técnicas de las tuberías de PVC, cuelleras, llaves de paso y demás accesorios hidráulicos utilizados en la instalación.</w:t>
+        <w:t xml:space="preserve">Especificaciones técnicas de las tuberías y accesorios hidráulicos.</w:t>
       </w:r>
     </w:p>
     <w:p>
@@ -31997,6 +31042,7 @@
     </w:tbl>
     <w:p>
       <w:pPr>
+        <w:pStyle w:val="Normal"/>
         <w:jc w:val="center"/>
         <w:spacing w:before="120" w:after="120"/>
       </w:pPr>
@@ -32040,7 +31086,8 @@
     </w:p>
     <w:p>
       <w:pPr>
-        <w:jc w:val="justify"/>
+        <w:pStyle w:val="Normal"/>
+        <w:jc w:val="both"/>
         <w:spacing w:before="120" w:after="120"/>
       </w:pPr>
       <w:r>
@@ -32048,7 +31095,7 @@
           <w:rFonts w:ascii="Times New Roman" w:hAnsi="Times New Roman"/>
           <w:sz w:val="22"/>
         </w:rPr>
-        <w:t xml:space="preserve">Detalle técnico del cable monofilar 20 AWG, el politubo de protección, las baterías y los solenoides utilizados en el sistema eléctrico de control.</w:t>
+        <w:t xml:space="preserve">Detalle técnico del cable y demás componentes eléctricos.</w:t>
       </w:r>
     </w:p>
     <w:p>
@@ -32552,6 +31599,7 @@
     </w:tbl>
     <w:p>
       <w:pPr>
+        <w:pStyle w:val="Normal"/>
         <w:jc w:val="center"/>
         <w:spacing w:before="120" w:after="120"/>
       </w:pPr>
@@ -32595,7 +31643,8 @@
     </w:p>
     <w:p>
       <w:pPr>
-        <w:jc w:val="justify"/>
+        <w:pStyle w:val="Normal"/>
+        <w:jc w:val="both"/>
         <w:spacing w:before="120" w:after="120"/>
       </w:pPr>
       <w:r>
@@ -32603,7 +31652,7 @@
           <w:rFonts w:ascii="Times New Roman" w:hAnsi="Times New Roman"/>
           <w:sz w:val="22"/>
         </w:rPr>
-        <w:t xml:space="preserve">Distribución detallada de los 6 controladores K-Rain BL-KR con su modelo, número de estaciones y zona del parque que controla cada uno.</w:t>
+        <w:t xml:space="preserve">Distribución detallada de los 6 controladores K-Rain BL-KR.</w:t>
       </w:r>
     </w:p>
     <w:p>
@@ -33313,6 +32362,7 @@
     </w:tbl>
     <w:p>
       <w:pPr>
+        <w:pStyle w:val="Normal"/>
         <w:jc w:val="center"/>
         <w:spacing w:before="120" w:after="120"/>
       </w:pPr>
@@ -33356,7 +32406,8 @@
     </w:p>
     <w:p>
       <w:pPr>
-        <w:jc w:val="justify"/>
+        <w:pStyle w:val="Normal"/>
+        <w:jc w:val="both"/>
         <w:spacing w:before="120" w:after="120"/>
       </w:pPr>
       <w:r>
@@ -33364,7 +32415,7 @@
           <w:rFonts w:ascii="Times New Roman" w:hAnsi="Times New Roman"/>
           <w:sz w:val="22"/>
         </w:rPr>
-        <w:t xml:space="preserve">Detalle del stack tecnológico utilizado en la plataforma web SARQUE, con las versiones específicas de cada librería y framework.</w:t>
+        <w:t xml:space="preserve">Detalle del stack tecnológico utilizado en la plataforma web SARQUE.</w:t>
       </w:r>
     </w:p>
     <w:p>
@@ -33857,6 +32908,7 @@
     </w:tbl>
     <w:p>
       <w:pPr>
+        <w:pStyle w:val="Normal"/>
         <w:jc w:val="center"/>
         <w:spacing w:before="120" w:after="120"/>
       </w:pPr>
@@ -33900,7 +32952,8 @@
     </w:p>
     <w:p>
       <w:pPr>
-        <w:jc w:val="justify"/>
+        <w:pStyle w:val="Normal"/>
+        <w:jc w:val="both"/>
         <w:spacing w:before="120" w:after="120"/>
       </w:pPr>
       <w:r>
@@ -33908,7 +32961,7 @@
           <w:rFonts w:ascii="Times New Roman" w:hAnsi="Times New Roman"/>
           <w:sz w:val="22"/>
         </w:rPr>
-        <w:t xml:space="preserve">Personal involucrado en la operación del sistema SARQUE en el Parque Quinta Estación, con sus roles y funciones específicas.</w:t>
+        <w:t xml:space="preserve">Personal involucrado en la operación del sistema SARQUE.</w:t>
       </w:r>
     </w:p>
     <w:p>
@@ -34208,6 +33261,7 @@
     </w:tbl>
     <w:p>
       <w:pPr>
+        <w:pStyle w:val="Normal"/>
         <w:jc w:val="center"/>
         <w:spacing w:before="120" w:after="120"/>
       </w:pPr>

</xml_diff>